<commit_message>
Rapport partie 3 victor moitié
</commit_message>
<xml_diff>
--- a/Rapport_LEFEVRE_LARZUL.docx
+++ b/Rapport_LEFEVRE_LARZUL.docx
@@ -31,7 +31,7 @@
                     <pic:cNvPicPr/>
                   </pic:nvPicPr>
                   <pic:blipFill>
-                    <a:blip r:embed="rId5" cstate="print">
+                    <a:blip r:embed="rId6" cstate="print">
                       <a:extLst>
                         <a:ext uri="{28A0092B-C50C-407E-A947-70E740481C1C}">
                           <a14:useLocalDpi xmlns:a14="http://schemas.microsoft.com/office/drawing/2010/main" val="0"/>
@@ -422,7 +422,7 @@
           <w:szCs w:val="28"/>
         </w:rPr>
       </w:pPr>
-      <w:hyperlink r:id="rId6" w:history="1">
+      <w:hyperlink r:id="rId7" w:history="1">
         <w:r>
           <w:rPr>
             <w:sz w:val="28"/>
@@ -522,6 +522,377 @@
     </w:p>
     <w:p/>
     <w:p/>
+    <w:sdt>
+      <w:sdtPr>
+        <w:id w:val="1412590034"/>
+        <w:docPartObj>
+          <w:docPartGallery w:val="Table of Contents"/>
+          <w:docPartUnique/>
+        </w:docPartObj>
+      </w:sdtPr>
+      <w:sdtEndPr>
+        <w:rPr>
+          <w:rFonts w:ascii="Times New Roman" w:eastAsia="Times New Roman" w:hAnsi="Times New Roman" w:cs="Times New Roman"/>
+          <w:noProof/>
+          <w:color w:val="auto"/>
+          <w:sz w:val="24"/>
+          <w:szCs w:val="24"/>
+        </w:rPr>
+      </w:sdtEndPr>
+      <w:sdtContent>
+        <w:p>
+          <w:pPr>
+            <w:pStyle w:val="En-ttedetabledesmatires"/>
+            <w:jc w:val="center"/>
+            <w:rPr>
+              <w:rFonts w:ascii="Times New Roman" w:hAnsi="Times New Roman" w:cs="Times New Roman"/>
+              <w:color w:val="000000" w:themeColor="text1"/>
+              <w:sz w:val="44"/>
+              <w:szCs w:val="44"/>
+            </w:rPr>
+          </w:pPr>
+          <w:r>
+            <w:rPr>
+              <w:rFonts w:ascii="Times New Roman" w:hAnsi="Times New Roman" w:cs="Times New Roman"/>
+              <w:color w:val="000000" w:themeColor="text1"/>
+              <w:sz w:val="44"/>
+              <w:szCs w:val="44"/>
+            </w:rPr>
+            <w:t>Table des matières</w:t>
+          </w:r>
+        </w:p>
+        <w:p/>
+        <w:p/>
+        <w:p>
+          <w:pPr>
+            <w:pStyle w:val="TM1"/>
+            <w:tabs>
+              <w:tab w:val="right" w:leader="dot" w:pos="9062"/>
+            </w:tabs>
+            <w:rPr>
+              <w:rFonts w:eastAsiaTheme="minorEastAsia" w:cstheme="minorBidi"/>
+              <w:b w:val="0"/>
+              <w:bCs w:val="0"/>
+              <w:caps w:val="0"/>
+              <w:noProof/>
+              <w:sz w:val="24"/>
+              <w:szCs w:val="24"/>
+            </w:rPr>
+          </w:pPr>
+          <w:r>
+            <w:rPr>
+              <w:b w:val="0"/>
+              <w:bCs w:val="0"/>
+            </w:rPr>
+            <w:fldChar w:fldCharType="begin"/>
+          </w:r>
+          <w:r>
+            <w:instrText>TOC \o "1-3" \h \z \u</w:instrText>
+          </w:r>
+          <w:r>
+            <w:rPr>
+              <w:b w:val="0"/>
+              <w:bCs w:val="0"/>
+            </w:rPr>
+            <w:fldChar w:fldCharType="separate"/>
+          </w:r>
+          <w:hyperlink w:anchor="_Toc196318704" w:history="1">
+            <w:r>
+              <w:rPr>
+                <w:rStyle w:val="Lienhypertexte"/>
+                <w:rFonts w:ascii="Times New Roman" w:hAnsi="Times New Roman" w:cs="Times New Roman"/>
+                <w:noProof/>
+                <w:lang w:eastAsia="en-US"/>
+              </w:rPr>
+              <w:t>Étude théorique de cas simples</w:t>
+            </w:r>
+            <w:r>
+              <w:rPr>
+                <w:noProof/>
+                <w:webHidden/>
+              </w:rPr>
+              <w:tab/>
+            </w:r>
+            <w:r>
+              <w:rPr>
+                <w:noProof/>
+                <w:webHidden/>
+              </w:rPr>
+              <w:fldChar w:fldCharType="begin"/>
+            </w:r>
+            <w:r>
+              <w:rPr>
+                <w:noProof/>
+                <w:webHidden/>
+              </w:rPr>
+              <w:instrText xml:space="preserve"> PAGEREF _Toc196318704 \h </w:instrText>
+            </w:r>
+            <w:r>
+              <w:rPr>
+                <w:noProof/>
+                <w:webHidden/>
+              </w:rPr>
+            </w:r>
+            <w:r>
+              <w:rPr>
+                <w:noProof/>
+                <w:webHidden/>
+              </w:rPr>
+              <w:fldChar w:fldCharType="separate"/>
+            </w:r>
+            <w:r>
+              <w:rPr>
+                <w:noProof/>
+                <w:webHidden/>
+              </w:rPr>
+              <w:t>3</w:t>
+            </w:r>
+            <w:r>
+              <w:rPr>
+                <w:noProof/>
+                <w:webHidden/>
+              </w:rPr>
+              <w:fldChar w:fldCharType="end"/>
+            </w:r>
+          </w:hyperlink>
+        </w:p>
+        <w:p>
+          <w:pPr>
+            <w:pStyle w:val="TM2"/>
+            <w:tabs>
+              <w:tab w:val="right" w:leader="dot" w:pos="9062"/>
+            </w:tabs>
+            <w:rPr>
+              <w:rFonts w:eastAsiaTheme="minorEastAsia" w:cstheme="minorBidi"/>
+              <w:smallCaps w:val="0"/>
+              <w:noProof/>
+              <w:sz w:val="24"/>
+              <w:szCs w:val="24"/>
+            </w:rPr>
+          </w:pPr>
+          <w:hyperlink w:anchor="_Toc196318705" w:history="1">
+            <w:r>
+              <w:rPr>
+                <w:rStyle w:val="Lienhypertexte"/>
+                <w:rFonts w:ascii="Times New Roman" w:hAnsi="Times New Roman" w:cs="Times New Roman"/>
+                <w:b/>
+                <w:bCs/>
+                <w:noProof/>
+              </w:rPr>
+              <w:t>Influence de η (mu)</w:t>
+            </w:r>
+            <w:r>
+              <w:rPr>
+                <w:noProof/>
+                <w:webHidden/>
+              </w:rPr>
+              <w:tab/>
+            </w:r>
+            <w:r>
+              <w:rPr>
+                <w:noProof/>
+                <w:webHidden/>
+              </w:rPr>
+              <w:fldChar w:fldCharType="begin"/>
+            </w:r>
+            <w:r>
+              <w:rPr>
+                <w:noProof/>
+                <w:webHidden/>
+              </w:rPr>
+              <w:instrText xml:space="preserve"> PAGEREF _Toc196318705 \h </w:instrText>
+            </w:r>
+            <w:r>
+              <w:rPr>
+                <w:noProof/>
+                <w:webHidden/>
+              </w:rPr>
+            </w:r>
+            <w:r>
+              <w:rPr>
+                <w:noProof/>
+                <w:webHidden/>
+              </w:rPr>
+              <w:fldChar w:fldCharType="separate"/>
+            </w:r>
+            <w:r>
+              <w:rPr>
+                <w:noProof/>
+                <w:webHidden/>
+              </w:rPr>
+              <w:t>3</w:t>
+            </w:r>
+            <w:r>
+              <w:rPr>
+                <w:noProof/>
+                <w:webHidden/>
+              </w:rPr>
+              <w:fldChar w:fldCharType="end"/>
+            </w:r>
+          </w:hyperlink>
+        </w:p>
+        <w:p>
+          <w:pPr>
+            <w:pStyle w:val="TM2"/>
+            <w:tabs>
+              <w:tab w:val="right" w:leader="dot" w:pos="9062"/>
+            </w:tabs>
+            <w:rPr>
+              <w:rFonts w:eastAsiaTheme="minorEastAsia" w:cstheme="minorBidi"/>
+              <w:smallCaps w:val="0"/>
+              <w:noProof/>
+              <w:sz w:val="24"/>
+              <w:szCs w:val="24"/>
+            </w:rPr>
+          </w:pPr>
+          <w:hyperlink w:anchor="_Toc196318706" w:history="1">
+            <w:r>
+              <w:rPr>
+                <w:rStyle w:val="Lienhypertexte"/>
+                <w:rFonts w:ascii="Times New Roman" w:hAnsi="Times New Roman" w:cs="Times New Roman"/>
+                <w:b/>
+                <w:bCs/>
+                <w:noProof/>
+              </w:rPr>
+              <w:t>Influence de σ (sigma)</w:t>
+            </w:r>
+            <w:r>
+              <w:rPr>
+                <w:noProof/>
+                <w:webHidden/>
+              </w:rPr>
+              <w:tab/>
+            </w:r>
+            <w:r>
+              <w:rPr>
+                <w:noProof/>
+                <w:webHidden/>
+              </w:rPr>
+              <w:fldChar w:fldCharType="begin"/>
+            </w:r>
+            <w:r>
+              <w:rPr>
+                <w:noProof/>
+                <w:webHidden/>
+              </w:rPr>
+              <w:instrText xml:space="preserve"> PAGEREF _Toc196318706 \h </w:instrText>
+            </w:r>
+            <w:r>
+              <w:rPr>
+                <w:noProof/>
+                <w:webHidden/>
+              </w:rPr>
+            </w:r>
+            <w:r>
+              <w:rPr>
+                <w:noProof/>
+                <w:webHidden/>
+              </w:rPr>
+              <w:fldChar w:fldCharType="separate"/>
+            </w:r>
+            <w:r>
+              <w:rPr>
+                <w:noProof/>
+                <w:webHidden/>
+              </w:rPr>
+              <w:t>5</w:t>
+            </w:r>
+            <w:r>
+              <w:rPr>
+                <w:noProof/>
+                <w:webHidden/>
+              </w:rPr>
+              <w:fldChar w:fldCharType="end"/>
+            </w:r>
+          </w:hyperlink>
+        </w:p>
+        <w:p>
+          <w:pPr>
+            <w:pStyle w:val="TM2"/>
+            <w:tabs>
+              <w:tab w:val="right" w:leader="dot" w:pos="9062"/>
+            </w:tabs>
+            <w:rPr>
+              <w:rFonts w:eastAsiaTheme="minorEastAsia" w:cstheme="minorBidi"/>
+              <w:smallCaps w:val="0"/>
+              <w:noProof/>
+              <w:sz w:val="24"/>
+              <w:szCs w:val="24"/>
+            </w:rPr>
+          </w:pPr>
+          <w:hyperlink w:anchor="_Toc196318707" w:history="1">
+            <w:r>
+              <w:rPr>
+                <w:rStyle w:val="Lienhypertexte"/>
+                <w:rFonts w:ascii="Times New Roman" w:hAnsi="Times New Roman" w:cs="Times New Roman"/>
+                <w:b/>
+                <w:bCs/>
+                <w:noProof/>
+              </w:rPr>
+              <w:t>Influence de la distribution d’entrée</w:t>
+            </w:r>
+            <w:r>
+              <w:rPr>
+                <w:noProof/>
+                <w:webHidden/>
+              </w:rPr>
+              <w:tab/>
+            </w:r>
+            <w:r>
+              <w:rPr>
+                <w:noProof/>
+                <w:webHidden/>
+              </w:rPr>
+              <w:fldChar w:fldCharType="begin"/>
+            </w:r>
+            <w:r>
+              <w:rPr>
+                <w:noProof/>
+                <w:webHidden/>
+              </w:rPr>
+              <w:instrText xml:space="preserve"> PAGEREF _Toc196318707 \h </w:instrText>
+            </w:r>
+            <w:r>
+              <w:rPr>
+                <w:noProof/>
+                <w:webHidden/>
+              </w:rPr>
+            </w:r>
+            <w:r>
+              <w:rPr>
+                <w:noProof/>
+                <w:webHidden/>
+              </w:rPr>
+              <w:fldChar w:fldCharType="separate"/>
+            </w:r>
+            <w:r>
+              <w:rPr>
+                <w:noProof/>
+                <w:webHidden/>
+              </w:rPr>
+              <w:t>7</w:t>
+            </w:r>
+            <w:r>
+              <w:rPr>
+                <w:noProof/>
+                <w:webHidden/>
+              </w:rPr>
+              <w:fldChar w:fldCharType="end"/>
+            </w:r>
+          </w:hyperlink>
+        </w:p>
+        <w:p>
+          <w:r>
+            <w:rPr>
+              <w:b/>
+              <w:bCs/>
+              <w:noProof/>
+            </w:rPr>
+            <w:fldChar w:fldCharType="end"/>
+          </w:r>
+        </w:p>
+      </w:sdtContent>
+    </w:sdt>
     <w:p>
       <w:pPr>
         <w:pStyle w:val="Titre1"/>
@@ -535,7 +906,10 @@
           <w:lang w:eastAsia="en-US"/>
         </w:rPr>
       </w:pPr>
-      <w:r>
+    </w:p>
+    <w:p>
+      <w:pPr>
+        <w:pStyle w:val="Titre1"/>
         <w:rPr>
           <w:rFonts w:ascii="Times New Roman" w:hAnsi="Times New Roman" w:cs="Times New Roman"/>
           <w:b/>
@@ -545,30 +919,285 @@
           <w:szCs w:val="44"/>
           <w:lang w:eastAsia="en-US"/>
         </w:rPr>
-        <w:lastRenderedPageBreak/>
-        <w:t>Étude théorique de cas simples</w:t>
-      </w:r>
-    </w:p>
-    <w:p/>
-    <w:p>
-      <w:pPr>
-        <w:pStyle w:val="Titre2"/>
+      </w:pPr>
+    </w:p>
+    <w:p>
+      <w:pPr>
+        <w:pStyle w:val="Titre1"/>
         <w:rPr>
           <w:rFonts w:ascii="Times New Roman" w:hAnsi="Times New Roman" w:cs="Times New Roman"/>
           <w:b/>
           <w:bCs/>
           <w:color w:val="000000" w:themeColor="text1"/>
-        </w:rPr>
-      </w:pPr>
-      <w:r>
+          <w:sz w:val="44"/>
+          <w:szCs w:val="44"/>
+          <w:lang w:eastAsia="en-US"/>
+        </w:rPr>
+      </w:pPr>
+    </w:p>
+    <w:p>
+      <w:pPr>
+        <w:pStyle w:val="Titre1"/>
         <w:rPr>
           <w:rFonts w:ascii="Times New Roman" w:hAnsi="Times New Roman" w:cs="Times New Roman"/>
           <w:b/>
           <w:bCs/>
           <w:color w:val="000000" w:themeColor="text1"/>
+          <w:sz w:val="44"/>
+          <w:szCs w:val="44"/>
+          <w:lang w:eastAsia="en-US"/>
+        </w:rPr>
+      </w:pPr>
+    </w:p>
+    <w:p>
+      <w:pPr>
+        <w:rPr>
+          <w:lang w:eastAsia="en-US"/>
+        </w:rPr>
+      </w:pPr>
+    </w:p>
+    <w:p>
+      <w:pPr>
+        <w:rPr>
+          <w:lang w:eastAsia="en-US"/>
+        </w:rPr>
+      </w:pPr>
+    </w:p>
+    <w:p>
+      <w:pPr>
+        <w:rPr>
+          <w:lang w:eastAsia="en-US"/>
+        </w:rPr>
+      </w:pPr>
+    </w:p>
+    <w:p>
+      <w:pPr>
+        <w:rPr>
+          <w:lang w:eastAsia="en-US"/>
+        </w:rPr>
+      </w:pPr>
+    </w:p>
+    <w:p>
+      <w:pPr>
+        <w:rPr>
+          <w:lang w:eastAsia="en-US"/>
+        </w:rPr>
+      </w:pPr>
+    </w:p>
+    <w:p>
+      <w:pPr>
+        <w:rPr>
+          <w:lang w:eastAsia="en-US"/>
+        </w:rPr>
+      </w:pPr>
+    </w:p>
+    <w:p>
+      <w:pPr>
+        <w:rPr>
+          <w:lang w:eastAsia="en-US"/>
+        </w:rPr>
+      </w:pPr>
+    </w:p>
+    <w:p>
+      <w:pPr>
+        <w:rPr>
+          <w:lang w:eastAsia="en-US"/>
+        </w:rPr>
+      </w:pPr>
+    </w:p>
+    <w:p>
+      <w:pPr>
+        <w:rPr>
+          <w:lang w:eastAsia="en-US"/>
+        </w:rPr>
+      </w:pPr>
+    </w:p>
+    <w:p>
+      <w:pPr>
+        <w:rPr>
+          <w:lang w:eastAsia="en-US"/>
+        </w:rPr>
+      </w:pPr>
+    </w:p>
+    <w:p>
+      <w:pPr>
+        <w:rPr>
+          <w:lang w:eastAsia="en-US"/>
+        </w:rPr>
+      </w:pPr>
+    </w:p>
+    <w:p>
+      <w:pPr>
+        <w:rPr>
+          <w:lang w:eastAsia="en-US"/>
+        </w:rPr>
+      </w:pPr>
+    </w:p>
+    <w:p>
+      <w:pPr>
+        <w:rPr>
+          <w:lang w:eastAsia="en-US"/>
+        </w:rPr>
+      </w:pPr>
+    </w:p>
+    <w:p>
+      <w:pPr>
+        <w:rPr>
+          <w:lang w:eastAsia="en-US"/>
+        </w:rPr>
+      </w:pPr>
+    </w:p>
+    <w:p>
+      <w:pPr>
+        <w:rPr>
+          <w:lang w:eastAsia="en-US"/>
+        </w:rPr>
+      </w:pPr>
+    </w:p>
+    <w:p>
+      <w:pPr>
+        <w:rPr>
+          <w:lang w:eastAsia="en-US"/>
+        </w:rPr>
+      </w:pPr>
+    </w:p>
+    <w:p>
+      <w:pPr>
+        <w:rPr>
+          <w:lang w:eastAsia="en-US"/>
+        </w:rPr>
+      </w:pPr>
+    </w:p>
+    <w:p>
+      <w:pPr>
+        <w:rPr>
+          <w:lang w:eastAsia="en-US"/>
+        </w:rPr>
+      </w:pPr>
+    </w:p>
+    <w:p>
+      <w:pPr>
+        <w:rPr>
+          <w:lang w:eastAsia="en-US"/>
+        </w:rPr>
+      </w:pPr>
+    </w:p>
+    <w:p>
+      <w:pPr>
+        <w:rPr>
+          <w:lang w:eastAsia="en-US"/>
+        </w:rPr>
+      </w:pPr>
+    </w:p>
+    <w:p>
+      <w:pPr>
+        <w:rPr>
+          <w:lang w:eastAsia="en-US"/>
+        </w:rPr>
+      </w:pPr>
+    </w:p>
+    <w:p>
+      <w:pPr>
+        <w:rPr>
+          <w:lang w:eastAsia="en-US"/>
+        </w:rPr>
+      </w:pPr>
+    </w:p>
+    <w:p>
+      <w:pPr>
+        <w:rPr>
+          <w:lang w:eastAsia="en-US"/>
+        </w:rPr>
+      </w:pPr>
+    </w:p>
+    <w:p>
+      <w:pPr>
+        <w:rPr>
+          <w:lang w:eastAsia="en-US"/>
+        </w:rPr>
+      </w:pPr>
+    </w:p>
+    <w:p>
+      <w:pPr>
+        <w:pStyle w:val="Titre1"/>
+        <w:rPr>
+          <w:rFonts w:ascii="Times New Roman" w:hAnsi="Times New Roman" w:cs="Times New Roman"/>
+          <w:b/>
+          <w:bCs/>
+          <w:color w:val="000000" w:themeColor="text1"/>
+          <w:sz w:val="44"/>
+          <w:szCs w:val="44"/>
+          <w:lang w:eastAsia="en-US"/>
+        </w:rPr>
+      </w:pPr>
+      <w:bookmarkStart w:id="0" w:name="_Toc196318704"/>
+    </w:p>
+    <w:p>
+      <w:pPr>
+        <w:rPr>
+          <w:lang w:eastAsia="en-US"/>
+        </w:rPr>
+      </w:pPr>
+    </w:p>
+    <w:p>
+      <w:pPr>
+        <w:pStyle w:val="Titre1"/>
+        <w:rPr>
+          <w:rFonts w:ascii="Times New Roman" w:hAnsi="Times New Roman" w:cs="Times New Roman"/>
+          <w:b/>
+          <w:bCs/>
+          <w:color w:val="000000" w:themeColor="text1"/>
+          <w:sz w:val="44"/>
+          <w:szCs w:val="44"/>
+          <w:lang w:eastAsia="en-US"/>
+        </w:rPr>
+      </w:pPr>
+      <w:r>
+        <w:rPr>
+          <w:rFonts w:ascii="Times New Roman" w:hAnsi="Times New Roman" w:cs="Times New Roman"/>
+          <w:b/>
+          <w:bCs/>
+          <w:color w:val="000000" w:themeColor="text1"/>
+          <w:sz w:val="44"/>
+          <w:szCs w:val="44"/>
+          <w:lang w:eastAsia="en-US"/>
+        </w:rPr>
+        <w:lastRenderedPageBreak/>
+        <w:t>Étude théorique de cas simples</w:t>
+      </w:r>
+      <w:bookmarkEnd w:id="0"/>
+    </w:p>
+    <w:p/>
+    <w:p>
+      <w:pPr>
+        <w:pStyle w:val="Titre2"/>
+        <w:rPr>
+          <w:rFonts w:ascii="Times New Roman" w:hAnsi="Times New Roman" w:cs="Times New Roman"/>
+          <w:b/>
+          <w:bCs/>
+          <w:color w:val="000000" w:themeColor="text1"/>
+        </w:rPr>
+      </w:pPr>
+      <w:bookmarkStart w:id="1" w:name="_Toc196318705"/>
+      <w:r>
+        <w:rPr>
+          <w:rFonts w:ascii="Times New Roman" w:hAnsi="Times New Roman" w:cs="Times New Roman"/>
+          <w:b/>
+          <w:bCs/>
+          <w:color w:val="000000" w:themeColor="text1"/>
         </w:rPr>
         <w:t>Influence de η</w:t>
       </w:r>
+      <w:r>
+        <w:rPr>
+          <w:rFonts w:ascii="Times New Roman" w:hAnsi="Times New Roman" w:cs="Times New Roman"/>
+          <w:b/>
+          <w:bCs/>
+          <w:color w:val="000000" w:themeColor="text1"/>
+        </w:rPr>
+        <w:t xml:space="preserve"> (mu)</w:t>
+      </w:r>
+      <w:bookmarkEnd w:id="1"/>
     </w:p>
     <w:p/>
     <w:p>
@@ -2812,7 +3441,16 @@
           <w:iCs/>
           <w:color w:val="002060"/>
         </w:rPr>
-        <w:t>]0,1[</w:t>
+        <w:t>]0,</w:t>
+      </w:r>
+      <w:proofErr w:type="gramStart"/>
+      <w:r>
+        <w:rPr>
+          <w:i/>
+          <w:iCs/>
+          <w:color w:val="002060"/>
+        </w:rPr>
+        <w:t>1[</w:t>
       </w:r>
       <w:r>
         <w:rPr>
@@ -2828,7 +3466,16 @@
           <w:iCs/>
           <w:color w:val="002060"/>
         </w:rPr>
-        <w:t>où se situera le nouveau poids par rapport à W</w:t>
+        <w:t>où</w:t>
+      </w:r>
+      <w:proofErr w:type="gramEnd"/>
+      <w:r>
+        <w:rPr>
+          <w:i/>
+          <w:iCs/>
+          <w:color w:val="002060"/>
+        </w:rPr>
+        <w:t xml:space="preserve"> se situera le nouveau poids par rapport à W</w:t>
       </w:r>
       <w:r>
         <w:rPr>
@@ -3969,13 +4616,38 @@
     <w:p/>
     <w:p>
       <w:pPr>
+        <w:pStyle w:val="Titre2"/>
+        <w:rPr>
+          <w:rFonts w:ascii="Times New Roman" w:hAnsi="Times New Roman" w:cs="Times New Roman"/>
+          <w:b/>
+          <w:bCs/>
+          <w:color w:val="000000" w:themeColor="text1"/>
+        </w:rPr>
+      </w:pPr>
+      <w:bookmarkStart w:id="2" w:name="_Toc196318706"/>
+      <w:r>
+        <w:rPr>
+          <w:rFonts w:ascii="Times New Roman" w:hAnsi="Times New Roman" w:cs="Times New Roman"/>
+          <w:b/>
+          <w:bCs/>
+          <w:color w:val="000000" w:themeColor="text1"/>
+        </w:rPr>
+        <w:t>Influence de σ</w:t>
+      </w:r>
+      <w:r>
+        <w:rPr>
+          <w:rFonts w:ascii="Times New Roman" w:hAnsi="Times New Roman" w:cs="Times New Roman"/>
+          <w:b/>
+          <w:bCs/>
+          <w:color w:val="000000" w:themeColor="text1"/>
+        </w:rPr>
+        <w:t xml:space="preserve"> (sigma)</w:t>
+      </w:r>
+      <w:bookmarkEnd w:id="2"/>
+    </w:p>
+    <w:p>
+      <w:pPr>
         <w:pStyle w:val="p1"/>
-        <w:rPr>
-          <w:sz w:val="18"/>
-          <w:szCs w:val="18"/>
-        </w:rPr>
-      </w:pPr>
-      <w:r>
         <w:rPr>
           <w:rFonts w:ascii="Times New Roman" w:hAnsi="Times New Roman"/>
           <w:b/>
@@ -3984,9 +4656,2477 @@
           <w:sz w:val="26"/>
           <w:szCs w:val="26"/>
         </w:rPr>
-        <w:t xml:space="preserve">Influence de </w:t>
-      </w:r>
-      <w:r>
+      </w:pPr>
+    </w:p>
+    <w:p>
+      <w:pPr>
+        <w:jc w:val="both"/>
+        <w:rPr>
+          <w:i/>
+          <w:iCs/>
+          <w:color w:val="002060"/>
+        </w:rPr>
+      </w:pPr>
+      <w:r>
+        <w:rPr>
+          <w:i/>
+          <w:iCs/>
+          <w:color w:val="002060"/>
+        </w:rPr>
+        <w:t xml:space="preserve">Si σ augmente, les neurones proches du neurone gagnant (dans la carte), </w:t>
+      </w:r>
+      <w:proofErr w:type="spellStart"/>
+      <w:r>
+        <w:rPr>
+          <w:i/>
+          <w:iCs/>
+          <w:color w:val="002060"/>
+        </w:rPr>
+        <w:t>vont-ils</w:t>
+      </w:r>
+      <w:proofErr w:type="spellEnd"/>
+      <w:r>
+        <w:rPr>
+          <w:i/>
+          <w:iCs/>
+          <w:color w:val="002060"/>
+        </w:rPr>
+        <w:t xml:space="preserve"> plus ou moins apprendre</w:t>
+      </w:r>
+      <w:r>
+        <w:rPr>
+          <w:i/>
+          <w:iCs/>
+          <w:color w:val="002060"/>
+        </w:rPr>
+        <w:t xml:space="preserve"> </w:t>
+      </w:r>
+      <w:r>
+        <w:rPr>
+          <w:i/>
+          <w:iCs/>
+          <w:color w:val="002060"/>
+        </w:rPr>
+        <w:t>l’entr</w:t>
+      </w:r>
+      <w:r>
+        <w:rPr>
+          <w:i/>
+          <w:iCs/>
+          <w:color w:val="002060"/>
+        </w:rPr>
+        <w:t>é</w:t>
+      </w:r>
+      <w:r>
+        <w:rPr>
+          <w:i/>
+          <w:iCs/>
+          <w:color w:val="002060"/>
+        </w:rPr>
+        <w:t>e courante ?</w:t>
+      </w:r>
+    </w:p>
+    <w:p>
+      <w:pPr>
+        <w:pStyle w:val="p1"/>
+        <w:jc w:val="both"/>
+        <w:rPr>
+          <w:rFonts w:ascii="Times New Roman" w:hAnsi="Times New Roman"/>
+          <w:i/>
+          <w:iCs/>
+          <w:color w:val="002060"/>
+          <w:sz w:val="24"/>
+          <w:szCs w:val="24"/>
+        </w:rPr>
+      </w:pPr>
+    </w:p>
+    <w:p>
+      <w:pPr>
+        <w:pStyle w:val="p1"/>
+        <w:jc w:val="both"/>
+        <w:rPr>
+          <w:rFonts w:ascii="Times New Roman" w:hAnsi="Times New Roman"/>
+          <w:color w:val="auto"/>
+          <w:sz w:val="24"/>
+          <w:szCs w:val="24"/>
+        </w:rPr>
+      </w:pPr>
+      <w:r>
+        <w:rPr>
+          <w:rFonts w:ascii="Times New Roman" w:hAnsi="Times New Roman"/>
+          <w:color w:val="auto"/>
+          <w:sz w:val="24"/>
+          <w:szCs w:val="24"/>
+        </w:rPr>
+        <w:t>Pour rappelle la règle d’apprentissage est la suivante :</w:t>
+      </w:r>
+    </w:p>
+    <w:p>
+      <w:pPr>
+        <w:pStyle w:val="p1"/>
+        <w:jc w:val="both"/>
+        <w:rPr>
+          <w:rFonts w:ascii="Times New Roman" w:hAnsi="Times New Roman"/>
+          <w:color w:val="auto"/>
+          <w:sz w:val="24"/>
+          <w:szCs w:val="24"/>
+        </w:rPr>
+      </w:pPr>
+    </w:p>
+    <w:p>
+      <w:pPr>
+        <w:pStyle w:val="p1"/>
+        <w:jc w:val="both"/>
+        <w:rPr>
+          <w:rFonts w:ascii="Times New Roman" w:hAnsi="Times New Roman"/>
+          <w:color w:val="auto"/>
+          <w:sz w:val="24"/>
+          <w:szCs w:val="24"/>
+        </w:rPr>
+      </w:pPr>
+      <m:oMathPara>
+        <m:oMath>
+          <m:r>
+            <m:rPr>
+              <m:sty m:val="p"/>
+            </m:rPr>
+            <w:rPr>
+              <w:rFonts w:ascii="Cambria Math" w:hAnsi="Cambria Math"/>
+              <w:color w:val="auto"/>
+              <w:sz w:val="24"/>
+              <w:szCs w:val="24"/>
+            </w:rPr>
+            <m:t>Δ</m:t>
+          </m:r>
+          <m:sSub>
+            <m:sSubPr>
+              <m:ctrlPr>
+                <w:rPr>
+                  <w:rFonts w:ascii="Cambria Math" w:hAnsi="Cambria Math"/>
+                  <w:i/>
+                  <w:color w:val="auto"/>
+                  <w:sz w:val="24"/>
+                  <w:szCs w:val="24"/>
+                </w:rPr>
+              </m:ctrlPr>
+            </m:sSubPr>
+            <m:e>
+              <m:r>
+                <w:rPr>
+                  <w:rFonts w:ascii="Cambria Math" w:hAnsi="Cambria Math"/>
+                  <w:color w:val="auto"/>
+                  <w:sz w:val="24"/>
+                  <w:szCs w:val="24"/>
+                </w:rPr>
+                <m:t>w</m:t>
+              </m:r>
+            </m:e>
+            <m:sub>
+              <m:r>
+                <w:rPr>
+                  <w:rFonts w:ascii="Cambria Math" w:hAnsi="Cambria Math"/>
+                  <w:color w:val="auto"/>
+                  <w:sz w:val="24"/>
+                  <w:szCs w:val="24"/>
+                </w:rPr>
+                <m:t>ji</m:t>
+              </m:r>
+            </m:sub>
+          </m:sSub>
+          <m:r>
+            <w:rPr>
+              <w:rFonts w:ascii="Cambria Math" w:hAnsi="Cambria Math"/>
+              <w:color w:val="auto"/>
+              <w:sz w:val="24"/>
+              <w:szCs w:val="24"/>
+            </w:rPr>
+            <m:t>=</m:t>
+          </m:r>
+          <m:r>
+            <m:rPr>
+              <m:sty m:val="p"/>
+            </m:rPr>
+            <w:rPr>
+              <w:rFonts w:ascii="Cambria Math" w:hAnsi="Cambria Math"/>
+              <w:color w:val="auto"/>
+              <w:sz w:val="24"/>
+              <w:szCs w:val="24"/>
+            </w:rPr>
+            <m:t>η</m:t>
+          </m:r>
+          <m:sSup>
+            <m:sSupPr>
+              <m:ctrlPr>
+                <w:rPr>
+                  <w:rFonts w:ascii="Cambria Math" w:hAnsi="Cambria Math"/>
+                  <w:i/>
+                  <w:color w:val="auto"/>
+                  <w:sz w:val="24"/>
+                  <w:szCs w:val="24"/>
+                </w:rPr>
+              </m:ctrlPr>
+            </m:sSupPr>
+            <m:e>
+              <m:r>
+                <w:rPr>
+                  <w:rFonts w:ascii="Cambria Math" w:hAnsi="Cambria Math"/>
+                  <w:color w:val="auto"/>
+                  <w:sz w:val="24"/>
+                  <w:szCs w:val="24"/>
+                </w:rPr>
+                <m:t>e</m:t>
+              </m:r>
+            </m:e>
+            <m:sup>
+              <m:r>
+                <w:rPr>
+                  <w:rFonts w:ascii="Cambria Math" w:hAnsi="Cambria Math"/>
+                  <w:color w:val="auto"/>
+                  <w:sz w:val="24"/>
+                  <w:szCs w:val="24"/>
+                </w:rPr>
+                <m:t>-</m:t>
+              </m:r>
+              <m:f>
+                <m:fPr>
+                  <m:ctrlPr>
+                    <w:rPr>
+                      <w:rFonts w:ascii="Cambria Math" w:hAnsi="Cambria Math"/>
+                      <w:color w:val="auto"/>
+                      <w:sz w:val="24"/>
+                      <w:szCs w:val="24"/>
+                    </w:rPr>
+                  </m:ctrlPr>
+                </m:fPr>
+                <m:num>
+                  <m:sSup>
+                    <m:sSupPr>
+                      <m:ctrlPr>
+                        <w:rPr>
+                          <w:rFonts w:ascii="Cambria Math" w:hAnsi="Cambria Math"/>
+                          <w:i/>
+                          <w:color w:val="auto"/>
+                          <w:sz w:val="24"/>
+                          <w:szCs w:val="24"/>
+                        </w:rPr>
+                      </m:ctrlPr>
+                    </m:sSupPr>
+                    <m:e>
+                      <m:d>
+                        <m:dPr>
+                          <m:begChr m:val="|"/>
+                          <m:endChr m:val="|"/>
+                          <m:ctrlPr>
+                            <w:rPr>
+                              <w:rFonts w:ascii="Cambria Math" w:hAnsi="Cambria Math"/>
+                              <w:color w:val="auto"/>
+                              <w:sz w:val="24"/>
+                              <w:szCs w:val="24"/>
+                            </w:rPr>
+                          </m:ctrlPr>
+                        </m:dPr>
+                        <m:e>
+                          <m:d>
+                            <m:dPr>
+                              <m:begChr m:val="|"/>
+                              <m:endChr m:val="|"/>
+                              <m:ctrlPr>
+                                <w:rPr>
+                                  <w:rFonts w:ascii="Cambria Math" w:hAnsi="Cambria Math"/>
+                                  <w:color w:val="auto"/>
+                                  <w:sz w:val="24"/>
+                                  <w:szCs w:val="24"/>
+                                </w:rPr>
+                              </m:ctrlPr>
+                            </m:dPr>
+                            <m:e>
+                              <m:r>
+                                <w:rPr>
+                                  <w:rFonts w:ascii="Cambria Math" w:hAnsi="Cambria Math"/>
+                                  <w:color w:val="auto"/>
+                                  <w:sz w:val="24"/>
+                                  <w:szCs w:val="24"/>
+                                </w:rPr>
+                                <m:t>j-</m:t>
+                              </m:r>
+                              <m:sSup>
+                                <m:sSupPr>
+                                  <m:ctrlPr>
+                                    <w:rPr>
+                                      <w:rFonts w:ascii="Cambria Math" w:hAnsi="Cambria Math"/>
+                                      <w:i/>
+                                      <w:color w:val="auto"/>
+                                      <w:sz w:val="24"/>
+                                      <w:szCs w:val="24"/>
+                                    </w:rPr>
+                                  </m:ctrlPr>
+                                </m:sSupPr>
+                                <m:e>
+                                  <m:r>
+                                    <w:rPr>
+                                      <w:rFonts w:ascii="Cambria Math" w:hAnsi="Cambria Math"/>
+                                      <w:color w:val="auto"/>
+                                      <w:sz w:val="24"/>
+                                      <w:szCs w:val="24"/>
+                                    </w:rPr>
+                                    <m:t>j</m:t>
+                                  </m:r>
+                                </m:e>
+                                <m:sup>
+                                  <m:r>
+                                    <m:rPr>
+                                      <m:sty m:val="p"/>
+                                    </m:rPr>
+                                    <w:rPr>
+                                      <w:rFonts w:ascii="Cambria Math" w:hAnsi="Cambria Math"/>
+                                      <w:color w:val="auto"/>
+                                      <w:sz w:val="24"/>
+                                      <w:szCs w:val="24"/>
+                                    </w:rPr>
+                                    <m:t>*</m:t>
+                                  </m:r>
+                                </m:sup>
+                              </m:sSup>
+                              <m:ctrlPr>
+                                <w:rPr>
+                                  <w:rFonts w:ascii="Cambria Math" w:hAnsi="Cambria Math"/>
+                                  <w:i/>
+                                  <w:color w:val="auto"/>
+                                  <w:sz w:val="24"/>
+                                  <w:szCs w:val="24"/>
+                                </w:rPr>
+                              </m:ctrlPr>
+                            </m:e>
+                          </m:d>
+                          <m:ctrlPr>
+                            <w:rPr>
+                              <w:rFonts w:ascii="Cambria Math" w:hAnsi="Cambria Math"/>
+                              <w:i/>
+                              <w:color w:val="auto"/>
+                              <w:sz w:val="24"/>
+                              <w:szCs w:val="24"/>
+                            </w:rPr>
+                          </m:ctrlPr>
+                        </m:e>
+                      </m:d>
+                    </m:e>
+                    <m:sup>
+                      <m:r>
+                        <w:rPr>
+                          <w:rFonts w:ascii="Cambria Math" w:hAnsi="Cambria Math"/>
+                          <w:color w:val="auto"/>
+                          <w:sz w:val="24"/>
+                          <w:szCs w:val="24"/>
+                        </w:rPr>
+                        <m:t>2</m:t>
+                      </m:r>
+                    </m:sup>
+                  </m:sSup>
+                  <m:ctrlPr>
+                    <w:rPr>
+                      <w:rFonts w:ascii="Cambria Math" w:hAnsi="Cambria Math"/>
+                      <w:i/>
+                      <w:color w:val="auto"/>
+                      <w:sz w:val="24"/>
+                      <w:szCs w:val="24"/>
+                    </w:rPr>
+                  </m:ctrlPr>
+                </m:num>
+                <m:den>
+                  <m:r>
+                    <w:rPr>
+                      <w:rFonts w:ascii="Cambria Math" w:hAnsi="Cambria Math"/>
+                      <w:color w:val="auto"/>
+                      <w:sz w:val="24"/>
+                      <w:szCs w:val="24"/>
+                    </w:rPr>
+                    <m:t>2</m:t>
+                  </m:r>
+                  <m:sSup>
+                    <m:sSupPr>
+                      <m:ctrlPr>
+                        <w:rPr>
+                          <w:rFonts w:ascii="Cambria Math" w:hAnsi="Cambria Math"/>
+                          <w:i/>
+                          <w:color w:val="auto"/>
+                          <w:sz w:val="24"/>
+                          <w:szCs w:val="24"/>
+                        </w:rPr>
+                      </m:ctrlPr>
+                    </m:sSupPr>
+                    <m:e>
+                      <m:r>
+                        <m:rPr>
+                          <m:sty m:val="p"/>
+                        </m:rPr>
+                        <w:rPr>
+                          <w:rFonts w:ascii="Cambria Math" w:hAnsi="Cambria Math"/>
+                          <w:color w:val="auto"/>
+                          <w:sz w:val="24"/>
+                          <w:szCs w:val="24"/>
+                        </w:rPr>
+                        <m:t>σ</m:t>
+                      </m:r>
+                      <m:ctrlPr>
+                        <w:rPr>
+                          <w:rFonts w:ascii="Cambria Math" w:hAnsi="Cambria Math"/>
+                          <w:color w:val="auto"/>
+                          <w:sz w:val="24"/>
+                          <w:szCs w:val="24"/>
+                        </w:rPr>
+                      </m:ctrlPr>
+                    </m:e>
+                    <m:sup>
+                      <m:r>
+                        <w:rPr>
+                          <w:rFonts w:ascii="Cambria Math" w:hAnsi="Cambria Math"/>
+                          <w:color w:val="auto"/>
+                          <w:sz w:val="24"/>
+                          <w:szCs w:val="24"/>
+                        </w:rPr>
+                        <m:t>2</m:t>
+                      </m:r>
+                    </m:sup>
+                  </m:sSup>
+                  <m:ctrlPr>
+                    <w:rPr>
+                      <w:rFonts w:ascii="Cambria Math" w:hAnsi="Cambria Math"/>
+                      <w:i/>
+                      <w:color w:val="auto"/>
+                      <w:sz w:val="24"/>
+                      <w:szCs w:val="24"/>
+                    </w:rPr>
+                  </m:ctrlPr>
+                </m:den>
+              </m:f>
+            </m:sup>
+          </m:sSup>
+          <m:d>
+            <m:dPr>
+              <m:ctrlPr>
+                <w:rPr>
+                  <w:rFonts w:ascii="Cambria Math" w:hAnsi="Cambria Math"/>
+                  <w:color w:val="auto"/>
+                  <w:sz w:val="24"/>
+                  <w:szCs w:val="24"/>
+                </w:rPr>
+              </m:ctrlPr>
+            </m:dPr>
+            <m:e>
+              <m:sSub>
+                <m:sSubPr>
+                  <m:ctrlPr>
+                    <w:rPr>
+                      <w:rFonts w:ascii="Cambria Math" w:hAnsi="Cambria Math"/>
+                      <w:i/>
+                      <w:color w:val="auto"/>
+                      <w:sz w:val="24"/>
+                      <w:szCs w:val="24"/>
+                    </w:rPr>
+                  </m:ctrlPr>
+                </m:sSubPr>
+                <m:e>
+                  <m:r>
+                    <w:rPr>
+                      <w:rFonts w:ascii="Cambria Math" w:hAnsi="Cambria Math"/>
+                      <w:color w:val="auto"/>
+                      <w:sz w:val="24"/>
+                      <w:szCs w:val="24"/>
+                    </w:rPr>
+                    <m:t>x</m:t>
+                  </m:r>
+                  <m:ctrlPr>
+                    <w:rPr>
+                      <w:rFonts w:ascii="Cambria Math" w:hAnsi="Cambria Math"/>
+                      <w:color w:val="auto"/>
+                      <w:sz w:val="24"/>
+                      <w:szCs w:val="24"/>
+                    </w:rPr>
+                  </m:ctrlPr>
+                </m:e>
+                <m:sub>
+                  <m:r>
+                    <w:rPr>
+                      <w:rFonts w:ascii="Cambria Math" w:hAnsi="Cambria Math"/>
+                      <w:color w:val="auto"/>
+                      <w:sz w:val="24"/>
+                      <w:szCs w:val="24"/>
+                    </w:rPr>
+                    <m:t>i</m:t>
+                  </m:r>
+                </m:sub>
+              </m:sSub>
+              <m:r>
+                <w:rPr>
+                  <w:rFonts w:ascii="Cambria Math" w:hAnsi="Cambria Math"/>
+                  <w:color w:val="auto"/>
+                  <w:sz w:val="24"/>
+                  <w:szCs w:val="24"/>
+                </w:rPr>
+                <m:t>-</m:t>
+              </m:r>
+              <m:sSub>
+                <m:sSubPr>
+                  <m:ctrlPr>
+                    <w:rPr>
+                      <w:rFonts w:ascii="Cambria Math" w:hAnsi="Cambria Math"/>
+                      <w:i/>
+                      <w:color w:val="auto"/>
+                      <w:sz w:val="24"/>
+                      <w:szCs w:val="24"/>
+                    </w:rPr>
+                  </m:ctrlPr>
+                </m:sSubPr>
+                <m:e>
+                  <m:r>
+                    <w:rPr>
+                      <w:rFonts w:ascii="Cambria Math" w:hAnsi="Cambria Math"/>
+                      <w:color w:val="auto"/>
+                      <w:sz w:val="24"/>
+                      <w:szCs w:val="24"/>
+                    </w:rPr>
+                    <m:t>w</m:t>
+                  </m:r>
+                </m:e>
+                <m:sub>
+                  <m:r>
+                    <w:rPr>
+                      <w:rFonts w:ascii="Cambria Math" w:hAnsi="Cambria Math"/>
+                      <w:color w:val="auto"/>
+                      <w:sz w:val="24"/>
+                      <w:szCs w:val="24"/>
+                    </w:rPr>
+                    <m:t>ji</m:t>
+                  </m:r>
+                </m:sub>
+              </m:sSub>
+              <m:ctrlPr>
+                <w:rPr>
+                  <w:rFonts w:ascii="Cambria Math" w:hAnsi="Cambria Math"/>
+                  <w:i/>
+                  <w:color w:val="auto"/>
+                  <w:sz w:val="24"/>
+                  <w:szCs w:val="24"/>
+                </w:rPr>
+              </m:ctrlPr>
+            </m:e>
+          </m:d>
+        </m:oMath>
+      </m:oMathPara>
+    </w:p>
+    <w:p>
+      <w:pPr>
+        <w:pStyle w:val="p1"/>
+        <w:jc w:val="both"/>
+        <w:rPr>
+          <w:rFonts w:ascii="Times New Roman" w:hAnsi="Times New Roman"/>
+          <w:color w:val="auto"/>
+          <w:sz w:val="24"/>
+          <w:szCs w:val="24"/>
+        </w:rPr>
+      </w:pPr>
+    </w:p>
+    <w:p>
+      <w:pPr>
+        <w:pStyle w:val="p1"/>
+        <w:jc w:val="both"/>
+        <w:rPr>
+          <w:rFonts w:ascii="Times New Roman" w:hAnsi="Times New Roman"/>
+          <w:color w:val="auto"/>
+          <w:sz w:val="24"/>
+          <w:szCs w:val="24"/>
+        </w:rPr>
+      </w:pPr>
+    </w:p>
+    <w:p>
+      <w:pPr>
+        <w:pStyle w:val="p1"/>
+        <w:jc w:val="both"/>
+        <w:rPr>
+          <w:rFonts w:ascii="Times New Roman" w:hAnsi="Times New Roman"/>
+          <w:color w:val="auto"/>
+          <w:sz w:val="24"/>
+          <w:szCs w:val="24"/>
+        </w:rPr>
+      </w:pPr>
+      <w:r>
+        <w:rPr>
+          <w:rFonts w:ascii="Times New Roman" w:hAnsi="Times New Roman"/>
+          <w:color w:val="auto"/>
+          <w:sz w:val="24"/>
+          <w:szCs w:val="24"/>
+        </w:rPr>
+        <w:t>Avec :</w:t>
+      </w:r>
+    </w:p>
+    <w:p>
+      <w:pPr>
+        <w:pStyle w:val="p1"/>
+        <w:jc w:val="both"/>
+        <w:rPr>
+          <w:rFonts w:ascii="Times New Roman" w:hAnsi="Times New Roman"/>
+          <w:color w:val="auto"/>
+          <w:sz w:val="24"/>
+          <w:szCs w:val="24"/>
+        </w:rPr>
+      </w:pPr>
+      <w:r>
+        <w:rPr>
+          <w:rFonts w:ascii="Times New Roman" w:hAnsi="Times New Roman"/>
+          <w:color w:val="auto"/>
+          <w:sz w:val="24"/>
+          <w:szCs w:val="24"/>
+        </w:rPr>
+        <w:tab/>
+      </w:r>
+      <w:proofErr w:type="gramStart"/>
+      <w:r>
+        <w:rPr>
+          <w:rFonts w:ascii="Times New Roman" w:hAnsi="Times New Roman"/>
+          <w:color w:val="auto"/>
+          <w:sz w:val="24"/>
+          <w:szCs w:val="24"/>
+        </w:rPr>
+        <w:t>η</w:t>
+      </w:r>
+      <w:proofErr w:type="gramEnd"/>
+      <w:r>
+        <w:rPr>
+          <w:rFonts w:ascii="Times New Roman" w:hAnsi="Times New Roman"/>
+          <w:color w:val="auto"/>
+          <w:sz w:val="24"/>
+          <w:szCs w:val="24"/>
+        </w:rPr>
+        <w:t xml:space="preserve"> = taux d’apprentissage</w:t>
+      </w:r>
+    </w:p>
+    <w:p>
+      <w:pPr>
+        <w:pStyle w:val="p1"/>
+        <w:jc w:val="both"/>
+        <w:rPr>
+          <w:rFonts w:ascii="Times New Roman" w:hAnsi="Times New Roman"/>
+          <w:color w:val="auto"/>
+          <w:sz w:val="24"/>
+          <w:szCs w:val="24"/>
+        </w:rPr>
+      </w:pPr>
+      <w:r>
+        <w:rPr>
+          <w:rFonts w:ascii="Times New Roman" w:hAnsi="Times New Roman"/>
+          <w:color w:val="auto"/>
+          <w:sz w:val="24"/>
+          <w:szCs w:val="24"/>
+        </w:rPr>
+        <w:tab/>
+        <w:t>||j - j||²* = distance au neurone gagnant dans la carte (en indices)</w:t>
+      </w:r>
+    </w:p>
+    <w:p>
+      <w:pPr>
+        <w:pStyle w:val="p1"/>
+        <w:jc w:val="both"/>
+        <w:rPr>
+          <w:rFonts w:ascii="Times New Roman" w:hAnsi="Times New Roman"/>
+          <w:color w:val="auto"/>
+          <w:sz w:val="24"/>
+          <w:szCs w:val="24"/>
+        </w:rPr>
+      </w:pPr>
+      <w:r>
+        <w:rPr>
+          <w:rFonts w:ascii="Times New Roman" w:hAnsi="Times New Roman"/>
+          <w:color w:val="auto"/>
+          <w:sz w:val="24"/>
+          <w:szCs w:val="24"/>
+        </w:rPr>
+        <w:tab/>
+      </w:r>
+      <w:proofErr w:type="gramStart"/>
+      <w:r>
+        <w:rPr>
+          <w:rFonts w:ascii="Times New Roman" w:hAnsi="Times New Roman"/>
+          <w:color w:val="auto"/>
+          <w:sz w:val="24"/>
+          <w:szCs w:val="24"/>
+        </w:rPr>
+        <w:t>σ</w:t>
+      </w:r>
+      <w:proofErr w:type="gramEnd"/>
+      <w:r>
+        <w:rPr>
+          <w:rFonts w:ascii="Times New Roman" w:hAnsi="Times New Roman"/>
+          <w:color w:val="auto"/>
+          <w:sz w:val="24"/>
+          <w:szCs w:val="24"/>
+        </w:rPr>
+        <w:t xml:space="preserve"> = largeur du voisinage.</w:t>
+      </w:r>
+    </w:p>
+    <w:p>
+      <w:pPr>
+        <w:pStyle w:val="p1"/>
+        <w:jc w:val="both"/>
+        <w:rPr>
+          <w:rFonts w:ascii="Times New Roman" w:hAnsi="Times New Roman"/>
+          <w:color w:val="auto"/>
+          <w:sz w:val="24"/>
+          <w:szCs w:val="24"/>
+        </w:rPr>
+      </w:pPr>
+    </w:p>
+    <w:p>
+      <w:pPr>
+        <w:pStyle w:val="p1"/>
+        <w:jc w:val="both"/>
+        <w:rPr>
+          <w:rFonts w:ascii="Times New Roman" w:hAnsi="Times New Roman"/>
+          <w:color w:val="auto"/>
+          <w:sz w:val="24"/>
+          <w:szCs w:val="24"/>
+        </w:rPr>
+      </w:pPr>
+      <w:r>
+        <w:rPr>
+          <w:rFonts w:ascii="Times New Roman" w:hAnsi="Times New Roman"/>
+          <w:color w:val="auto"/>
+          <w:sz w:val="24"/>
+          <w:szCs w:val="24"/>
+        </w:rPr>
+        <w:t>On note le facteur gaussien noté comme tel :</w:t>
+      </w:r>
+    </w:p>
+    <w:p>
+      <w:pPr>
+        <w:pStyle w:val="p1"/>
+        <w:jc w:val="both"/>
+        <w:rPr>
+          <w:rFonts w:ascii="Times New Roman" w:hAnsi="Times New Roman"/>
+          <w:color w:val="auto"/>
+          <w:sz w:val="24"/>
+          <w:szCs w:val="24"/>
+        </w:rPr>
+      </w:pPr>
+    </w:p>
+    <w:p>
+      <w:pPr>
+        <w:pStyle w:val="p1"/>
+        <w:jc w:val="both"/>
+        <w:rPr>
+          <w:rFonts w:ascii="Times New Roman" w:hAnsi="Times New Roman"/>
+          <w:color w:val="auto"/>
+          <w:sz w:val="24"/>
+          <w:szCs w:val="24"/>
+        </w:rPr>
+      </w:pPr>
+      <m:oMathPara>
+        <m:oMath>
+          <m:sSub>
+            <m:sSubPr>
+              <m:ctrlPr>
+                <w:rPr>
+                  <w:rFonts w:ascii="Cambria Math" w:hAnsi="Cambria Math"/>
+                  <w:i/>
+                  <w:color w:val="auto"/>
+                  <w:sz w:val="24"/>
+                  <w:szCs w:val="24"/>
+                </w:rPr>
+              </m:ctrlPr>
+            </m:sSubPr>
+            <m:e>
+              <m:r>
+                <m:rPr>
+                  <m:sty m:val="p"/>
+                </m:rPr>
+                <w:rPr>
+                  <w:rFonts w:ascii="Cambria Math" w:hAnsi="Cambria Math"/>
+                  <w:color w:val="auto"/>
+                  <w:sz w:val="24"/>
+                  <w:szCs w:val="24"/>
+                </w:rPr>
+                <m:t>θ</m:t>
+              </m:r>
+              <m:ctrlPr>
+                <w:rPr>
+                  <w:rFonts w:ascii="Cambria Math" w:hAnsi="Cambria Math"/>
+                  <w:color w:val="auto"/>
+                  <w:sz w:val="24"/>
+                  <w:szCs w:val="24"/>
+                </w:rPr>
+              </m:ctrlPr>
+            </m:e>
+            <m:sub>
+              <m:r>
+                <w:rPr>
+                  <w:rFonts w:ascii="Cambria Math" w:hAnsi="Cambria Math"/>
+                  <w:color w:val="auto"/>
+                  <w:sz w:val="24"/>
+                  <w:szCs w:val="24"/>
+                </w:rPr>
+                <m:t>j</m:t>
+              </m:r>
+            </m:sub>
+          </m:sSub>
+          <m:r>
+            <w:rPr>
+              <w:rFonts w:ascii="Cambria Math" w:hAnsi="Cambria Math"/>
+              <w:color w:val="auto"/>
+              <w:sz w:val="24"/>
+              <w:szCs w:val="24"/>
+            </w:rPr>
+            <m:t>=</m:t>
+          </m:r>
+          <m:sSup>
+            <m:sSupPr>
+              <m:ctrlPr>
+                <w:rPr>
+                  <w:rFonts w:ascii="Cambria Math" w:hAnsi="Cambria Math"/>
+                  <w:i/>
+                  <w:color w:val="auto"/>
+                  <w:sz w:val="24"/>
+                  <w:szCs w:val="24"/>
+                </w:rPr>
+              </m:ctrlPr>
+            </m:sSupPr>
+            <m:e>
+              <m:r>
+                <w:rPr>
+                  <w:rFonts w:ascii="Cambria Math" w:hAnsi="Cambria Math"/>
+                  <w:color w:val="auto"/>
+                  <w:sz w:val="24"/>
+                  <w:szCs w:val="24"/>
+                </w:rPr>
+                <m:t>e</m:t>
+              </m:r>
+            </m:e>
+            <m:sup>
+              <m:r>
+                <w:rPr>
+                  <w:rFonts w:ascii="Cambria Math" w:hAnsi="Cambria Math"/>
+                  <w:color w:val="auto"/>
+                  <w:sz w:val="24"/>
+                  <w:szCs w:val="24"/>
+                </w:rPr>
+                <m:t>-</m:t>
+              </m:r>
+              <m:f>
+                <m:fPr>
+                  <m:ctrlPr>
+                    <w:rPr>
+                      <w:rFonts w:ascii="Cambria Math" w:hAnsi="Cambria Math"/>
+                      <w:color w:val="auto"/>
+                      <w:sz w:val="24"/>
+                      <w:szCs w:val="24"/>
+                    </w:rPr>
+                  </m:ctrlPr>
+                </m:fPr>
+                <m:num>
+                  <m:sSup>
+                    <m:sSupPr>
+                      <m:ctrlPr>
+                        <w:rPr>
+                          <w:rFonts w:ascii="Cambria Math" w:hAnsi="Cambria Math"/>
+                          <w:i/>
+                          <w:color w:val="auto"/>
+                          <w:sz w:val="24"/>
+                          <w:szCs w:val="24"/>
+                        </w:rPr>
+                      </m:ctrlPr>
+                    </m:sSupPr>
+                    <m:e>
+                      <m:d>
+                        <m:dPr>
+                          <m:begChr m:val="|"/>
+                          <m:endChr m:val="|"/>
+                          <m:ctrlPr>
+                            <w:rPr>
+                              <w:rFonts w:ascii="Cambria Math" w:hAnsi="Cambria Math"/>
+                              <w:color w:val="auto"/>
+                              <w:sz w:val="24"/>
+                              <w:szCs w:val="24"/>
+                            </w:rPr>
+                          </m:ctrlPr>
+                        </m:dPr>
+                        <m:e>
+                          <m:r>
+                            <w:rPr>
+                              <w:rFonts w:ascii="Cambria Math" w:hAnsi="Cambria Math"/>
+                              <w:color w:val="auto"/>
+                              <w:sz w:val="24"/>
+                              <w:szCs w:val="24"/>
+                            </w:rPr>
+                            <m:t>j-</m:t>
+                          </m:r>
+                          <m:sSup>
+                            <m:sSupPr>
+                              <m:ctrlPr>
+                                <w:rPr>
+                                  <w:rFonts w:ascii="Cambria Math" w:hAnsi="Cambria Math"/>
+                                  <w:i/>
+                                  <w:color w:val="auto"/>
+                                  <w:sz w:val="24"/>
+                                  <w:szCs w:val="24"/>
+                                </w:rPr>
+                              </m:ctrlPr>
+                            </m:sSupPr>
+                            <m:e>
+                              <m:r>
+                                <w:rPr>
+                                  <w:rFonts w:ascii="Cambria Math" w:hAnsi="Cambria Math"/>
+                                  <w:color w:val="auto"/>
+                                  <w:sz w:val="24"/>
+                                  <w:szCs w:val="24"/>
+                                </w:rPr>
+                                <m:t>j</m:t>
+                              </m:r>
+                            </m:e>
+                            <m:sup>
+                              <m:r>
+                                <m:rPr>
+                                  <m:sty m:val="p"/>
+                                </m:rPr>
+                                <w:rPr>
+                                  <w:rFonts w:ascii="Cambria Math" w:hAnsi="Cambria Math"/>
+                                  <w:color w:val="auto"/>
+                                  <w:sz w:val="24"/>
+                                  <w:szCs w:val="24"/>
+                                </w:rPr>
+                                <m:t>*</m:t>
+                              </m:r>
+                            </m:sup>
+                          </m:sSup>
+                          <m:ctrlPr>
+                            <w:rPr>
+                              <w:rFonts w:ascii="Cambria Math" w:hAnsi="Cambria Math"/>
+                              <w:i/>
+                              <w:color w:val="auto"/>
+                              <w:sz w:val="24"/>
+                              <w:szCs w:val="24"/>
+                            </w:rPr>
+                          </m:ctrlPr>
+                        </m:e>
+                      </m:d>
+                    </m:e>
+                    <m:sup>
+                      <m:r>
+                        <w:rPr>
+                          <w:rFonts w:ascii="Cambria Math" w:hAnsi="Cambria Math"/>
+                          <w:color w:val="auto"/>
+                          <w:sz w:val="24"/>
+                          <w:szCs w:val="24"/>
+                        </w:rPr>
+                        <m:t>2</m:t>
+                      </m:r>
+                    </m:sup>
+                  </m:sSup>
+                  <m:ctrlPr>
+                    <w:rPr>
+                      <w:rFonts w:ascii="Cambria Math" w:hAnsi="Cambria Math"/>
+                      <w:i/>
+                      <w:color w:val="auto"/>
+                      <w:sz w:val="24"/>
+                      <w:szCs w:val="24"/>
+                    </w:rPr>
+                  </m:ctrlPr>
+                </m:num>
+                <m:den>
+                  <m:r>
+                    <w:rPr>
+                      <w:rFonts w:ascii="Cambria Math" w:hAnsi="Cambria Math"/>
+                      <w:color w:val="auto"/>
+                      <w:sz w:val="24"/>
+                      <w:szCs w:val="24"/>
+                    </w:rPr>
+                    <m:t>2</m:t>
+                  </m:r>
+                  <m:sSup>
+                    <m:sSupPr>
+                      <m:ctrlPr>
+                        <w:rPr>
+                          <w:rFonts w:ascii="Cambria Math" w:hAnsi="Cambria Math"/>
+                          <w:i/>
+                          <w:color w:val="auto"/>
+                          <w:sz w:val="24"/>
+                          <w:szCs w:val="24"/>
+                        </w:rPr>
+                      </m:ctrlPr>
+                    </m:sSupPr>
+                    <m:e>
+                      <m:r>
+                        <m:rPr>
+                          <m:sty m:val="p"/>
+                        </m:rPr>
+                        <w:rPr>
+                          <w:rFonts w:ascii="Cambria Math" w:hAnsi="Cambria Math"/>
+                          <w:color w:val="auto"/>
+                          <w:sz w:val="24"/>
+                          <w:szCs w:val="24"/>
+                        </w:rPr>
+                        <m:t>σ</m:t>
+                      </m:r>
+                      <m:ctrlPr>
+                        <w:rPr>
+                          <w:rFonts w:ascii="Cambria Math" w:hAnsi="Cambria Math"/>
+                          <w:color w:val="auto"/>
+                          <w:sz w:val="24"/>
+                          <w:szCs w:val="24"/>
+                        </w:rPr>
+                      </m:ctrlPr>
+                    </m:e>
+                    <m:sup>
+                      <m:r>
+                        <w:rPr>
+                          <w:rFonts w:ascii="Cambria Math" w:hAnsi="Cambria Math"/>
+                          <w:color w:val="auto"/>
+                          <w:sz w:val="24"/>
+                          <w:szCs w:val="24"/>
+                        </w:rPr>
+                        <m:t>2</m:t>
+                      </m:r>
+                    </m:sup>
+                  </m:sSup>
+                  <m:ctrlPr>
+                    <w:rPr>
+                      <w:rFonts w:ascii="Cambria Math" w:hAnsi="Cambria Math"/>
+                      <w:i/>
+                      <w:color w:val="auto"/>
+                      <w:sz w:val="24"/>
+                      <w:szCs w:val="24"/>
+                    </w:rPr>
+                  </m:ctrlPr>
+                </m:den>
+              </m:f>
+            </m:sup>
+          </m:sSup>
+        </m:oMath>
+      </m:oMathPara>
+    </w:p>
+    <w:p>
+      <w:pPr>
+        <w:pStyle w:val="p1"/>
+        <w:jc w:val="both"/>
+        <w:rPr>
+          <w:rFonts w:ascii="Times New Roman" w:hAnsi="Times New Roman"/>
+          <w:color w:val="auto"/>
+          <w:sz w:val="24"/>
+          <w:szCs w:val="24"/>
+        </w:rPr>
+      </w:pPr>
+    </w:p>
+    <w:p>
+      <w:pPr>
+        <w:pStyle w:val="p1"/>
+        <w:jc w:val="both"/>
+        <w:rPr>
+          <w:rFonts w:ascii="Times New Roman" w:hAnsi="Times New Roman"/>
+          <w:color w:val="auto"/>
+          <w:sz w:val="24"/>
+          <w:szCs w:val="24"/>
+        </w:rPr>
+      </w:pPr>
+      <w:r>
+        <w:rPr>
+          <w:rFonts w:ascii="Times New Roman" w:hAnsi="Times New Roman"/>
+          <w:color w:val="auto"/>
+          <w:sz w:val="24"/>
+          <w:szCs w:val="24"/>
+        </w:rPr>
+        <w:t>Quand sigma tend vers l’infini on a :</w:t>
+      </w:r>
+    </w:p>
+    <w:p>
+      <w:pPr>
+        <w:pStyle w:val="p1"/>
+        <w:jc w:val="both"/>
+        <w:rPr>
+          <w:rFonts w:ascii="Times New Roman" w:hAnsi="Times New Roman"/>
+          <w:color w:val="auto"/>
+          <w:sz w:val="24"/>
+          <w:szCs w:val="24"/>
+        </w:rPr>
+      </w:pPr>
+    </w:p>
+    <w:p>
+      <w:pPr>
+        <w:pStyle w:val="p1"/>
+        <w:jc w:val="both"/>
+        <w:rPr>
+          <w:rFonts w:ascii="Times New Roman" w:hAnsi="Times New Roman"/>
+          <w:color w:val="auto"/>
+          <w:sz w:val="24"/>
+          <w:szCs w:val="24"/>
+        </w:rPr>
+      </w:pPr>
+      <m:oMathPara>
+        <m:oMath>
+          <m:func>
+            <m:funcPr>
+              <m:ctrlPr>
+                <w:rPr>
+                  <w:rFonts w:ascii="Cambria Math" w:hAnsi="Cambria Math"/>
+                  <w:color w:val="auto"/>
+                  <w:sz w:val="24"/>
+                  <w:szCs w:val="24"/>
+                </w:rPr>
+              </m:ctrlPr>
+            </m:funcPr>
+            <m:fName>
+              <m:limLow>
+                <m:limLowPr>
+                  <m:ctrlPr>
+                    <w:rPr>
+                      <w:rFonts w:ascii="Cambria Math" w:hAnsi="Cambria Math"/>
+                      <w:i/>
+                      <w:color w:val="auto"/>
+                      <w:sz w:val="24"/>
+                      <w:szCs w:val="24"/>
+                    </w:rPr>
+                  </m:ctrlPr>
+                </m:limLowPr>
+                <m:e>
+                  <m:r>
+                    <m:rPr>
+                      <m:sty m:val="p"/>
+                    </m:rPr>
+                    <w:rPr>
+                      <w:rFonts w:ascii="Cambria Math" w:hAnsi="Cambria Math"/>
+                      <w:color w:val="auto"/>
+                      <w:sz w:val="24"/>
+                      <w:szCs w:val="24"/>
+                    </w:rPr>
+                    <m:t>lim</m:t>
+                  </m:r>
+                </m:e>
+                <m:lim>
+                  <m:r>
+                    <m:rPr>
+                      <m:sty m:val="p"/>
+                    </m:rPr>
+                    <w:rPr>
+                      <w:rFonts w:ascii="Cambria Math" w:hAnsi="Cambria Math"/>
+                      <w:color w:val="auto"/>
+                      <w:sz w:val="24"/>
+                      <w:szCs w:val="24"/>
+                    </w:rPr>
+                    <m:t>σ→</m:t>
+                  </m:r>
+                  <m:r>
+                    <w:rPr>
+                      <w:rFonts w:ascii="Cambria Math" w:hAnsi="Cambria Math"/>
+                      <w:color w:val="auto"/>
+                      <w:sz w:val="24"/>
+                      <w:szCs w:val="24"/>
+                    </w:rPr>
+                    <m:t>+</m:t>
+                  </m:r>
+                  <m:r>
+                    <m:rPr>
+                      <m:sty m:val="p"/>
+                    </m:rPr>
+                    <w:rPr>
+                      <w:rFonts w:ascii="Cambria Math" w:hAnsi="Cambria Math"/>
+                      <w:color w:val="auto"/>
+                      <w:sz w:val="24"/>
+                      <w:szCs w:val="24"/>
+                    </w:rPr>
+                    <m:t>∞</m:t>
+                  </m:r>
+                  <m:ctrlPr>
+                    <w:rPr>
+                      <w:rFonts w:ascii="Cambria Math" w:hAnsi="Cambria Math"/>
+                      <w:color w:val="auto"/>
+                      <w:sz w:val="24"/>
+                      <w:szCs w:val="24"/>
+                    </w:rPr>
+                  </m:ctrlPr>
+                </m:lim>
+              </m:limLow>
+              <m:ctrlPr>
+                <w:rPr>
+                  <w:rFonts w:ascii="Cambria Math" w:hAnsi="Cambria Math"/>
+                  <w:i/>
+                  <w:color w:val="auto"/>
+                  <w:sz w:val="24"/>
+                  <w:szCs w:val="24"/>
+                </w:rPr>
+              </m:ctrlPr>
+            </m:fName>
+            <m:e>
+              <m:sSub>
+                <m:sSubPr>
+                  <m:ctrlPr>
+                    <w:rPr>
+                      <w:rFonts w:ascii="Cambria Math" w:hAnsi="Cambria Math"/>
+                      <w:i/>
+                      <w:color w:val="auto"/>
+                      <w:sz w:val="24"/>
+                      <w:szCs w:val="24"/>
+                    </w:rPr>
+                  </m:ctrlPr>
+                </m:sSubPr>
+                <m:e>
+                  <m:r>
+                    <m:rPr>
+                      <m:sty m:val="p"/>
+                    </m:rPr>
+                    <w:rPr>
+                      <w:rFonts w:ascii="Cambria Math" w:hAnsi="Cambria Math"/>
+                      <w:color w:val="auto"/>
+                      <w:sz w:val="24"/>
+                      <w:szCs w:val="24"/>
+                    </w:rPr>
+                    <m:t>θ</m:t>
+                  </m:r>
+                </m:e>
+                <m:sub>
+                  <m:r>
+                    <w:rPr>
+                      <w:rFonts w:ascii="Cambria Math" w:hAnsi="Cambria Math"/>
+                      <w:color w:val="auto"/>
+                      <w:sz w:val="24"/>
+                      <w:szCs w:val="24"/>
+                    </w:rPr>
+                    <m:t>j</m:t>
+                  </m:r>
+                </m:sub>
+              </m:sSub>
+              <m:ctrlPr>
+                <w:rPr>
+                  <w:rFonts w:ascii="Cambria Math" w:hAnsi="Cambria Math"/>
+                  <w:i/>
+                  <w:color w:val="auto"/>
+                  <w:sz w:val="24"/>
+                  <w:szCs w:val="24"/>
+                </w:rPr>
+              </m:ctrlPr>
+            </m:e>
+          </m:func>
+          <m:r>
+            <w:rPr>
+              <w:rFonts w:ascii="Cambria Math" w:hAnsi="Cambria Math"/>
+              <w:color w:val="auto"/>
+              <w:sz w:val="24"/>
+              <w:szCs w:val="24"/>
+            </w:rPr>
+            <m:t>=</m:t>
+          </m:r>
+          <m:sSup>
+            <m:sSupPr>
+              <m:ctrlPr>
+                <w:rPr>
+                  <w:rFonts w:ascii="Cambria Math" w:hAnsi="Cambria Math"/>
+                  <w:i/>
+                  <w:color w:val="auto"/>
+                  <w:sz w:val="24"/>
+                  <w:szCs w:val="24"/>
+                </w:rPr>
+              </m:ctrlPr>
+            </m:sSupPr>
+            <m:e>
+              <m:r>
+                <w:rPr>
+                  <w:rFonts w:ascii="Cambria Math" w:hAnsi="Cambria Math"/>
+                  <w:color w:val="auto"/>
+                  <w:sz w:val="24"/>
+                  <w:szCs w:val="24"/>
+                </w:rPr>
+                <m:t>e</m:t>
+              </m:r>
+            </m:e>
+            <m:sup>
+              <m:r>
+                <w:rPr>
+                  <w:rFonts w:ascii="Cambria Math" w:hAnsi="Cambria Math"/>
+                  <w:color w:val="auto"/>
+                  <w:sz w:val="24"/>
+                  <w:szCs w:val="24"/>
+                </w:rPr>
+                <m:t>0</m:t>
+              </m:r>
+            </m:sup>
+          </m:sSup>
+          <m:r>
+            <w:rPr>
+              <w:rFonts w:ascii="Cambria Math" w:hAnsi="Cambria Math"/>
+              <w:color w:val="auto"/>
+              <w:sz w:val="24"/>
+              <w:szCs w:val="24"/>
+            </w:rPr>
+            <m:t>=1</m:t>
+          </m:r>
+        </m:oMath>
+      </m:oMathPara>
+    </w:p>
+    <w:p>
+      <w:pPr>
+        <w:pStyle w:val="p1"/>
+        <w:jc w:val="both"/>
+        <w:rPr>
+          <w:rFonts w:ascii="Times New Roman" w:hAnsi="Times New Roman"/>
+          <w:color w:val="auto"/>
+          <w:sz w:val="24"/>
+          <w:szCs w:val="24"/>
+        </w:rPr>
+      </w:pPr>
+    </w:p>
+    <w:p>
+      <w:pPr>
+        <w:pStyle w:val="p1"/>
+        <w:jc w:val="both"/>
+        <w:rPr>
+          <w:rFonts w:ascii="Times New Roman" w:hAnsi="Times New Roman"/>
+          <w:color w:val="auto"/>
+          <w:sz w:val="24"/>
+          <w:szCs w:val="24"/>
+        </w:rPr>
+      </w:pPr>
+    </w:p>
+    <w:p>
+      <w:pPr>
+        <w:pStyle w:val="p1"/>
+        <w:jc w:val="both"/>
+        <w:rPr>
+          <w:rFonts w:ascii="Times New Roman" w:hAnsi="Times New Roman"/>
+          <w:color w:val="auto"/>
+          <w:sz w:val="24"/>
+          <w:szCs w:val="24"/>
+        </w:rPr>
+      </w:pPr>
+      <w:r>
+        <w:rPr>
+          <w:rFonts w:ascii="Times New Roman" w:hAnsi="Times New Roman"/>
+          <w:color w:val="auto"/>
+          <w:sz w:val="24"/>
+          <w:szCs w:val="24"/>
+        </w:rPr>
+        <w:t>Ainsi, dans cette limite, la règle d’apprentissage devient :</w:t>
+      </w:r>
+    </w:p>
+    <w:p>
+      <w:pPr>
+        <w:pStyle w:val="p1"/>
+        <w:jc w:val="both"/>
+        <w:rPr>
+          <w:rFonts w:ascii="Times New Roman" w:hAnsi="Times New Roman"/>
+          <w:color w:val="auto"/>
+          <w:sz w:val="24"/>
+          <w:szCs w:val="24"/>
+        </w:rPr>
+      </w:pPr>
+    </w:p>
+    <w:p>
+      <w:pPr>
+        <w:pStyle w:val="p1"/>
+        <w:jc w:val="both"/>
+        <w:rPr>
+          <w:rFonts w:ascii="Times New Roman" w:hAnsi="Times New Roman"/>
+          <w:color w:val="auto"/>
+          <w:sz w:val="24"/>
+          <w:szCs w:val="24"/>
+        </w:rPr>
+      </w:pPr>
+      <m:oMathPara>
+        <m:oMath>
+          <m:r>
+            <m:rPr>
+              <m:sty m:val="p"/>
+            </m:rPr>
+            <w:rPr>
+              <w:rFonts w:ascii="Cambria Math" w:hAnsi="Cambria Math"/>
+              <w:color w:val="auto"/>
+              <w:sz w:val="24"/>
+              <w:szCs w:val="24"/>
+            </w:rPr>
+            <m:t>Δ</m:t>
+          </m:r>
+          <m:sSub>
+            <m:sSubPr>
+              <m:ctrlPr>
+                <w:rPr>
+                  <w:rFonts w:ascii="Cambria Math" w:hAnsi="Cambria Math"/>
+                  <w:i/>
+                  <w:color w:val="auto"/>
+                  <w:sz w:val="24"/>
+                  <w:szCs w:val="24"/>
+                </w:rPr>
+              </m:ctrlPr>
+            </m:sSubPr>
+            <m:e>
+              <m:r>
+                <w:rPr>
+                  <w:rFonts w:ascii="Cambria Math" w:hAnsi="Cambria Math"/>
+                  <w:color w:val="auto"/>
+                  <w:sz w:val="24"/>
+                  <w:szCs w:val="24"/>
+                </w:rPr>
+                <m:t>w</m:t>
+              </m:r>
+            </m:e>
+            <m:sub>
+              <m:r>
+                <w:rPr>
+                  <w:rFonts w:ascii="Cambria Math" w:hAnsi="Cambria Math"/>
+                  <w:color w:val="auto"/>
+                  <w:sz w:val="24"/>
+                  <w:szCs w:val="24"/>
+                </w:rPr>
+                <m:t>ji</m:t>
+              </m:r>
+            </m:sub>
+          </m:sSub>
+          <m:r>
+            <w:rPr>
+              <w:rFonts w:ascii="Cambria Math" w:hAnsi="Cambria Math"/>
+              <w:color w:val="auto"/>
+              <w:sz w:val="24"/>
+              <w:szCs w:val="24"/>
+            </w:rPr>
+            <m:t>=</m:t>
+          </m:r>
+          <m:r>
+            <m:rPr>
+              <m:sty m:val="p"/>
+            </m:rPr>
+            <w:rPr>
+              <w:rFonts w:ascii="Cambria Math" w:hAnsi="Cambria Math"/>
+              <w:color w:val="auto"/>
+              <w:sz w:val="24"/>
+              <w:szCs w:val="24"/>
+            </w:rPr>
+            <m:t>η</m:t>
+          </m:r>
+          <m:d>
+            <m:dPr>
+              <m:ctrlPr>
+                <w:rPr>
+                  <w:rFonts w:ascii="Cambria Math" w:hAnsi="Cambria Math"/>
+                  <w:color w:val="auto"/>
+                  <w:sz w:val="24"/>
+                  <w:szCs w:val="24"/>
+                </w:rPr>
+              </m:ctrlPr>
+            </m:dPr>
+            <m:e>
+              <m:sSub>
+                <m:sSubPr>
+                  <m:ctrlPr>
+                    <w:rPr>
+                      <w:rFonts w:ascii="Cambria Math" w:hAnsi="Cambria Math"/>
+                      <w:i/>
+                      <w:color w:val="auto"/>
+                      <w:sz w:val="24"/>
+                      <w:szCs w:val="24"/>
+                    </w:rPr>
+                  </m:ctrlPr>
+                </m:sSubPr>
+                <m:e>
+                  <m:r>
+                    <w:rPr>
+                      <w:rFonts w:ascii="Cambria Math" w:hAnsi="Cambria Math"/>
+                      <w:color w:val="auto"/>
+                      <w:sz w:val="24"/>
+                      <w:szCs w:val="24"/>
+                    </w:rPr>
+                    <m:t>x</m:t>
+                  </m:r>
+                  <m:ctrlPr>
+                    <w:rPr>
+                      <w:rFonts w:ascii="Cambria Math" w:hAnsi="Cambria Math"/>
+                      <w:color w:val="auto"/>
+                      <w:sz w:val="24"/>
+                      <w:szCs w:val="24"/>
+                    </w:rPr>
+                  </m:ctrlPr>
+                </m:e>
+                <m:sub>
+                  <m:r>
+                    <w:rPr>
+                      <w:rFonts w:ascii="Cambria Math" w:hAnsi="Cambria Math"/>
+                      <w:color w:val="auto"/>
+                      <w:sz w:val="24"/>
+                      <w:szCs w:val="24"/>
+                    </w:rPr>
+                    <m:t>i</m:t>
+                  </m:r>
+                </m:sub>
+              </m:sSub>
+              <m:r>
+                <w:rPr>
+                  <w:rFonts w:ascii="Cambria Math" w:hAnsi="Cambria Math"/>
+                  <w:color w:val="auto"/>
+                  <w:sz w:val="24"/>
+                  <w:szCs w:val="24"/>
+                </w:rPr>
+                <m:t>-</m:t>
+              </m:r>
+              <m:sSub>
+                <m:sSubPr>
+                  <m:ctrlPr>
+                    <w:rPr>
+                      <w:rFonts w:ascii="Cambria Math" w:hAnsi="Cambria Math"/>
+                      <w:i/>
+                      <w:color w:val="auto"/>
+                      <w:sz w:val="24"/>
+                      <w:szCs w:val="24"/>
+                    </w:rPr>
+                  </m:ctrlPr>
+                </m:sSubPr>
+                <m:e>
+                  <m:r>
+                    <w:rPr>
+                      <w:rFonts w:ascii="Cambria Math" w:hAnsi="Cambria Math"/>
+                      <w:color w:val="auto"/>
+                      <w:sz w:val="24"/>
+                      <w:szCs w:val="24"/>
+                    </w:rPr>
+                    <m:t>w</m:t>
+                  </m:r>
+                </m:e>
+                <m:sub>
+                  <m:r>
+                    <w:rPr>
+                      <w:rFonts w:ascii="Cambria Math" w:hAnsi="Cambria Math"/>
+                      <w:color w:val="auto"/>
+                      <w:sz w:val="24"/>
+                      <w:szCs w:val="24"/>
+                    </w:rPr>
+                    <m:t>ji</m:t>
+                  </m:r>
+                </m:sub>
+              </m:sSub>
+              <m:ctrlPr>
+                <w:rPr>
+                  <w:rFonts w:ascii="Cambria Math" w:hAnsi="Cambria Math"/>
+                  <w:i/>
+                  <w:color w:val="auto"/>
+                  <w:sz w:val="24"/>
+                  <w:szCs w:val="24"/>
+                </w:rPr>
+              </m:ctrlPr>
+            </m:e>
+          </m:d>
+        </m:oMath>
+      </m:oMathPara>
+    </w:p>
+    <w:p>
+      <w:pPr>
+        <w:pStyle w:val="p1"/>
+        <w:jc w:val="both"/>
+        <w:rPr>
+          <w:rFonts w:ascii="Times New Roman" w:hAnsi="Times New Roman"/>
+          <w:color w:val="auto"/>
+          <w:sz w:val="24"/>
+          <w:szCs w:val="24"/>
+        </w:rPr>
+      </w:pPr>
+    </w:p>
+    <w:p>
+      <w:pPr>
+        <w:pStyle w:val="p1"/>
+        <w:jc w:val="both"/>
+        <w:rPr>
+          <w:rFonts w:ascii="Times New Roman" w:hAnsi="Times New Roman"/>
+          <w:color w:val="auto"/>
+          <w:sz w:val="24"/>
+          <w:szCs w:val="24"/>
+        </w:rPr>
+      </w:pPr>
+    </w:p>
+    <w:p>
+      <w:pPr>
+        <w:pStyle w:val="p1"/>
+        <w:jc w:val="both"/>
+        <w:rPr>
+          <w:rFonts w:ascii="Times New Roman" w:hAnsi="Times New Roman"/>
+          <w:color w:val="auto"/>
+          <w:sz w:val="24"/>
+          <w:szCs w:val="24"/>
+        </w:rPr>
+      </w:pPr>
+      <w:r>
+        <w:rPr>
+          <w:rFonts w:ascii="Times New Roman" w:hAnsi="Times New Roman"/>
+          <w:color w:val="auto"/>
+          <w:sz w:val="24"/>
+          <w:szCs w:val="24"/>
+        </w:rPr>
+        <w:t xml:space="preserve">Dans cette équation, on remarque que si la largeur du voisinage augmente la valeur de </w:t>
+      </w:r>
+      <m:oMath>
+        <m:sSub>
+          <m:sSubPr>
+            <m:ctrlPr>
+              <w:rPr>
+                <w:rFonts w:ascii="Cambria Math" w:hAnsi="Cambria Math"/>
+                <w:i/>
+                <w:color w:val="auto"/>
+                <w:sz w:val="24"/>
+                <w:szCs w:val="24"/>
+              </w:rPr>
+            </m:ctrlPr>
+          </m:sSubPr>
+          <m:e>
+            <m:r>
+              <m:rPr>
+                <m:sty m:val="p"/>
+              </m:rPr>
+              <w:rPr>
+                <w:rFonts w:ascii="Cambria Math" w:hAnsi="Cambria Math"/>
+                <w:color w:val="auto"/>
+                <w:sz w:val="24"/>
+                <w:szCs w:val="24"/>
+              </w:rPr>
+              <m:t>θ</m:t>
+            </m:r>
+            <m:ctrlPr>
+              <w:rPr>
+                <w:rFonts w:ascii="Cambria Math" w:hAnsi="Cambria Math"/>
+                <w:color w:val="auto"/>
+                <w:sz w:val="24"/>
+                <w:szCs w:val="24"/>
+              </w:rPr>
+            </m:ctrlPr>
+          </m:e>
+          <m:sub>
+            <m:r>
+              <w:rPr>
+                <w:rFonts w:ascii="Cambria Math" w:hAnsi="Cambria Math"/>
+                <w:color w:val="auto"/>
+                <w:sz w:val="24"/>
+                <w:szCs w:val="24"/>
+              </w:rPr>
+              <m:t>j</m:t>
+            </m:r>
+          </m:sub>
+        </m:sSub>
+      </m:oMath>
+      <w:r>
+        <w:rPr>
+          <w:rFonts w:ascii="Times New Roman" w:hAnsi="Times New Roman"/>
+          <w:color w:val="auto"/>
+          <w:sz w:val="24"/>
+          <w:szCs w:val="24"/>
+        </w:rPr>
+        <w:t xml:space="preserve"> </w:t>
+      </w:r>
+      <w:r>
+        <w:rPr>
+          <w:rFonts w:ascii="Times New Roman" w:hAnsi="Times New Roman"/>
+          <w:color w:val="auto"/>
+          <w:sz w:val="24"/>
+          <w:szCs w:val="24"/>
+        </w:rPr>
+        <w:t>va augmenter pour une distance donnée</w:t>
+      </w:r>
+      <w:r>
+        <w:rPr>
+          <w:rFonts w:ascii="Times New Roman" w:hAnsi="Times New Roman"/>
+          <w:color w:val="auto"/>
+          <w:sz w:val="24"/>
+          <w:szCs w:val="24"/>
+        </w:rPr>
+        <w:t xml:space="preserve"> </w:t>
+      </w:r>
+      <m:oMath>
+        <m:sSup>
+          <m:sSupPr>
+            <m:ctrlPr>
+              <w:rPr>
+                <w:rFonts w:ascii="Cambria Math" w:hAnsi="Cambria Math"/>
+                <w:color w:val="auto"/>
+                <w:sz w:val="24"/>
+                <w:szCs w:val="24"/>
+              </w:rPr>
+            </m:ctrlPr>
+          </m:sSupPr>
+          <m:e>
+            <m:d>
+              <m:dPr>
+                <m:begChr m:val="|"/>
+                <m:endChr m:val="|"/>
+                <m:ctrlPr>
+                  <w:rPr>
+                    <w:rFonts w:ascii="Cambria Math" w:hAnsi="Cambria Math"/>
+                    <w:color w:val="auto"/>
+                    <w:sz w:val="24"/>
+                    <w:szCs w:val="24"/>
+                  </w:rPr>
+                </m:ctrlPr>
+              </m:dPr>
+              <m:e>
+                <m:d>
+                  <m:dPr>
+                    <m:begChr m:val="|"/>
+                    <m:endChr m:val="|"/>
+                    <m:ctrlPr>
+                      <w:rPr>
+                        <w:rFonts w:ascii="Cambria Math" w:hAnsi="Cambria Math"/>
+                        <w:color w:val="auto"/>
+                        <w:sz w:val="24"/>
+                        <w:szCs w:val="24"/>
+                      </w:rPr>
+                    </m:ctrlPr>
+                  </m:dPr>
+                  <m:e>
+                    <m:r>
+                      <m:rPr>
+                        <m:sty m:val="p"/>
+                      </m:rPr>
+                      <w:rPr>
+                        <w:rFonts w:ascii="Cambria Math" w:hAnsi="Cambria Math"/>
+                        <w:color w:val="auto"/>
+                        <w:sz w:val="24"/>
+                        <w:szCs w:val="24"/>
+                      </w:rPr>
+                      <m:t>j-</m:t>
+                    </m:r>
+                    <m:sSup>
+                      <m:sSupPr>
+                        <m:ctrlPr>
+                          <w:rPr>
+                            <w:rFonts w:ascii="Cambria Math" w:hAnsi="Cambria Math"/>
+                            <w:color w:val="auto"/>
+                            <w:sz w:val="24"/>
+                            <w:szCs w:val="24"/>
+                          </w:rPr>
+                        </m:ctrlPr>
+                      </m:sSupPr>
+                      <m:e>
+                        <m:r>
+                          <m:rPr>
+                            <m:sty m:val="p"/>
+                          </m:rPr>
+                          <w:rPr>
+                            <w:rFonts w:ascii="Cambria Math" w:hAnsi="Cambria Math"/>
+                            <w:color w:val="auto"/>
+                            <w:sz w:val="24"/>
+                            <w:szCs w:val="24"/>
+                          </w:rPr>
+                          <m:t>j</m:t>
+                        </m:r>
+                      </m:e>
+                      <m:sup>
+                        <m:r>
+                          <m:rPr>
+                            <m:sty m:val="p"/>
+                          </m:rPr>
+                          <w:rPr>
+                            <w:rFonts w:ascii="Cambria Math" w:hAnsi="Cambria Math"/>
+                            <w:color w:val="auto"/>
+                            <w:sz w:val="24"/>
+                            <w:szCs w:val="24"/>
+                          </w:rPr>
+                          <m:t>*</m:t>
+                        </m:r>
+                      </m:sup>
+                    </m:sSup>
+                  </m:e>
+                </m:d>
+              </m:e>
+            </m:d>
+          </m:e>
+          <m:sup>
+            <m:r>
+              <m:rPr>
+                <m:sty m:val="p"/>
+              </m:rPr>
+              <w:rPr>
+                <w:rFonts w:ascii="Cambria Math" w:hAnsi="Cambria Math"/>
+                <w:color w:val="auto"/>
+                <w:sz w:val="24"/>
+                <w:szCs w:val="24"/>
+              </w:rPr>
+              <m:t>2</m:t>
+            </m:r>
+          </m:sup>
+        </m:sSup>
+      </m:oMath>
+      <w:r>
+        <w:rPr>
+          <w:rFonts w:ascii="Times New Roman" w:hAnsi="Times New Roman"/>
+          <w:color w:val="auto"/>
+          <w:sz w:val="24"/>
+          <w:szCs w:val="24"/>
+        </w:rPr>
+        <w:t xml:space="preserve">. En effet, un </w:t>
+      </w:r>
+      <m:oMath>
+        <m:r>
+          <m:rPr>
+            <m:sty m:val="p"/>
+          </m:rPr>
+          <w:rPr>
+            <w:rFonts w:ascii="Cambria Math" w:hAnsi="Cambria Math"/>
+            <w:color w:val="auto"/>
+            <w:sz w:val="24"/>
+            <w:szCs w:val="24"/>
+          </w:rPr>
+          <m:t>σ</m:t>
+        </m:r>
+      </m:oMath>
+      <w:r>
+        <w:rPr>
+          <w:rFonts w:ascii="Times New Roman" w:hAnsi="Times New Roman"/>
+          <w:color w:val="auto"/>
+          <w:sz w:val="24"/>
+          <w:szCs w:val="24"/>
+        </w:rPr>
+        <w:t xml:space="preserve"> </w:t>
+      </w:r>
+      <w:r>
+        <w:rPr>
+          <w:rFonts w:ascii="Times New Roman" w:hAnsi="Times New Roman"/>
+          <w:color w:val="auto"/>
+          <w:sz w:val="24"/>
+          <w:szCs w:val="24"/>
+        </w:rPr>
+        <w:t xml:space="preserve">plus grand rend l’exposant plus petit (car </w:t>
+      </w:r>
+      <m:oMath>
+        <m:r>
+          <m:rPr>
+            <m:sty m:val="p"/>
+          </m:rPr>
+          <w:rPr>
+            <w:rFonts w:ascii="Cambria Math" w:hAnsi="Cambria Math"/>
+            <w:color w:val="auto"/>
+            <w:sz w:val="24"/>
+            <w:szCs w:val="24"/>
+          </w:rPr>
+          <m:t>2</m:t>
+        </m:r>
+        <m:sSup>
+          <m:sSupPr>
+            <m:ctrlPr>
+              <w:rPr>
+                <w:rFonts w:ascii="Cambria Math" w:hAnsi="Cambria Math"/>
+                <w:color w:val="auto"/>
+                <w:sz w:val="24"/>
+                <w:szCs w:val="24"/>
+              </w:rPr>
+            </m:ctrlPr>
+          </m:sSupPr>
+          <m:e>
+            <m:r>
+              <m:rPr>
+                <m:sty m:val="p"/>
+              </m:rPr>
+              <w:rPr>
+                <w:rFonts w:ascii="Cambria Math" w:hAnsi="Cambria Math"/>
+                <w:color w:val="auto"/>
+                <w:sz w:val="24"/>
+                <w:szCs w:val="24"/>
+              </w:rPr>
+              <m:t>σ</m:t>
+            </m:r>
+          </m:e>
+          <m:sup>
+            <m:r>
+              <m:rPr>
+                <m:sty m:val="p"/>
+              </m:rPr>
+              <w:rPr>
+                <w:rFonts w:ascii="Cambria Math" w:hAnsi="Cambria Math"/>
+                <w:color w:val="auto"/>
+                <w:sz w:val="24"/>
+                <w:szCs w:val="24"/>
+              </w:rPr>
+              <m:t>2</m:t>
+            </m:r>
+          </m:sup>
+        </m:sSup>
+        <m:r>
+          <m:rPr>
+            <m:sty m:val="p"/>
+          </m:rPr>
+          <w:rPr>
+            <w:rFonts w:ascii="Cambria Math" w:hAnsi="Cambria Math"/>
+            <w:color w:val="auto"/>
+            <w:sz w:val="24"/>
+            <w:szCs w:val="24"/>
+          </w:rPr>
+          <m:t> </m:t>
+        </m:r>
+      </m:oMath>
+      <w:r>
+        <w:rPr>
+          <w:rFonts w:ascii="Times New Roman" w:hAnsi="Times New Roman"/>
+          <w:color w:val="auto"/>
+          <w:sz w:val="24"/>
+          <w:szCs w:val="24"/>
+        </w:rPr>
+        <w:t>est plus grand), ce qui rend l’exponentielle plus proche de 1. Cela signifie que l’influence des neurones voisins est plus importante lorsque le voisinage est large.</w:t>
+      </w:r>
+    </w:p>
+    <w:p>
+      <w:pPr>
+        <w:pStyle w:val="p1"/>
+        <w:jc w:val="both"/>
+        <w:rPr>
+          <w:rFonts w:ascii="Times New Roman" w:hAnsi="Times New Roman"/>
+          <w:color w:val="auto"/>
+          <w:sz w:val="24"/>
+          <w:szCs w:val="24"/>
+        </w:rPr>
+      </w:pPr>
+    </w:p>
+    <w:p>
+      <w:pPr>
+        <w:pStyle w:val="p1"/>
+        <w:jc w:val="both"/>
+        <w:rPr>
+          <w:rFonts w:ascii="Times New Roman" w:hAnsi="Times New Roman"/>
+          <w:color w:val="auto"/>
+          <w:sz w:val="24"/>
+          <w:szCs w:val="24"/>
+        </w:rPr>
+      </w:pPr>
+      <w:r>
+        <w:rPr>
+          <w:rFonts w:ascii="Times New Roman" w:hAnsi="Times New Roman"/>
+          <w:color w:val="auto"/>
+          <w:sz w:val="24"/>
+          <w:szCs w:val="24"/>
+        </w:rPr>
+        <w:t xml:space="preserve">Si </w:t>
+      </w:r>
+      <m:oMath>
+        <m:r>
+          <m:rPr>
+            <m:sty m:val="p"/>
+          </m:rPr>
+          <w:rPr>
+            <w:rFonts w:ascii="Cambria Math" w:hAnsi="Cambria Math"/>
+            <w:color w:val="auto"/>
+            <w:sz w:val="24"/>
+            <w:szCs w:val="24"/>
+          </w:rPr>
+          <m:t>σ</m:t>
+        </m:r>
+      </m:oMath>
+      <w:r>
+        <w:rPr>
+          <w:rFonts w:ascii="Times New Roman" w:hAnsi="Times New Roman"/>
+          <w:color w:val="auto"/>
+          <w:sz w:val="24"/>
+          <w:szCs w:val="24"/>
+        </w:rPr>
+        <w:t xml:space="preserve"> </w:t>
+      </w:r>
+      <w:r>
+        <w:rPr>
+          <w:rFonts w:ascii="Times New Roman" w:hAnsi="Times New Roman"/>
+          <w:color w:val="auto"/>
+          <w:sz w:val="24"/>
+          <w:szCs w:val="24"/>
+        </w:rPr>
+        <w:t>augmente, les voisins proches et lointains du neurone gagnant sont davantage influencés par l'entrée x, car la dispersion du facteur gaussien est plus grande, ce qui permet à un plus grand nombre de neurones d'apprendre l'entrée courante.</w:t>
+      </w:r>
+    </w:p>
+    <w:p>
+      <w:pPr>
+        <w:pStyle w:val="p1"/>
+        <w:jc w:val="both"/>
+        <w:rPr>
+          <w:rFonts w:ascii="Times New Roman" w:hAnsi="Times New Roman"/>
+          <w:i/>
+          <w:iCs/>
+          <w:color w:val="002060"/>
+          <w:sz w:val="24"/>
+          <w:szCs w:val="24"/>
+        </w:rPr>
+      </w:pPr>
+    </w:p>
+    <w:p>
+      <w:pPr>
+        <w:pStyle w:val="p1"/>
+        <w:jc w:val="both"/>
+        <w:rPr>
+          <w:rFonts w:ascii="Times New Roman" w:hAnsi="Times New Roman"/>
+          <w:i/>
+          <w:iCs/>
+          <w:color w:val="002060"/>
+          <w:sz w:val="24"/>
+          <w:szCs w:val="24"/>
+        </w:rPr>
+      </w:pPr>
+    </w:p>
+    <w:p>
+      <w:pPr>
+        <w:pStyle w:val="p1"/>
+        <w:jc w:val="both"/>
+        <w:rPr>
+          <w:rFonts w:ascii="Times New Roman" w:hAnsi="Times New Roman"/>
+          <w:i/>
+          <w:iCs/>
+          <w:color w:val="002060"/>
+          <w:sz w:val="24"/>
+          <w:szCs w:val="24"/>
+        </w:rPr>
+      </w:pPr>
+    </w:p>
+    <w:p>
+      <w:pPr>
+        <w:pStyle w:val="p1"/>
+        <w:jc w:val="both"/>
+        <w:rPr>
+          <w:rFonts w:ascii="Times New Roman" w:hAnsi="Times New Roman"/>
+          <w:i/>
+          <w:iCs/>
+          <w:color w:val="002060"/>
+          <w:sz w:val="24"/>
+          <w:szCs w:val="24"/>
+        </w:rPr>
+      </w:pPr>
+    </w:p>
+    <w:p>
+      <w:pPr>
+        <w:pStyle w:val="p1"/>
+        <w:jc w:val="both"/>
+        <w:rPr>
+          <w:rFonts w:ascii="Times New Roman" w:hAnsi="Times New Roman"/>
+          <w:i/>
+          <w:iCs/>
+          <w:color w:val="002060"/>
+          <w:sz w:val="24"/>
+          <w:szCs w:val="24"/>
+        </w:rPr>
+      </w:pPr>
+    </w:p>
+    <w:p>
+      <w:pPr>
+        <w:pStyle w:val="p1"/>
+        <w:jc w:val="both"/>
+        <w:rPr>
+          <w:rFonts w:ascii="Times New Roman" w:hAnsi="Times New Roman"/>
+          <w:i/>
+          <w:iCs/>
+          <w:color w:val="002060"/>
+          <w:sz w:val="24"/>
+          <w:szCs w:val="24"/>
+        </w:rPr>
+      </w:pPr>
+    </w:p>
+    <w:p>
+      <w:pPr>
+        <w:pStyle w:val="p1"/>
+        <w:jc w:val="both"/>
+        <w:rPr>
+          <w:rFonts w:ascii="Times New Roman" w:hAnsi="Times New Roman"/>
+          <w:i/>
+          <w:iCs/>
+          <w:color w:val="002060"/>
+          <w:sz w:val="24"/>
+          <w:szCs w:val="24"/>
+        </w:rPr>
+      </w:pPr>
+    </w:p>
+    <w:p>
+      <w:pPr>
+        <w:jc w:val="both"/>
+        <w:rPr>
+          <w:i/>
+          <w:iCs/>
+          <w:color w:val="002060"/>
+        </w:rPr>
+      </w:pPr>
+      <w:r>
+        <w:rPr>
+          <w:i/>
+          <w:iCs/>
+          <w:color w:val="002060"/>
+        </w:rPr>
+        <w:lastRenderedPageBreak/>
+        <w:t>Si σ est plus grand, `a convergence, l’auto-organisation obtenue sera-t-elle donc plus</w:t>
+      </w:r>
+      <w:r>
+        <w:rPr>
+          <w:i/>
+          <w:iCs/>
+          <w:color w:val="002060"/>
+        </w:rPr>
+        <w:t xml:space="preserve"> </w:t>
+      </w:r>
+      <w:r>
+        <w:rPr>
+          <w:i/>
+          <w:iCs/>
+          <w:color w:val="002060"/>
+        </w:rPr>
+        <w:t>“resserr</w:t>
+      </w:r>
+      <w:r>
+        <w:rPr>
+          <w:i/>
+          <w:iCs/>
+          <w:color w:val="002060"/>
+        </w:rPr>
+        <w:t>é</w:t>
+      </w:r>
+      <w:r>
+        <w:rPr>
+          <w:i/>
+          <w:iCs/>
+          <w:color w:val="002060"/>
+        </w:rPr>
+        <w:t>e”</w:t>
+      </w:r>
+      <w:r>
+        <w:rPr>
+          <w:i/>
+          <w:iCs/>
+          <w:color w:val="002060"/>
+        </w:rPr>
+        <w:t xml:space="preserve"> </w:t>
+      </w:r>
+      <w:r>
+        <w:rPr>
+          <w:i/>
+          <w:iCs/>
+          <w:color w:val="002060"/>
+        </w:rPr>
+        <w:t>ou plus “l</w:t>
+      </w:r>
+      <w:r>
+        <w:rPr>
+          <w:i/>
+          <w:iCs/>
+          <w:color w:val="002060"/>
+        </w:rPr>
+        <w:t>â</w:t>
+      </w:r>
+      <w:r>
+        <w:rPr>
+          <w:i/>
+          <w:iCs/>
+          <w:color w:val="002060"/>
+        </w:rPr>
+        <w:t>che” ?</w:t>
+      </w:r>
+    </w:p>
+    <w:p>
+      <w:pPr>
+        <w:pStyle w:val="p1"/>
+        <w:jc w:val="both"/>
+        <w:rPr>
+          <w:rFonts w:ascii="Times New Roman" w:hAnsi="Times New Roman"/>
+          <w:i/>
+          <w:iCs/>
+          <w:color w:val="002060"/>
+          <w:sz w:val="24"/>
+          <w:szCs w:val="24"/>
+        </w:rPr>
+      </w:pPr>
+    </w:p>
+    <w:p>
+      <w:pPr>
+        <w:pStyle w:val="p1"/>
+        <w:jc w:val="both"/>
+        <w:rPr>
+          <w:rFonts w:ascii="Times New Roman" w:hAnsi="Times New Roman"/>
+          <w:color w:val="auto"/>
+          <w:sz w:val="24"/>
+          <w:szCs w:val="24"/>
+        </w:rPr>
+      </w:pPr>
+      <w:r>
+        <w:rPr>
+          <w:rFonts w:ascii="Times New Roman" w:hAnsi="Times New Roman"/>
+          <w:color w:val="auto"/>
+          <w:sz w:val="24"/>
+          <w:szCs w:val="24"/>
+        </w:rPr>
+        <w:t xml:space="preserve">Lorsque σ est grand, tous les neurones, qu’ils soient proches ou éloignés du neurone gagnant, sont fortement influencés par chaque entrée. Cela crée un effet de lissage : les poids des neurones tendent à devenir similaires. </w:t>
+      </w:r>
+    </w:p>
+    <w:p>
+      <w:pPr>
+        <w:pStyle w:val="p1"/>
+        <w:jc w:val="both"/>
+        <w:rPr>
+          <w:rFonts w:ascii="Times New Roman" w:hAnsi="Times New Roman"/>
+          <w:color w:val="auto"/>
+          <w:sz w:val="24"/>
+          <w:szCs w:val="24"/>
+        </w:rPr>
+      </w:pPr>
+      <w:r>
+        <w:rPr>
+          <w:rFonts w:ascii="Times New Roman" w:hAnsi="Times New Roman"/>
+          <w:color w:val="auto"/>
+          <w:sz w:val="24"/>
+          <w:szCs w:val="24"/>
+        </w:rPr>
+        <w:t>À la fin de l’apprentissage, les différences entre les neurones voisins sont faibles. On parle alors d’une carte "lâche", qui couvre l’espace d’entrée de manière plus uniforme, mais avec une capacité limitée à distinguer les détails fins.</w:t>
+      </w:r>
+    </w:p>
+    <w:p>
+      <w:pPr>
+        <w:pStyle w:val="p1"/>
+        <w:jc w:val="both"/>
+        <w:rPr>
+          <w:rFonts w:ascii="Times New Roman" w:hAnsi="Times New Roman"/>
+          <w:color w:val="auto"/>
+          <w:sz w:val="24"/>
+          <w:szCs w:val="24"/>
+        </w:rPr>
+      </w:pPr>
+    </w:p>
+    <w:p>
+      <w:pPr>
+        <w:pStyle w:val="p1"/>
+        <w:jc w:val="both"/>
+        <w:rPr>
+          <w:rFonts w:ascii="Times New Roman" w:hAnsi="Times New Roman"/>
+          <w:color w:val="auto"/>
+          <w:sz w:val="24"/>
+          <w:szCs w:val="24"/>
+        </w:rPr>
+      </w:pPr>
+      <w:r>
+        <w:rPr>
+          <w:rFonts w:ascii="Times New Roman" w:hAnsi="Times New Roman"/>
+          <w:color w:val="auto"/>
+          <w:sz w:val="24"/>
+          <w:szCs w:val="24"/>
+        </w:rPr>
+        <w:t>À l’inverse, quand σ est petit, seuls les neurones très proches du gagnant participent réellement</w:t>
+      </w:r>
+      <w:r>
+        <w:rPr>
+          <w:rFonts w:ascii="Times New Roman" w:hAnsi="Times New Roman"/>
+          <w:color w:val="auto"/>
+          <w:sz w:val="24"/>
+          <w:szCs w:val="24"/>
+        </w:rPr>
+        <w:t xml:space="preserve"> </w:t>
+      </w:r>
+      <w:r>
+        <w:rPr>
+          <w:rFonts w:ascii="Times New Roman" w:hAnsi="Times New Roman"/>
+          <w:color w:val="auto"/>
+          <w:sz w:val="24"/>
+          <w:szCs w:val="24"/>
+        </w:rPr>
+        <w:t xml:space="preserve">à l’apprentissage. Cela conduit à une forte spécialisation : chaque neurone ajuste ses poids pour représenter une petite zone précise de l’espace d’entrée. </w:t>
+      </w:r>
+    </w:p>
+    <w:p>
+      <w:pPr>
+        <w:pStyle w:val="p1"/>
+        <w:jc w:val="both"/>
+        <w:rPr>
+          <w:rFonts w:ascii="Times New Roman" w:hAnsi="Times New Roman"/>
+          <w:color w:val="auto"/>
+          <w:sz w:val="24"/>
+          <w:szCs w:val="24"/>
+        </w:rPr>
+      </w:pPr>
+      <w:r>
+        <w:rPr>
+          <w:rFonts w:ascii="Times New Roman" w:hAnsi="Times New Roman"/>
+          <w:color w:val="auto"/>
+          <w:sz w:val="24"/>
+          <w:szCs w:val="24"/>
+        </w:rPr>
+        <w:t>La carte devient alors "resserrée", avec des différences marquées entre les neurones voisins, ce qui lui permet de mieux capter les structures locales et de différencier plus finement les données.</w:t>
+      </w:r>
+    </w:p>
+    <w:p>
+      <w:pPr>
+        <w:pStyle w:val="p1"/>
+        <w:jc w:val="both"/>
+        <w:rPr>
+          <w:rFonts w:ascii="Times New Roman" w:hAnsi="Times New Roman"/>
+          <w:color w:val="auto"/>
+          <w:sz w:val="24"/>
+          <w:szCs w:val="24"/>
+        </w:rPr>
+      </w:pPr>
+    </w:p>
+    <w:p>
+      <w:pPr>
+        <w:pStyle w:val="p1"/>
+        <w:jc w:val="both"/>
+        <w:rPr>
+          <w:rFonts w:ascii="Times New Roman" w:hAnsi="Times New Roman"/>
+          <w:color w:val="auto"/>
+          <w:sz w:val="24"/>
+          <w:szCs w:val="24"/>
+        </w:rPr>
+      </w:pPr>
+      <w:r>
+        <w:rPr>
+          <w:rFonts w:ascii="Times New Roman" w:hAnsi="Times New Roman"/>
+          <w:color w:val="auto"/>
+          <w:sz w:val="24"/>
+          <w:szCs w:val="24"/>
+        </w:rPr>
+        <w:t xml:space="preserve">D’un point de vue mathématique, un σ élevé entraîne un recouvrement plus large des zones d’influence, ce qui fait que plusieurs neurones apprennent pour une même entrée, au détriment de la précision. </w:t>
+      </w:r>
+    </w:p>
+    <w:p>
+      <w:pPr>
+        <w:pStyle w:val="p1"/>
+        <w:jc w:val="both"/>
+        <w:rPr>
+          <w:rFonts w:ascii="Times New Roman" w:hAnsi="Times New Roman"/>
+          <w:color w:val="auto"/>
+          <w:sz w:val="24"/>
+          <w:szCs w:val="24"/>
+        </w:rPr>
+      </w:pPr>
+      <w:r>
+        <w:rPr>
+          <w:rFonts w:ascii="Times New Roman" w:hAnsi="Times New Roman"/>
+          <w:color w:val="auto"/>
+          <w:sz w:val="24"/>
+          <w:szCs w:val="24"/>
+        </w:rPr>
+        <w:t>À l’inverse, un σ faible concentre l’apprentissage autour du neurone gagnant, ce qui favorise une meilleure représentation des détails de l’espace d’entrée.</w:t>
+      </w:r>
+    </w:p>
+    <w:p>
+      <w:pPr>
+        <w:pStyle w:val="p1"/>
+        <w:jc w:val="both"/>
+        <w:rPr>
+          <w:rFonts w:ascii="Times New Roman" w:hAnsi="Times New Roman"/>
+          <w:i/>
+          <w:iCs/>
+          <w:color w:val="002060"/>
+          <w:sz w:val="24"/>
+          <w:szCs w:val="24"/>
+        </w:rPr>
+      </w:pPr>
+    </w:p>
+    <w:p>
+      <w:pPr>
+        <w:pStyle w:val="p1"/>
+        <w:jc w:val="both"/>
+        <w:rPr>
+          <w:rFonts w:ascii="Times New Roman" w:hAnsi="Times New Roman"/>
+          <w:i/>
+          <w:iCs/>
+          <w:color w:val="002060"/>
+          <w:sz w:val="24"/>
+          <w:szCs w:val="24"/>
+        </w:rPr>
+      </w:pPr>
+    </w:p>
+    <w:p>
+      <w:pPr>
+        <w:pStyle w:val="p1"/>
+        <w:jc w:val="both"/>
+        <w:rPr>
+          <w:rFonts w:ascii="Times New Roman" w:hAnsi="Times New Roman"/>
+          <w:i/>
+          <w:iCs/>
+          <w:color w:val="002060"/>
+          <w:sz w:val="24"/>
+          <w:szCs w:val="24"/>
+        </w:rPr>
+      </w:pPr>
+    </w:p>
+    <w:p>
+      <w:pPr>
+        <w:pStyle w:val="p1"/>
+        <w:jc w:val="both"/>
+        <w:rPr>
+          <w:rFonts w:ascii="Times New Roman" w:hAnsi="Times New Roman"/>
+          <w:i/>
+          <w:iCs/>
+          <w:color w:val="002060"/>
+          <w:sz w:val="24"/>
+          <w:szCs w:val="24"/>
+        </w:rPr>
+      </w:pPr>
+    </w:p>
+    <w:p>
+      <w:pPr>
+        <w:jc w:val="both"/>
+        <w:rPr>
+          <w:i/>
+          <w:iCs/>
+          <w:color w:val="002060"/>
+        </w:rPr>
+      </w:pPr>
+      <w:r>
+        <w:rPr>
+          <w:i/>
+          <w:iCs/>
+          <w:color w:val="002060"/>
+        </w:rPr>
+        <w:t>Quelle mesure</w:t>
+      </w:r>
+      <w:r>
+        <w:rPr>
+          <w:i/>
+          <w:iCs/>
+          <w:color w:val="002060"/>
+        </w:rPr>
+        <w:t xml:space="preserve"> </w:t>
+      </w:r>
+      <w:r>
+        <w:rPr>
+          <w:i/>
+          <w:iCs/>
+          <w:color w:val="002060"/>
+        </w:rPr>
+        <w:t>pourrait quantifier ce</w:t>
+      </w:r>
+      <w:r>
+        <w:rPr>
+          <w:i/>
+          <w:iCs/>
+          <w:color w:val="002060"/>
+        </w:rPr>
+        <w:t xml:space="preserve"> </w:t>
+      </w:r>
+      <w:r>
+        <w:rPr>
+          <w:i/>
+          <w:iCs/>
+          <w:color w:val="002060"/>
+        </w:rPr>
+        <w:t>ph</w:t>
+      </w:r>
+      <w:r>
+        <w:rPr>
+          <w:i/>
+          <w:iCs/>
+          <w:color w:val="002060"/>
+        </w:rPr>
+        <w:t>é</w:t>
+      </w:r>
+      <w:r>
+        <w:rPr>
+          <w:i/>
+          <w:iCs/>
+          <w:color w:val="002060"/>
+        </w:rPr>
+        <w:t>nom</w:t>
+      </w:r>
+      <w:r>
+        <w:rPr>
+          <w:i/>
+          <w:iCs/>
+          <w:color w:val="002060"/>
+        </w:rPr>
+        <w:t>è</w:t>
+      </w:r>
+      <w:r>
+        <w:rPr>
+          <w:i/>
+          <w:iCs/>
+          <w:color w:val="002060"/>
+        </w:rPr>
+        <w:t>ne et donc mesurer l’influence de σ sur le comportement de l’algorithme ?</w:t>
+      </w:r>
+    </w:p>
+    <w:p>
+      <w:pPr>
+        <w:pStyle w:val="p1"/>
         <w:rPr>
           <w:rFonts w:ascii="Times New Roman" w:hAnsi="Times New Roman"/>
           <w:b/>
@@ -3995,23 +7135,13 @@
           <w:sz w:val="26"/>
           <w:szCs w:val="26"/>
         </w:rPr>
-        <w:t>σ</w:t>
-      </w:r>
-    </w:p>
-    <w:p>
-      <w:pPr>
-        <w:pStyle w:val="Titre2"/>
-        <w:rPr>
-          <w:rFonts w:ascii="Times New Roman" w:hAnsi="Times New Roman" w:cs="Times New Roman"/>
-          <w:b/>
-          <w:bCs/>
-          <w:color w:val="000000" w:themeColor="text1"/>
-        </w:rPr>
-      </w:pPr>
-    </w:p>
-    <w:p>
-      <w:pPr>
-        <w:rPr>
+      </w:pPr>
+    </w:p>
+    <w:p>
+      <w:pPr>
+        <w:pStyle w:val="p1"/>
+        <w:rPr>
+          <w:rFonts w:ascii="Times New Roman" w:hAnsi="Times New Roman"/>
           <w:b/>
           <w:bCs/>
           <w:color w:val="000000" w:themeColor="text1"/>
@@ -4019,16 +7149,283 @@
           <w:szCs w:val="26"/>
         </w:rPr>
       </w:pPr>
-      <w:r>
-        <w:rPr>
+    </w:p>
+    <w:p>
+      <w:pPr>
+        <w:pStyle w:val="p1"/>
+        <w:rPr>
+          <w:rFonts w:ascii="Times New Roman" w:hAnsi="Times New Roman"/>
           <w:b/>
           <w:bCs/>
           <w:color w:val="000000" w:themeColor="text1"/>
           <w:sz w:val="26"/>
           <w:szCs w:val="26"/>
         </w:rPr>
+      </w:pPr>
+    </w:p>
+    <w:p>
+      <w:pPr>
+        <w:pStyle w:val="p1"/>
+        <w:rPr>
+          <w:rFonts w:ascii="Times New Roman" w:hAnsi="Times New Roman"/>
+          <w:b/>
+          <w:bCs/>
+          <w:color w:val="000000" w:themeColor="text1"/>
+          <w:sz w:val="26"/>
+          <w:szCs w:val="26"/>
+        </w:rPr>
+      </w:pPr>
+    </w:p>
+    <w:p>
+      <w:pPr>
+        <w:pStyle w:val="p1"/>
+        <w:rPr>
+          <w:rFonts w:ascii="Times New Roman" w:hAnsi="Times New Roman"/>
+          <w:b/>
+          <w:bCs/>
+          <w:color w:val="000000" w:themeColor="text1"/>
+          <w:sz w:val="26"/>
+          <w:szCs w:val="26"/>
+        </w:rPr>
+      </w:pPr>
+    </w:p>
+    <w:p>
+      <w:pPr>
+        <w:pStyle w:val="p1"/>
+        <w:rPr>
+          <w:rFonts w:ascii="Times New Roman" w:hAnsi="Times New Roman"/>
+          <w:b/>
+          <w:bCs/>
+          <w:color w:val="000000" w:themeColor="text1"/>
+          <w:sz w:val="26"/>
+          <w:szCs w:val="26"/>
+        </w:rPr>
+      </w:pPr>
+    </w:p>
+    <w:p>
+      <w:pPr>
+        <w:pStyle w:val="p1"/>
+        <w:rPr>
+          <w:rFonts w:ascii="Times New Roman" w:hAnsi="Times New Roman"/>
+          <w:b/>
+          <w:bCs/>
+          <w:color w:val="000000" w:themeColor="text1"/>
+          <w:sz w:val="26"/>
+          <w:szCs w:val="26"/>
+        </w:rPr>
+      </w:pPr>
+    </w:p>
+    <w:p>
+      <w:pPr>
+        <w:pStyle w:val="p1"/>
+        <w:rPr>
+          <w:rFonts w:ascii="Times New Roman" w:hAnsi="Times New Roman"/>
+          <w:b/>
+          <w:bCs/>
+          <w:color w:val="000000" w:themeColor="text1"/>
+          <w:sz w:val="26"/>
+          <w:szCs w:val="26"/>
+        </w:rPr>
+      </w:pPr>
+    </w:p>
+    <w:p>
+      <w:pPr>
+        <w:pStyle w:val="p1"/>
+        <w:rPr>
+          <w:rFonts w:ascii="Times New Roman" w:hAnsi="Times New Roman"/>
+          <w:b/>
+          <w:bCs/>
+          <w:color w:val="000000" w:themeColor="text1"/>
+          <w:sz w:val="26"/>
+          <w:szCs w:val="26"/>
+        </w:rPr>
+      </w:pPr>
+    </w:p>
+    <w:p>
+      <w:pPr>
+        <w:pStyle w:val="p1"/>
+        <w:rPr>
+          <w:rFonts w:ascii="Times New Roman" w:hAnsi="Times New Roman"/>
+          <w:b/>
+          <w:bCs/>
+          <w:color w:val="000000" w:themeColor="text1"/>
+          <w:sz w:val="26"/>
+          <w:szCs w:val="26"/>
+        </w:rPr>
+      </w:pPr>
+    </w:p>
+    <w:p>
+      <w:pPr>
+        <w:pStyle w:val="p1"/>
+        <w:rPr>
+          <w:rFonts w:ascii="Times New Roman" w:hAnsi="Times New Roman"/>
+          <w:b/>
+          <w:bCs/>
+          <w:color w:val="000000" w:themeColor="text1"/>
+          <w:sz w:val="26"/>
+          <w:szCs w:val="26"/>
+        </w:rPr>
+      </w:pPr>
+    </w:p>
+    <w:p>
+      <w:pPr>
+        <w:pStyle w:val="p1"/>
+        <w:rPr>
+          <w:rFonts w:ascii="Times New Roman" w:hAnsi="Times New Roman"/>
+          <w:b/>
+          <w:bCs/>
+          <w:color w:val="000000" w:themeColor="text1"/>
+          <w:sz w:val="26"/>
+          <w:szCs w:val="26"/>
+        </w:rPr>
+      </w:pPr>
+    </w:p>
+    <w:p>
+      <w:pPr>
+        <w:pStyle w:val="p1"/>
+        <w:rPr>
+          <w:rFonts w:ascii="Times New Roman" w:hAnsi="Times New Roman"/>
+          <w:b/>
+          <w:bCs/>
+          <w:color w:val="000000" w:themeColor="text1"/>
+          <w:sz w:val="26"/>
+          <w:szCs w:val="26"/>
+        </w:rPr>
+      </w:pPr>
+    </w:p>
+    <w:p>
+      <w:pPr>
+        <w:pStyle w:val="p1"/>
+        <w:rPr>
+          <w:rFonts w:ascii="Times New Roman" w:hAnsi="Times New Roman"/>
+          <w:b/>
+          <w:bCs/>
+          <w:color w:val="000000" w:themeColor="text1"/>
+          <w:sz w:val="26"/>
+          <w:szCs w:val="26"/>
+        </w:rPr>
+      </w:pPr>
+    </w:p>
+    <w:p>
+      <w:pPr>
+        <w:pStyle w:val="p1"/>
+        <w:rPr>
+          <w:rFonts w:ascii="Times New Roman" w:hAnsi="Times New Roman"/>
+          <w:b/>
+          <w:bCs/>
+          <w:color w:val="000000" w:themeColor="text1"/>
+          <w:sz w:val="26"/>
+          <w:szCs w:val="26"/>
+        </w:rPr>
+      </w:pPr>
+    </w:p>
+    <w:p>
+      <w:pPr>
+        <w:pStyle w:val="p1"/>
+        <w:rPr>
+          <w:rFonts w:ascii="Times New Roman" w:hAnsi="Times New Roman"/>
+          <w:b/>
+          <w:bCs/>
+          <w:color w:val="000000" w:themeColor="text1"/>
+          <w:sz w:val="26"/>
+          <w:szCs w:val="26"/>
+        </w:rPr>
+      </w:pPr>
+    </w:p>
+    <w:p>
+      <w:pPr>
+        <w:pStyle w:val="p1"/>
+        <w:rPr>
+          <w:rFonts w:ascii="Times New Roman" w:hAnsi="Times New Roman"/>
+          <w:b/>
+          <w:bCs/>
+          <w:color w:val="000000" w:themeColor="text1"/>
+          <w:sz w:val="26"/>
+          <w:szCs w:val="26"/>
+        </w:rPr>
+      </w:pPr>
+    </w:p>
+    <w:p>
+      <w:pPr>
+        <w:pStyle w:val="p1"/>
+        <w:rPr>
+          <w:rFonts w:ascii="Times New Roman" w:hAnsi="Times New Roman"/>
+          <w:b/>
+          <w:bCs/>
+          <w:color w:val="000000" w:themeColor="text1"/>
+          <w:sz w:val="26"/>
+          <w:szCs w:val="26"/>
+        </w:rPr>
+      </w:pPr>
+    </w:p>
+    <w:p>
+      <w:pPr>
+        <w:pStyle w:val="p1"/>
+        <w:rPr>
+          <w:rFonts w:ascii="Times New Roman" w:hAnsi="Times New Roman"/>
+          <w:b/>
+          <w:bCs/>
+          <w:color w:val="000000" w:themeColor="text1"/>
+          <w:sz w:val="26"/>
+          <w:szCs w:val="26"/>
+        </w:rPr>
+      </w:pPr>
+    </w:p>
+    <w:p>
+      <w:pPr>
+        <w:pStyle w:val="p1"/>
+        <w:rPr>
+          <w:rFonts w:ascii="Times New Roman" w:hAnsi="Times New Roman"/>
+          <w:b/>
+          <w:bCs/>
+          <w:color w:val="000000" w:themeColor="text1"/>
+          <w:sz w:val="26"/>
+          <w:szCs w:val="26"/>
+        </w:rPr>
+      </w:pPr>
+    </w:p>
+    <w:p>
+      <w:pPr>
+        <w:pStyle w:val="p1"/>
+        <w:rPr>
+          <w:sz w:val="18"/>
+          <w:szCs w:val="18"/>
+        </w:rPr>
+      </w:pPr>
+    </w:p>
+    <w:p>
+      <w:pPr>
+        <w:rPr>
+          <w:b/>
+          <w:bCs/>
+          <w:color w:val="000000" w:themeColor="text1"/>
+          <w:sz w:val="26"/>
+          <w:szCs w:val="26"/>
+        </w:rPr>
+      </w:pPr>
+    </w:p>
+    <w:p>
+      <w:pPr>
+        <w:pStyle w:val="Titre2"/>
+        <w:rPr>
+          <w:rFonts w:ascii="Times New Roman" w:hAnsi="Times New Roman" w:cs="Times New Roman"/>
+          <w:b/>
+          <w:bCs/>
+          <w:color w:val="000000" w:themeColor="text1"/>
+        </w:rPr>
+      </w:pPr>
+      <w:bookmarkStart w:id="3" w:name="_Toc196318707"/>
+      <w:r>
+        <w:rPr>
+          <w:rFonts w:ascii="Times New Roman" w:hAnsi="Times New Roman" w:cs="Times New Roman"/>
+          <w:b/>
+          <w:bCs/>
+          <w:color w:val="000000" w:themeColor="text1"/>
+        </w:rPr>
+        <w:lastRenderedPageBreak/>
         <w:t>Influence de la distribution d’entrée</w:t>
       </w:r>
+      <w:bookmarkEnd w:id="3"/>
     </w:p>
     <w:p/>
     <w:p>
@@ -4980,32 +8377,32 @@
           <w:iCs/>
           <w:color w:val="002060"/>
         </w:rPr>
+        <w:t>Reconsid</w:t>
+      </w:r>
+      <w:r>
+        <w:rPr>
+          <w:i/>
+          <w:iCs/>
+          <w:color w:val="002060"/>
+        </w:rPr>
+        <w:t>é</w:t>
+      </w:r>
+      <w:r>
+        <w:rPr>
+          <w:i/>
+          <w:iCs/>
+          <w:color w:val="002060"/>
+        </w:rPr>
+        <w:t>rons maintenant le cas d’une carte avec plusieurs neurones en se focalisant sur un neurone quelconque. Quels exemples apprend ce neurone et avec quelle “force” ?</w:t>
+      </w:r>
+    </w:p>
+    <w:p/>
+    <w:p>
+      <w:pPr>
+        <w:jc w:val="both"/>
+      </w:pPr>
+      <w:r>
         <w:lastRenderedPageBreak/>
-        <w:t>Reconsid</w:t>
-      </w:r>
-      <w:r>
-        <w:rPr>
-          <w:i/>
-          <w:iCs/>
-          <w:color w:val="002060"/>
-        </w:rPr>
-        <w:t>é</w:t>
-      </w:r>
-      <w:r>
-        <w:rPr>
-          <w:i/>
-          <w:iCs/>
-          <w:color w:val="002060"/>
-        </w:rPr>
-        <w:t>rons maintenant le cas d’une carte avec plusieurs neurones en se focalisant sur un neurone quelconque. Quels exemples apprend ce neurone et avec quelle “force” ?</w:t>
-      </w:r>
-    </w:p>
-    <w:p/>
-    <w:p>
-      <w:pPr>
-        <w:jc w:val="both"/>
-      </w:pPr>
-      <w:r>
         <w:t>À chaque fois qu’une entrée est présentée, on calcule quel neurone est le plus proche de l’entrée</w:t>
       </w:r>
       <w:r>
@@ -6664,6 +10061,202 @@
     <w:basedOn w:val="Policepardfaut"/>
     <w:rsid w:val="00A977F3"/>
   </w:style>
+  <w:style w:type="paragraph" w:styleId="En-ttedetabledesmatires">
+    <w:name w:val="TOC Heading"/>
+    <w:basedOn w:val="Titre1"/>
+    <w:next w:val="Normal"/>
+    <w:uiPriority w:val="39"/>
+    <w:unhideWhenUsed/>
+    <w:qFormat/>
+    <w:rsid w:val="001C4327"/>
+    <w:pPr>
+      <w:spacing w:before="480" w:line="276" w:lineRule="auto"/>
+      <w:outlineLvl w:val="9"/>
+    </w:pPr>
+    <w:rPr>
+      <w:b/>
+      <w:bCs/>
+      <w:sz w:val="28"/>
+      <w:szCs w:val="28"/>
+    </w:rPr>
+  </w:style>
+  <w:style w:type="paragraph" w:styleId="TM1">
+    <w:name w:val="toc 1"/>
+    <w:basedOn w:val="Normal"/>
+    <w:next w:val="Normal"/>
+    <w:autoRedefine/>
+    <w:uiPriority w:val="39"/>
+    <w:unhideWhenUsed/>
+    <w:rsid w:val="001C4327"/>
+    <w:pPr>
+      <w:spacing w:before="120" w:after="120"/>
+    </w:pPr>
+    <w:rPr>
+      <w:rFonts w:asciiTheme="minorHAnsi" w:hAnsiTheme="minorHAnsi" w:cstheme="minorHAnsi"/>
+      <w:b/>
+      <w:bCs/>
+      <w:caps/>
+      <w:sz w:val="20"/>
+      <w:szCs w:val="20"/>
+    </w:rPr>
+  </w:style>
+  <w:style w:type="paragraph" w:styleId="TM2">
+    <w:name w:val="toc 2"/>
+    <w:basedOn w:val="Normal"/>
+    <w:next w:val="Normal"/>
+    <w:autoRedefine/>
+    <w:uiPriority w:val="39"/>
+    <w:unhideWhenUsed/>
+    <w:rsid w:val="001C4327"/>
+    <w:pPr>
+      <w:ind w:left="240"/>
+    </w:pPr>
+    <w:rPr>
+      <w:rFonts w:asciiTheme="minorHAnsi" w:hAnsiTheme="minorHAnsi" w:cstheme="minorHAnsi"/>
+      <w:smallCaps/>
+      <w:sz w:val="20"/>
+      <w:szCs w:val="20"/>
+    </w:rPr>
+  </w:style>
+  <w:style w:type="character" w:styleId="Lienhypertexte">
+    <w:name w:val="Hyperlink"/>
+    <w:basedOn w:val="Policepardfaut"/>
+    <w:uiPriority w:val="99"/>
+    <w:unhideWhenUsed/>
+    <w:rsid w:val="001C4327"/>
+    <w:rPr>
+      <w:color w:val="0563C1" w:themeColor="hyperlink"/>
+      <w:u w:val="single"/>
+    </w:rPr>
+  </w:style>
+  <w:style w:type="paragraph" w:styleId="TM3">
+    <w:name w:val="toc 3"/>
+    <w:basedOn w:val="Normal"/>
+    <w:next w:val="Normal"/>
+    <w:autoRedefine/>
+    <w:uiPriority w:val="39"/>
+    <w:semiHidden/>
+    <w:unhideWhenUsed/>
+    <w:rsid w:val="001C4327"/>
+    <w:pPr>
+      <w:ind w:left="480"/>
+    </w:pPr>
+    <w:rPr>
+      <w:rFonts w:asciiTheme="minorHAnsi" w:hAnsiTheme="minorHAnsi" w:cstheme="minorHAnsi"/>
+      <w:i/>
+      <w:iCs/>
+      <w:sz w:val="20"/>
+      <w:szCs w:val="20"/>
+    </w:rPr>
+  </w:style>
+  <w:style w:type="paragraph" w:styleId="TM4">
+    <w:name w:val="toc 4"/>
+    <w:basedOn w:val="Normal"/>
+    <w:next w:val="Normal"/>
+    <w:autoRedefine/>
+    <w:uiPriority w:val="39"/>
+    <w:semiHidden/>
+    <w:unhideWhenUsed/>
+    <w:rsid w:val="001C4327"/>
+    <w:pPr>
+      <w:ind w:left="720"/>
+    </w:pPr>
+    <w:rPr>
+      <w:rFonts w:asciiTheme="minorHAnsi" w:hAnsiTheme="minorHAnsi" w:cstheme="minorHAnsi"/>
+      <w:sz w:val="18"/>
+      <w:szCs w:val="18"/>
+    </w:rPr>
+  </w:style>
+  <w:style w:type="paragraph" w:styleId="TM5">
+    <w:name w:val="toc 5"/>
+    <w:basedOn w:val="Normal"/>
+    <w:next w:val="Normal"/>
+    <w:autoRedefine/>
+    <w:uiPriority w:val="39"/>
+    <w:semiHidden/>
+    <w:unhideWhenUsed/>
+    <w:rsid w:val="001C4327"/>
+    <w:pPr>
+      <w:ind w:left="960"/>
+    </w:pPr>
+    <w:rPr>
+      <w:rFonts w:asciiTheme="minorHAnsi" w:hAnsiTheme="minorHAnsi" w:cstheme="minorHAnsi"/>
+      <w:sz w:val="18"/>
+      <w:szCs w:val="18"/>
+    </w:rPr>
+  </w:style>
+  <w:style w:type="paragraph" w:styleId="TM6">
+    <w:name w:val="toc 6"/>
+    <w:basedOn w:val="Normal"/>
+    <w:next w:val="Normal"/>
+    <w:autoRedefine/>
+    <w:uiPriority w:val="39"/>
+    <w:semiHidden/>
+    <w:unhideWhenUsed/>
+    <w:rsid w:val="001C4327"/>
+    <w:pPr>
+      <w:ind w:left="1200"/>
+    </w:pPr>
+    <w:rPr>
+      <w:rFonts w:asciiTheme="minorHAnsi" w:hAnsiTheme="minorHAnsi" w:cstheme="minorHAnsi"/>
+      <w:sz w:val="18"/>
+      <w:szCs w:val="18"/>
+    </w:rPr>
+  </w:style>
+  <w:style w:type="paragraph" w:styleId="TM7">
+    <w:name w:val="toc 7"/>
+    <w:basedOn w:val="Normal"/>
+    <w:next w:val="Normal"/>
+    <w:autoRedefine/>
+    <w:uiPriority w:val="39"/>
+    <w:semiHidden/>
+    <w:unhideWhenUsed/>
+    <w:rsid w:val="001C4327"/>
+    <w:pPr>
+      <w:ind w:left="1440"/>
+    </w:pPr>
+    <w:rPr>
+      <w:rFonts w:asciiTheme="minorHAnsi" w:hAnsiTheme="minorHAnsi" w:cstheme="minorHAnsi"/>
+      <w:sz w:val="18"/>
+      <w:szCs w:val="18"/>
+    </w:rPr>
+  </w:style>
+  <w:style w:type="paragraph" w:styleId="TM8">
+    <w:name w:val="toc 8"/>
+    <w:basedOn w:val="Normal"/>
+    <w:next w:val="Normal"/>
+    <w:autoRedefine/>
+    <w:uiPriority w:val="39"/>
+    <w:semiHidden/>
+    <w:unhideWhenUsed/>
+    <w:rsid w:val="001C4327"/>
+    <w:pPr>
+      <w:ind w:left="1680"/>
+    </w:pPr>
+    <w:rPr>
+      <w:rFonts w:asciiTheme="minorHAnsi" w:hAnsiTheme="minorHAnsi" w:cstheme="minorHAnsi"/>
+      <w:sz w:val="18"/>
+      <w:szCs w:val="18"/>
+    </w:rPr>
+  </w:style>
+  <w:style w:type="paragraph" w:styleId="TM9">
+    <w:name w:val="toc 9"/>
+    <w:basedOn w:val="Normal"/>
+    <w:next w:val="Normal"/>
+    <w:autoRedefine/>
+    <w:uiPriority w:val="39"/>
+    <w:semiHidden/>
+    <w:unhideWhenUsed/>
+    <w:rsid w:val="001C4327"/>
+    <w:pPr>
+      <w:ind w:left="1920"/>
+    </w:pPr>
+    <w:rPr>
+      <w:rFonts w:asciiTheme="minorHAnsi" w:hAnsiTheme="minorHAnsi" w:cstheme="minorHAnsi"/>
+      <w:sz w:val="18"/>
+      <w:szCs w:val="18"/>
+    </w:rPr>
+  </w:style>
 </w:styles>
 </file>
 
@@ -6960,4 +10553,16 @@
     </a:ext>
   </a:extLst>
 </a:theme>
+</file>
+
+<file path=customXml/item1.xml><?xml version="1.0" encoding="utf-8"?>
+<b:Sources xmlns:b="http://schemas.openxmlformats.org/officeDocument/2006/bibliography" xmlns="http://schemas.openxmlformats.org/officeDocument/2006/bibliography" SelectedStyle="/APASixthEditionOfficeOnline.xsl" StyleName="APA" Version="6"/>
+</file>
+
+<file path=customXml/itemProps1.xml><?xml version="1.0" encoding="utf-8"?>
+<ds:datastoreItem xmlns:ds="http://schemas.openxmlformats.org/officeDocument/2006/customXml" ds:itemID="{6F807362-87D6-E34A-A921-233C34AD0FF0}">
+  <ds:schemaRefs>
+    <ds:schemaRef ds:uri="http://schemas.openxmlformats.org/officeDocument/2006/bibliography"/>
+  </ds:schemaRefs>
+</ds:datastoreItem>
 </file>
</xml_diff>

<commit_message>
Rapport partie 3 victor fin
</commit_message>
<xml_diff>
--- a/Rapport_LEFEVRE_LARZUL.docx
+++ b/Rapport_LEFEVRE_LARZUL.docx
@@ -596,7 +596,7 @@
             </w:rPr>
             <w:fldChar w:fldCharType="separate"/>
           </w:r>
-          <w:hyperlink w:anchor="_Toc196318704" w:history="1">
+          <w:hyperlink w:anchor="_Toc196320021" w:history="1">
             <w:r>
               <w:rPr>
                 <w:rStyle w:val="Lienhypertexte"/>
@@ -625,7 +625,7 @@
                 <w:noProof/>
                 <w:webHidden/>
               </w:rPr>
-              <w:instrText xml:space="preserve"> PAGEREF _Toc196318704 \h </w:instrText>
+              <w:instrText xml:space="preserve"> PAGEREF _Toc196320021 \h </w:instrText>
             </w:r>
             <w:r>
               <w:rPr>
@@ -670,7 +670,7 @@
               <w:szCs w:val="24"/>
             </w:rPr>
           </w:pPr>
-          <w:hyperlink w:anchor="_Toc196318705" w:history="1">
+          <w:hyperlink w:anchor="_Toc196320022" w:history="1">
             <w:r>
               <w:rPr>
                 <w:rStyle w:val="Lienhypertexte"/>
@@ -700,7 +700,7 @@
                 <w:noProof/>
                 <w:webHidden/>
               </w:rPr>
-              <w:instrText xml:space="preserve"> PAGEREF _Toc196318705 \h </w:instrText>
+              <w:instrText xml:space="preserve"> PAGEREF _Toc196320022 \h </w:instrText>
             </w:r>
             <w:r>
               <w:rPr>
@@ -745,7 +745,7 @@
               <w:szCs w:val="24"/>
             </w:rPr>
           </w:pPr>
-          <w:hyperlink w:anchor="_Toc196318706" w:history="1">
+          <w:hyperlink w:anchor="_Toc196320023" w:history="1">
             <w:r>
               <w:rPr>
                 <w:rStyle w:val="Lienhypertexte"/>
@@ -775,7 +775,7 @@
                 <w:noProof/>
                 <w:webHidden/>
               </w:rPr>
-              <w:instrText xml:space="preserve"> PAGEREF _Toc196318706 \h </w:instrText>
+              <w:instrText xml:space="preserve"> PAGEREF _Toc196320023 \h </w:instrText>
             </w:r>
             <w:r>
               <w:rPr>
@@ -820,7 +820,7 @@
               <w:szCs w:val="24"/>
             </w:rPr>
           </w:pPr>
-          <w:hyperlink w:anchor="_Toc196318707" w:history="1">
+          <w:hyperlink w:anchor="_Toc196320024" w:history="1">
             <w:r>
               <w:rPr>
                 <w:rStyle w:val="Lienhypertexte"/>
@@ -850,7 +850,7 @@
                 <w:noProof/>
                 <w:webHidden/>
               </w:rPr>
-              <w:instrText xml:space="preserve"> PAGEREF _Toc196318707 \h </w:instrText>
+              <w:instrText xml:space="preserve"> PAGEREF _Toc196320024 \h </w:instrText>
             </w:r>
             <w:r>
               <w:rPr>
@@ -870,7 +870,159 @@
                 <w:noProof/>
                 <w:webHidden/>
               </w:rPr>
-              <w:t>7</w:t>
+              <w:t>8</w:t>
+            </w:r>
+            <w:r>
+              <w:rPr>
+                <w:noProof/>
+                <w:webHidden/>
+              </w:rPr>
+              <w:fldChar w:fldCharType="end"/>
+            </w:r>
+          </w:hyperlink>
+        </w:p>
+        <w:p>
+          <w:pPr>
+            <w:pStyle w:val="TM1"/>
+            <w:tabs>
+              <w:tab w:val="right" w:leader="dot" w:pos="9062"/>
+            </w:tabs>
+            <w:rPr>
+              <w:rFonts w:eastAsiaTheme="minorEastAsia" w:cstheme="minorBidi"/>
+              <w:b w:val="0"/>
+              <w:bCs w:val="0"/>
+              <w:caps w:val="0"/>
+              <w:noProof/>
+              <w:sz w:val="24"/>
+              <w:szCs w:val="24"/>
+            </w:rPr>
+          </w:pPr>
+          <w:hyperlink w:anchor="_Toc196320025" w:history="1">
+            <w:r>
+              <w:rPr>
+                <w:rStyle w:val="Lienhypertexte"/>
+                <w:rFonts w:ascii="Times New Roman" w:hAnsi="Times New Roman" w:cs="Times New Roman"/>
+                <w:noProof/>
+                <w:lang w:eastAsia="en-US"/>
+              </w:rPr>
+              <w:t>Implémentation</w:t>
+            </w:r>
+            <w:r>
+              <w:rPr>
+                <w:noProof/>
+                <w:webHidden/>
+              </w:rPr>
+              <w:tab/>
+            </w:r>
+            <w:r>
+              <w:rPr>
+                <w:noProof/>
+                <w:webHidden/>
+              </w:rPr>
+              <w:fldChar w:fldCharType="begin"/>
+            </w:r>
+            <w:r>
+              <w:rPr>
+                <w:noProof/>
+                <w:webHidden/>
+              </w:rPr>
+              <w:instrText xml:space="preserve"> PAGEREF _Toc196320025 \h </w:instrText>
+            </w:r>
+            <w:r>
+              <w:rPr>
+                <w:noProof/>
+                <w:webHidden/>
+              </w:rPr>
+            </w:r>
+            <w:r>
+              <w:rPr>
+                <w:noProof/>
+                <w:webHidden/>
+              </w:rPr>
+              <w:fldChar w:fldCharType="separate"/>
+            </w:r>
+            <w:r>
+              <w:rPr>
+                <w:noProof/>
+                <w:webHidden/>
+              </w:rPr>
+              <w:t>10</w:t>
+            </w:r>
+            <w:r>
+              <w:rPr>
+                <w:noProof/>
+                <w:webHidden/>
+              </w:rPr>
+              <w:fldChar w:fldCharType="end"/>
+            </w:r>
+          </w:hyperlink>
+        </w:p>
+        <w:p>
+          <w:pPr>
+            <w:pStyle w:val="TM1"/>
+            <w:tabs>
+              <w:tab w:val="right" w:leader="dot" w:pos="9062"/>
+            </w:tabs>
+            <w:rPr>
+              <w:rFonts w:eastAsiaTheme="minorEastAsia" w:cstheme="minorBidi"/>
+              <w:b w:val="0"/>
+              <w:bCs w:val="0"/>
+              <w:caps w:val="0"/>
+              <w:noProof/>
+              <w:sz w:val="24"/>
+              <w:szCs w:val="24"/>
+            </w:rPr>
+          </w:pPr>
+          <w:hyperlink w:anchor="_Toc196320026" w:history="1">
+            <w:r>
+              <w:rPr>
+                <w:rStyle w:val="Lienhypertexte"/>
+                <w:rFonts w:ascii="Times New Roman" w:hAnsi="Times New Roman" w:cs="Times New Roman"/>
+                <w:noProof/>
+                <w:lang w:eastAsia="en-US"/>
+              </w:rPr>
+              <w:t>Analyse de l’algorithme</w:t>
+            </w:r>
+            <w:r>
+              <w:rPr>
+                <w:noProof/>
+                <w:webHidden/>
+              </w:rPr>
+              <w:tab/>
+            </w:r>
+            <w:r>
+              <w:rPr>
+                <w:noProof/>
+                <w:webHidden/>
+              </w:rPr>
+              <w:fldChar w:fldCharType="begin"/>
+            </w:r>
+            <w:r>
+              <w:rPr>
+                <w:noProof/>
+                <w:webHidden/>
+              </w:rPr>
+              <w:instrText xml:space="preserve"> PAGEREF _Toc196320026 \h </w:instrText>
+            </w:r>
+            <w:r>
+              <w:rPr>
+                <w:noProof/>
+                <w:webHidden/>
+              </w:rPr>
+            </w:r>
+            <w:r>
+              <w:rPr>
+                <w:noProof/>
+                <w:webHidden/>
+              </w:rPr>
+              <w:fldChar w:fldCharType="separate"/>
+            </w:r>
+            <w:r>
+              <w:rPr>
+                <w:noProof/>
+                <w:webHidden/>
+              </w:rPr>
+              <w:t>11</w:t>
             </w:r>
             <w:r>
               <w:rPr>
@@ -1119,6 +1271,13 @@
     </w:p>
     <w:p>
       <w:pPr>
+        <w:rPr>
+          <w:lang w:eastAsia="en-US"/>
+        </w:rPr>
+      </w:pPr>
+    </w:p>
+    <w:p>
+      <w:pPr>
         <w:pStyle w:val="Titre1"/>
         <w:rPr>
           <w:rFonts w:ascii="Times New Roman" w:hAnsi="Times New Roman" w:cs="Times New Roman"/>
@@ -1130,18 +1289,8 @@
           <w:lang w:eastAsia="en-US"/>
         </w:rPr>
       </w:pPr>
-      <w:bookmarkStart w:id="0" w:name="_Toc196318704"/>
-    </w:p>
-    <w:p>
-      <w:pPr>
-        <w:rPr>
-          <w:lang w:eastAsia="en-US"/>
-        </w:rPr>
-      </w:pPr>
-    </w:p>
-    <w:p>
-      <w:pPr>
-        <w:pStyle w:val="Titre1"/>
+      <w:bookmarkStart w:id="0" w:name="_Toc196320021"/>
+      <w:r>
         <w:rPr>
           <w:rFonts w:ascii="Times New Roman" w:hAnsi="Times New Roman" w:cs="Times New Roman"/>
           <w:b/>
@@ -1151,34 +1300,23 @@
           <w:szCs w:val="44"/>
           <w:lang w:eastAsia="en-US"/>
         </w:rPr>
-      </w:pPr>
-      <w:r>
+        <w:lastRenderedPageBreak/>
+        <w:t>Étude théorique de cas simples</w:t>
+      </w:r>
+      <w:bookmarkEnd w:id="0"/>
+    </w:p>
+    <w:p/>
+    <w:p>
+      <w:pPr>
+        <w:pStyle w:val="Titre2"/>
         <w:rPr>
           <w:rFonts w:ascii="Times New Roman" w:hAnsi="Times New Roman" w:cs="Times New Roman"/>
           <w:b/>
           <w:bCs/>
           <w:color w:val="000000" w:themeColor="text1"/>
-          <w:sz w:val="44"/>
-          <w:szCs w:val="44"/>
-          <w:lang w:eastAsia="en-US"/>
-        </w:rPr>
-        <w:lastRenderedPageBreak/>
-        <w:t>Étude théorique de cas simples</w:t>
-      </w:r>
-      <w:bookmarkEnd w:id="0"/>
-    </w:p>
-    <w:p/>
-    <w:p>
-      <w:pPr>
-        <w:pStyle w:val="Titre2"/>
-        <w:rPr>
-          <w:rFonts w:ascii="Times New Roman" w:hAnsi="Times New Roman" w:cs="Times New Roman"/>
-          <w:b/>
-          <w:bCs/>
-          <w:color w:val="000000" w:themeColor="text1"/>
-        </w:rPr>
-      </w:pPr>
-      <w:bookmarkStart w:id="1" w:name="_Toc196318705"/>
+        </w:rPr>
+      </w:pPr>
+      <w:bookmarkStart w:id="1" w:name="_Toc196320022"/>
       <w:r>
         <w:rPr>
           <w:rFonts w:ascii="Times New Roman" w:hAnsi="Times New Roman" w:cs="Times New Roman"/>
@@ -4624,7 +4762,7 @@
           <w:color w:val="000000" w:themeColor="text1"/>
         </w:rPr>
       </w:pPr>
-      <w:bookmarkStart w:id="2" w:name="_Toc196318706"/>
+      <w:bookmarkStart w:id="2" w:name="_Toc196320023"/>
       <w:r>
         <w:rPr>
           <w:rFonts w:ascii="Times New Roman" w:hAnsi="Times New Roman" w:cs="Times New Roman"/>
@@ -7140,13 +7278,852 @@
     <w:p>
       <w:pPr>
         <w:pStyle w:val="p1"/>
-        <w:rPr>
-          <w:rFonts w:ascii="Times New Roman" w:hAnsi="Times New Roman"/>
+        <w:jc w:val="both"/>
+        <w:rPr>
+          <w:rFonts w:ascii="Times New Roman" w:hAnsi="Times New Roman"/>
+          <w:color w:val="auto"/>
+          <w:sz w:val="24"/>
+          <w:szCs w:val="24"/>
+        </w:rPr>
+      </w:pPr>
+      <w:r>
+        <w:rPr>
+          <w:rFonts w:ascii="Times New Roman" w:hAnsi="Times New Roman"/>
+          <w:color w:val="auto"/>
+          <w:sz w:val="24"/>
+          <w:szCs w:val="24"/>
+        </w:rPr>
+        <w:t xml:space="preserve">Pour analyser l’influence de σ sur le comportement de réseau, nous avons fait le choix d‘une analyse locale. </w:t>
+      </w:r>
+    </w:p>
+    <w:p>
+      <w:pPr>
+        <w:pStyle w:val="p1"/>
+        <w:jc w:val="both"/>
+        <w:rPr>
+          <w:rFonts w:ascii="Times New Roman" w:hAnsi="Times New Roman"/>
+          <w:color w:val="auto"/>
+          <w:sz w:val="24"/>
+          <w:szCs w:val="24"/>
+        </w:rPr>
+      </w:pPr>
+      <w:r>
+        <w:rPr>
+          <w:rFonts w:ascii="Times New Roman" w:hAnsi="Times New Roman"/>
+          <w:color w:val="auto"/>
+          <w:sz w:val="24"/>
+          <w:szCs w:val="24"/>
+        </w:rPr>
+        <w:t xml:space="preserve">Une approche mixte, combinant une analyse locale et globale, aurait pu être envisagée, mais cela semblé trop complexe. Et une analyse globale ne nous semblait pas pertinente, dans la mesure où l’influence de σ sur la carte est principalement locale, et son effet global est indirect. </w:t>
+      </w:r>
+    </w:p>
+    <w:p>
+      <w:pPr>
+        <w:pStyle w:val="p1"/>
+        <w:jc w:val="both"/>
+        <w:rPr>
+          <w:rFonts w:ascii="Times New Roman" w:hAnsi="Times New Roman"/>
+          <w:color w:val="auto"/>
+          <w:sz w:val="24"/>
+          <w:szCs w:val="24"/>
+        </w:rPr>
+      </w:pPr>
+    </w:p>
+    <w:p>
+      <w:pPr>
+        <w:pStyle w:val="p1"/>
+        <w:jc w:val="both"/>
+        <w:rPr>
+          <w:rFonts w:ascii="Times New Roman" w:hAnsi="Times New Roman"/>
+          <w:color w:val="auto"/>
+          <w:sz w:val="24"/>
+          <w:szCs w:val="24"/>
+        </w:rPr>
+      </w:pPr>
+      <w:r>
+        <w:rPr>
+          <w:rFonts w:ascii="Times New Roman" w:hAnsi="Times New Roman"/>
+          <w:color w:val="auto"/>
+          <w:sz w:val="24"/>
+          <w:szCs w:val="24"/>
+        </w:rPr>
+        <w:t xml:space="preserve">Concrètement, pour chaque neurone de la carte, nous avons calculé la distance entre ses poids et ceux de ses voisins. </w:t>
+      </w:r>
+    </w:p>
+    <w:p>
+      <w:pPr>
+        <w:pStyle w:val="p1"/>
+        <w:jc w:val="both"/>
+        <w:rPr>
+          <w:rFonts w:ascii="Times New Roman" w:hAnsi="Times New Roman"/>
+          <w:color w:val="auto"/>
+          <w:sz w:val="24"/>
+          <w:szCs w:val="24"/>
+        </w:rPr>
+      </w:pPr>
+      <w:r>
+        <w:rPr>
+          <w:rFonts w:ascii="Times New Roman" w:hAnsi="Times New Roman"/>
+          <w:color w:val="auto"/>
+          <w:sz w:val="24"/>
+          <w:szCs w:val="24"/>
+        </w:rPr>
+        <w:t xml:space="preserve">Pour chaque neurone, nous avons ensuite fait la moyenne de ces distances sur ses voisins, puis nous avons pris la moyenne globale sur tous les neurones. Cette double moyenne permet d’éviter toute influence due à la taille du voisinage ou à la taille globale du réseau. </w:t>
+      </w:r>
+    </w:p>
+    <w:p>
+      <w:pPr>
+        <w:pStyle w:val="p1"/>
+        <w:jc w:val="both"/>
+        <w:rPr>
+          <w:rFonts w:ascii="Times New Roman" w:hAnsi="Times New Roman"/>
+          <w:color w:val="auto"/>
+          <w:sz w:val="24"/>
+          <w:szCs w:val="24"/>
+        </w:rPr>
+      </w:pPr>
+    </w:p>
+    <w:p>
+      <w:pPr>
+        <w:pStyle w:val="p1"/>
+        <w:jc w:val="both"/>
+        <w:rPr>
+          <w:rFonts w:ascii="Times New Roman" w:hAnsi="Times New Roman"/>
+          <w:color w:val="auto"/>
+          <w:sz w:val="24"/>
+          <w:szCs w:val="24"/>
+        </w:rPr>
+      </w:pPr>
+      <w:r>
+        <w:rPr>
+          <w:rFonts w:ascii="Times New Roman" w:hAnsi="Times New Roman"/>
+          <w:color w:val="auto"/>
+          <w:sz w:val="24"/>
+          <w:szCs w:val="24"/>
+        </w:rPr>
+        <w:t xml:space="preserve">Afin d’obtenir une analyse plus complète, nous avons choisi de définir deux variantes de cette mesure locale : </w:t>
+      </w:r>
+    </w:p>
+    <w:p>
+      <w:pPr>
+        <w:pStyle w:val="p1"/>
+        <w:numPr>
+          <w:ilvl w:val="0"/>
+          <w:numId w:val="2"/>
+        </w:numPr>
+        <w:jc w:val="both"/>
+        <w:rPr>
+          <w:rFonts w:ascii="Times New Roman" w:hAnsi="Times New Roman"/>
+          <w:color w:val="auto"/>
+          <w:sz w:val="24"/>
+          <w:szCs w:val="24"/>
+        </w:rPr>
+      </w:pPr>
+      <w:r>
+        <w:rPr>
+          <w:rFonts w:ascii="Times New Roman" w:hAnsi="Times New Roman"/>
+          <w:color w:val="auto"/>
+          <w:sz w:val="24"/>
+          <w:szCs w:val="24"/>
+        </w:rPr>
+        <w:t xml:space="preserve">Une première utilisant la distance euclidienne, qui donne une vision équilibrée des variations locales. </w:t>
+      </w:r>
+    </w:p>
+    <w:p>
+      <w:pPr>
+        <w:pStyle w:val="p1"/>
+        <w:numPr>
+          <w:ilvl w:val="0"/>
+          <w:numId w:val="2"/>
+        </w:numPr>
+        <w:jc w:val="both"/>
+        <w:rPr>
+          <w:rFonts w:ascii="Times New Roman" w:hAnsi="Times New Roman"/>
+          <w:color w:val="auto"/>
+          <w:sz w:val="24"/>
+          <w:szCs w:val="24"/>
+        </w:rPr>
+      </w:pPr>
+      <w:r>
+        <w:rPr>
+          <w:rFonts w:ascii="Times New Roman" w:hAnsi="Times New Roman"/>
+          <w:color w:val="auto"/>
+          <w:sz w:val="24"/>
+          <w:szCs w:val="24"/>
+        </w:rPr>
+        <w:t xml:space="preserve">Une seconde utilisant la distance quadratique, qui accentue les différences importantes entre les poids et permet de détecter plus facilement les anomalies ou zones de forte spécialisation. </w:t>
+      </w:r>
+    </w:p>
+    <w:p>
+      <w:pPr>
+        <w:pStyle w:val="p1"/>
+        <w:jc w:val="both"/>
+        <w:rPr>
+          <w:rFonts w:ascii="Times New Roman" w:hAnsi="Times New Roman"/>
+          <w:color w:val="auto"/>
+          <w:sz w:val="24"/>
+          <w:szCs w:val="24"/>
+        </w:rPr>
+      </w:pPr>
+    </w:p>
+    <w:p>
+      <w:pPr>
+        <w:pStyle w:val="p1"/>
+        <w:jc w:val="both"/>
+        <w:rPr>
+          <w:rFonts w:ascii="Times New Roman" w:hAnsi="Times New Roman"/>
+          <w:color w:val="auto"/>
+          <w:sz w:val="24"/>
+          <w:szCs w:val="24"/>
+        </w:rPr>
+      </w:pPr>
+    </w:p>
+    <w:p>
+      <w:pPr>
+        <w:pStyle w:val="p1"/>
+        <w:jc w:val="both"/>
+        <w:rPr>
+          <w:rFonts w:ascii="Times New Roman" w:hAnsi="Times New Roman"/>
+          <w:color w:val="auto"/>
+          <w:sz w:val="24"/>
+          <w:szCs w:val="24"/>
+        </w:rPr>
+      </w:pPr>
+    </w:p>
+    <w:p>
+      <w:pPr>
+        <w:pStyle w:val="p1"/>
+        <w:jc w:val="both"/>
+        <w:rPr>
+          <w:rFonts w:ascii="Times New Roman" w:hAnsi="Times New Roman"/>
+          <w:color w:val="auto"/>
+          <w:sz w:val="24"/>
+          <w:szCs w:val="24"/>
+        </w:rPr>
+      </w:pPr>
+      <w:r>
+        <w:rPr>
+          <w:rFonts w:ascii="Times New Roman" w:hAnsi="Times New Roman"/>
+          <w:color w:val="auto"/>
+          <w:sz w:val="24"/>
+          <w:szCs w:val="24"/>
+        </w:rPr>
+        <w:lastRenderedPageBreak/>
+        <w:t xml:space="preserve">Cette approche nous permet de repérer les zones où l’apprentissage local, influencé par σ, a rendu certains neurones trop spécialisés ou a cassé l’homogénéité de la carte. </w:t>
+      </w:r>
+    </w:p>
+    <w:p>
+      <w:pPr>
+        <w:pStyle w:val="p1"/>
+        <w:jc w:val="both"/>
+        <w:rPr>
+          <w:rFonts w:ascii="Times New Roman" w:hAnsi="Times New Roman"/>
+          <w:color w:val="auto"/>
+          <w:sz w:val="24"/>
+          <w:szCs w:val="24"/>
+        </w:rPr>
+      </w:pPr>
+      <w:r>
+        <w:rPr>
+          <w:rFonts w:ascii="Times New Roman" w:hAnsi="Times New Roman"/>
+          <w:color w:val="auto"/>
+          <w:sz w:val="24"/>
+          <w:szCs w:val="24"/>
+        </w:rPr>
+        <w:t xml:space="preserve">En comparant les deux mesures, nous pouvons mieux comprendre le comportement de la carte. Par exemple, si la distance simple est modérée mais la distance quadratique élevée, cela peut indiquer une carte globalement régulière avec quelques zones de forte variation. </w:t>
+      </w:r>
+    </w:p>
+    <w:p>
+      <w:pPr>
+        <w:rPr>
+          <w:rFonts w:ascii="Noto Sans" w:hAnsi="Noto Sans" w:cs="Noto Sans"/>
+          <w:bdr w:val="none" w:sz="0" w:space="0" w:color="auto" w:frame="1"/>
+        </w:rPr>
+      </w:pPr>
+    </w:p>
+    <w:p>
+      <w:pPr>
+        <w:pStyle w:val="p1"/>
+        <w:rPr>
+          <w:rFonts w:ascii="Noto Sans" w:hAnsi="Noto Sans" w:cs="Noto Sans"/>
+          <w:color w:val="000000" w:themeColor="text1"/>
+          <w:sz w:val="26"/>
+          <w:szCs w:val="26"/>
+          <w:lang w:val="en-US"/>
+        </w:rPr>
+      </w:pPr>
+      <m:oMathPara>
+        <m:oMath>
+          <m:sSubSup>
+            <m:sSubSupPr>
+              <m:ctrlPr>
+                <w:rPr>
+                  <w:rFonts w:ascii="Cambria Math" w:hAnsi="Cambria Math" w:cs="Noto Sans"/>
+                  <w:i/>
+                  <w:color w:val="000000" w:themeColor="text1"/>
+                  <w:sz w:val="26"/>
+                  <w:szCs w:val="26"/>
+                </w:rPr>
+              </m:ctrlPr>
+            </m:sSubSupPr>
+            <m:e>
+              <m:r>
+                <w:rPr>
+                  <w:rFonts w:ascii="Cambria Math" w:hAnsi="Cambria Math" w:cs="Noto Sans"/>
+                  <w:color w:val="000000" w:themeColor="text1"/>
+                  <w:sz w:val="26"/>
+                  <w:szCs w:val="26"/>
+                </w:rPr>
+                <m:t>V</m:t>
+              </m:r>
+            </m:e>
+            <m:sub>
+              <m:r>
+                <m:rPr>
+                  <m:nor/>
+                </m:rPr>
+                <w:rPr>
+                  <w:rFonts w:ascii="Cambria Math" w:hAnsi="Cambria Math" w:cs="Noto Sans"/>
+                  <w:color w:val="000000" w:themeColor="text1"/>
+                  <w:sz w:val="26"/>
+                  <w:szCs w:val="26"/>
+                  <w:lang w:val="en-US"/>
+                </w:rPr>
+                <m:t>local</m:t>
+              </m:r>
+            </m:sub>
+            <m:sup>
+              <m:r>
+                <m:rPr>
+                  <m:nor/>
+                </m:rPr>
+                <w:rPr>
+                  <w:rFonts w:ascii="Cambria Math" w:hAnsi="Cambria Math" w:cs="Noto Sans"/>
+                  <w:color w:val="000000" w:themeColor="text1"/>
+                  <w:sz w:val="26"/>
+                  <w:szCs w:val="26"/>
+                  <w:lang w:val="en-US"/>
+                </w:rPr>
+                <m:t>simple</m:t>
+              </m:r>
+            </m:sup>
+          </m:sSubSup>
+          <m:r>
+            <w:rPr>
+              <w:rFonts w:ascii="Cambria Math" w:hAnsi="Cambria Math" w:cs="Noto Sans"/>
+              <w:color w:val="000000" w:themeColor="text1"/>
+              <w:sz w:val="26"/>
+              <w:szCs w:val="26"/>
+              <w:lang w:val="en-US"/>
+            </w:rPr>
+            <m:t>=</m:t>
+          </m:r>
+          <m:f>
+            <m:fPr>
+              <m:ctrlPr>
+                <w:rPr>
+                  <w:rFonts w:ascii="Cambria Math" w:hAnsi="Cambria Math" w:cs="Noto Sans"/>
+                  <w:color w:val="000000" w:themeColor="text1"/>
+                  <w:sz w:val="26"/>
+                  <w:szCs w:val="26"/>
+                </w:rPr>
+              </m:ctrlPr>
+            </m:fPr>
+            <m:num>
+              <m:r>
+                <w:rPr>
+                  <w:rFonts w:ascii="Cambria Math" w:hAnsi="Cambria Math" w:cs="Noto Sans"/>
+                  <w:color w:val="000000" w:themeColor="text1"/>
+                  <w:sz w:val="26"/>
+                  <w:szCs w:val="26"/>
+                  <w:lang w:val="en-US"/>
+                </w:rPr>
+                <m:t>1</m:t>
+              </m:r>
+              <m:ctrlPr>
+                <w:rPr>
+                  <w:rFonts w:ascii="Cambria Math" w:hAnsi="Cambria Math" w:cs="Noto Sans"/>
+                  <w:i/>
+                  <w:color w:val="000000" w:themeColor="text1"/>
+                  <w:sz w:val="26"/>
+                  <w:szCs w:val="26"/>
+                </w:rPr>
+              </m:ctrlPr>
+            </m:num>
+            <m:den>
+              <m:d>
+                <m:dPr>
+                  <m:begChr m:val="|"/>
+                  <m:endChr m:val="|"/>
+                  <m:ctrlPr>
+                    <w:rPr>
+                      <w:rFonts w:ascii="Cambria Math" w:hAnsi="Cambria Math" w:cs="Noto Sans"/>
+                      <w:i/>
+                      <w:color w:val="000000" w:themeColor="text1"/>
+                      <w:sz w:val="26"/>
+                      <w:szCs w:val="26"/>
+                    </w:rPr>
+                  </m:ctrlPr>
+                </m:dPr>
+                <m:e>
+                  <m:r>
+                    <m:rPr>
+                      <m:scr m:val="script"/>
+                    </m:rPr>
+                    <w:rPr>
+                      <w:rFonts w:ascii="Cambria Math" w:hAnsi="Cambria Math" w:cs="Noto Sans"/>
+                      <w:color w:val="000000" w:themeColor="text1"/>
+                      <w:sz w:val="26"/>
+                      <w:szCs w:val="26"/>
+                    </w:rPr>
+                    <m:t>N</m:t>
+                  </m:r>
+                </m:e>
+              </m:d>
+              <m:ctrlPr>
+                <w:rPr>
+                  <w:rFonts w:ascii="Cambria Math" w:hAnsi="Cambria Math" w:cs="Noto Sans"/>
+                  <w:i/>
+                  <w:color w:val="000000" w:themeColor="text1"/>
+                  <w:sz w:val="26"/>
+                  <w:szCs w:val="26"/>
+                </w:rPr>
+              </m:ctrlPr>
+            </m:den>
+          </m:f>
+          <m:nary>
+            <m:naryPr>
+              <m:chr m:val="∑"/>
+              <m:supHide m:val="1"/>
+              <m:ctrlPr>
+                <w:rPr>
+                  <w:rFonts w:ascii="Cambria Math" w:hAnsi="Cambria Math" w:cs="Noto Sans"/>
+                  <w:color w:val="000000" w:themeColor="text1"/>
+                  <w:sz w:val="26"/>
+                  <w:szCs w:val="26"/>
+                </w:rPr>
+              </m:ctrlPr>
+            </m:naryPr>
+            <m:sub>
+              <m:r>
+                <w:rPr>
+                  <w:rFonts w:ascii="Cambria Math" w:hAnsi="Cambria Math" w:cs="Noto Sans"/>
+                  <w:color w:val="000000" w:themeColor="text1"/>
+                  <w:sz w:val="26"/>
+                  <w:szCs w:val="26"/>
+                </w:rPr>
+                <m:t>j</m:t>
+              </m:r>
+              <m:r>
+                <m:rPr>
+                  <m:sty m:val="p"/>
+                </m:rPr>
+                <w:rPr>
+                  <w:rFonts w:ascii="Cambria Math" w:hAnsi="Cambria Math" w:cs="Noto Sans"/>
+                  <w:color w:val="000000" w:themeColor="text1"/>
+                  <w:sz w:val="26"/>
+                  <w:szCs w:val="26"/>
+                  <w:lang w:val="en-US"/>
+                </w:rPr>
+                <m:t>∈</m:t>
+              </m:r>
+              <m:r>
+                <m:rPr>
+                  <m:scr m:val="script"/>
+                </m:rPr>
+                <w:rPr>
+                  <w:rFonts w:ascii="Cambria Math" w:hAnsi="Cambria Math" w:cs="Noto Sans"/>
+                  <w:color w:val="000000" w:themeColor="text1"/>
+                  <w:sz w:val="26"/>
+                  <w:szCs w:val="26"/>
+                </w:rPr>
+                <m:t>N</m:t>
+              </m:r>
+              <m:ctrlPr>
+                <w:rPr>
+                  <w:rFonts w:ascii="Cambria Math" w:hAnsi="Cambria Math" w:cs="Noto Sans"/>
+                  <w:i/>
+                  <w:color w:val="000000" w:themeColor="text1"/>
+                  <w:sz w:val="26"/>
+                  <w:szCs w:val="26"/>
+                </w:rPr>
+              </m:ctrlPr>
+            </m:sub>
+            <m:sup>
+              <m:ctrlPr>
+                <w:rPr>
+                  <w:rFonts w:ascii="Cambria Math" w:hAnsi="Cambria Math" w:cs="Noto Sans"/>
+                  <w:i/>
+                  <w:color w:val="000000" w:themeColor="text1"/>
+                  <w:sz w:val="26"/>
+                  <w:szCs w:val="26"/>
+                </w:rPr>
+              </m:ctrlPr>
+            </m:sup>
+            <m:e>
+              <m:f>
+                <m:fPr>
+                  <m:ctrlPr>
+                    <w:rPr>
+                      <w:rFonts w:ascii="Cambria Math" w:hAnsi="Cambria Math" w:cs="Noto Sans"/>
+                      <w:color w:val="000000" w:themeColor="text1"/>
+                      <w:sz w:val="26"/>
+                      <w:szCs w:val="26"/>
+                    </w:rPr>
+                  </m:ctrlPr>
+                </m:fPr>
+                <m:num>
+                  <m:r>
+                    <w:rPr>
+                      <w:rFonts w:ascii="Cambria Math" w:hAnsi="Cambria Math" w:cs="Noto Sans"/>
+                      <w:color w:val="000000" w:themeColor="text1"/>
+                      <w:sz w:val="26"/>
+                      <w:szCs w:val="26"/>
+                      <w:lang w:val="en-US"/>
+                    </w:rPr>
+                    <m:t>1</m:t>
+                  </m:r>
+                  <m:ctrlPr>
+                    <w:rPr>
+                      <w:rFonts w:ascii="Cambria Math" w:hAnsi="Cambria Math" w:cs="Noto Sans"/>
+                      <w:i/>
+                      <w:color w:val="000000" w:themeColor="text1"/>
+                      <w:sz w:val="26"/>
+                      <w:szCs w:val="26"/>
+                    </w:rPr>
+                  </m:ctrlPr>
+                </m:num>
+                <m:den>
+                  <m:d>
+                    <m:dPr>
+                      <m:begChr m:val="|"/>
+                      <m:endChr m:val="|"/>
+                      <m:ctrlPr>
+                        <w:rPr>
+                          <w:rFonts w:ascii="Cambria Math" w:hAnsi="Cambria Math" w:cs="Noto Sans"/>
+                          <w:i/>
+                          <w:color w:val="000000" w:themeColor="text1"/>
+                          <w:sz w:val="26"/>
+                          <w:szCs w:val="26"/>
+                        </w:rPr>
+                      </m:ctrlPr>
+                    </m:dPr>
+                    <m:e>
+                      <m:sSub>
+                        <m:sSubPr>
+                          <m:ctrlPr>
+                            <w:rPr>
+                              <w:rFonts w:ascii="Cambria Math" w:hAnsi="Cambria Math" w:cs="Noto Sans"/>
+                              <w:i/>
+                              <w:color w:val="000000" w:themeColor="text1"/>
+                              <w:sz w:val="26"/>
+                              <w:szCs w:val="26"/>
+                            </w:rPr>
+                          </m:ctrlPr>
+                        </m:sSubPr>
+                        <m:e>
+                          <m:r>
+                            <m:rPr>
+                              <m:scr m:val="script"/>
+                            </m:rPr>
+                            <w:rPr>
+                              <w:rFonts w:ascii="Cambria Math" w:hAnsi="Cambria Math" w:cs="Noto Sans"/>
+                              <w:color w:val="000000" w:themeColor="text1"/>
+                              <w:sz w:val="26"/>
+                              <w:szCs w:val="26"/>
+                            </w:rPr>
+                            <m:t>V</m:t>
+                          </m:r>
+                        </m:e>
+                        <m:sub>
+                          <m:r>
+                            <m:rPr>
+                              <m:scr m:val="script"/>
+                            </m:rPr>
+                            <w:rPr>
+                              <w:rFonts w:ascii="Cambria Math" w:hAnsi="Cambria Math" w:cs="Noto Sans"/>
+                              <w:color w:val="000000" w:themeColor="text1"/>
+                              <w:sz w:val="26"/>
+                              <w:szCs w:val="26"/>
+                            </w:rPr>
+                            <m:t>j</m:t>
+                          </m:r>
+                        </m:sub>
+                      </m:sSub>
+                    </m:e>
+                  </m:d>
+                  <m:ctrlPr>
+                    <w:rPr>
+                      <w:rFonts w:ascii="Cambria Math" w:hAnsi="Cambria Math" w:cs="Noto Sans"/>
+                      <w:i/>
+                      <w:color w:val="000000" w:themeColor="text1"/>
+                      <w:sz w:val="26"/>
+                      <w:szCs w:val="26"/>
+                    </w:rPr>
+                  </m:ctrlPr>
+                </m:den>
+              </m:f>
+              <m:ctrlPr>
+                <w:rPr>
+                  <w:rFonts w:ascii="Cambria Math" w:hAnsi="Cambria Math" w:cs="Noto Sans"/>
+                  <w:i/>
+                  <w:color w:val="000000" w:themeColor="text1"/>
+                  <w:sz w:val="26"/>
+                  <w:szCs w:val="26"/>
+                </w:rPr>
+              </m:ctrlPr>
+            </m:e>
+          </m:nary>
+          <m:nary>
+            <m:naryPr>
+              <m:chr m:val="∑"/>
+              <m:supHide m:val="1"/>
+              <m:ctrlPr>
+                <w:rPr>
+                  <w:rFonts w:ascii="Cambria Math" w:hAnsi="Cambria Math" w:cs="Noto Sans"/>
+                  <w:color w:val="000000" w:themeColor="text1"/>
+                  <w:sz w:val="26"/>
+                  <w:szCs w:val="26"/>
+                </w:rPr>
+              </m:ctrlPr>
+            </m:naryPr>
+            <m:sub>
+              <m:r>
+                <w:rPr>
+                  <w:rFonts w:ascii="Cambria Math" w:hAnsi="Cambria Math" w:cs="Noto Sans"/>
+                  <w:color w:val="000000" w:themeColor="text1"/>
+                  <w:sz w:val="26"/>
+                  <w:szCs w:val="26"/>
+                </w:rPr>
+                <m:t>i</m:t>
+              </m:r>
+              <m:r>
+                <m:rPr>
+                  <m:sty m:val="p"/>
+                </m:rPr>
+                <w:rPr>
+                  <w:rFonts w:ascii="Cambria Math" w:hAnsi="Cambria Math" w:cs="Noto Sans"/>
+                  <w:color w:val="000000" w:themeColor="text1"/>
+                  <w:sz w:val="26"/>
+                  <w:szCs w:val="26"/>
+                  <w:lang w:val="en-US"/>
+                </w:rPr>
+                <m:t>∈</m:t>
+              </m:r>
+              <m:sSub>
+                <m:sSubPr>
+                  <m:ctrlPr>
+                    <w:rPr>
+                      <w:rFonts w:ascii="Cambria Math" w:hAnsi="Cambria Math" w:cs="Noto Sans"/>
+                      <w:i/>
+                      <w:color w:val="000000" w:themeColor="text1"/>
+                      <w:sz w:val="26"/>
+                      <w:szCs w:val="26"/>
+                    </w:rPr>
+                  </m:ctrlPr>
+                </m:sSubPr>
+                <m:e>
+                  <m:r>
+                    <m:rPr>
+                      <m:scr m:val="script"/>
+                    </m:rPr>
+                    <w:rPr>
+                      <w:rFonts w:ascii="Cambria Math" w:hAnsi="Cambria Math" w:cs="Noto Sans"/>
+                      <w:color w:val="000000" w:themeColor="text1"/>
+                      <w:sz w:val="26"/>
+                      <w:szCs w:val="26"/>
+                    </w:rPr>
+                    <m:t>V</m:t>
+                  </m:r>
+                </m:e>
+                <m:sub>
+                  <m:r>
+                    <m:rPr>
+                      <m:scr m:val="script"/>
+                    </m:rPr>
+                    <w:rPr>
+                      <w:rFonts w:ascii="Cambria Math" w:hAnsi="Cambria Math" w:cs="Noto Sans"/>
+                      <w:color w:val="000000" w:themeColor="text1"/>
+                      <w:sz w:val="26"/>
+                      <w:szCs w:val="26"/>
+                    </w:rPr>
+                    <m:t>j</m:t>
+                  </m:r>
+                </m:sub>
+              </m:sSub>
+              <m:ctrlPr>
+                <w:rPr>
+                  <w:rFonts w:ascii="Cambria Math" w:hAnsi="Cambria Math" w:cs="Noto Sans"/>
+                  <w:i/>
+                  <w:color w:val="000000" w:themeColor="text1"/>
+                  <w:sz w:val="26"/>
+                  <w:szCs w:val="26"/>
+                </w:rPr>
+              </m:ctrlPr>
+            </m:sub>
+            <m:sup>
+              <m:ctrlPr>
+                <w:rPr>
+                  <w:rFonts w:ascii="Cambria Math" w:hAnsi="Cambria Math" w:cs="Noto Sans"/>
+                  <w:i/>
+                  <w:color w:val="000000" w:themeColor="text1"/>
+                  <w:sz w:val="26"/>
+                  <w:szCs w:val="26"/>
+                </w:rPr>
+              </m:ctrlPr>
+            </m:sup>
+            <m:e>
+              <m:r>
+                <m:rPr>
+                  <m:lit/>
+                </m:rPr>
+                <w:rPr>
+                  <w:rFonts w:ascii="Cambria Math" w:hAnsi="Cambria Math" w:cs="Noto Sans"/>
+                  <w:color w:val="000000" w:themeColor="text1"/>
+                  <w:sz w:val="26"/>
+                  <w:szCs w:val="26"/>
+                  <w:lang w:val="en-US"/>
+                </w:rPr>
+                <m:t>|</m:t>
+              </m:r>
+              <m:sSub>
+                <m:sSubPr>
+                  <m:ctrlPr>
+                    <w:rPr>
+                      <w:rFonts w:ascii="Cambria Math" w:hAnsi="Cambria Math" w:cs="Noto Sans"/>
+                      <w:i/>
+                      <w:color w:val="000000" w:themeColor="text1"/>
+                      <w:sz w:val="26"/>
+                      <w:szCs w:val="26"/>
+                    </w:rPr>
+                  </m:ctrlPr>
+                </m:sSubPr>
+                <m:e>
+                  <m:r>
+                    <w:rPr>
+                      <w:rFonts w:ascii="Cambria Math" w:hAnsi="Cambria Math" w:cs="Noto Sans"/>
+                      <w:color w:val="000000" w:themeColor="text1"/>
+                      <w:sz w:val="26"/>
+                      <w:szCs w:val="26"/>
+                      <w:lang w:val="en-US"/>
+                    </w:rPr>
+                    <m:t>|</m:t>
+                  </m:r>
+                  <m:r>
+                    <w:rPr>
+                      <w:rFonts w:ascii="Cambria Math" w:hAnsi="Cambria Math" w:cs="Noto Sans"/>
+                      <w:color w:val="000000" w:themeColor="text1"/>
+                      <w:sz w:val="26"/>
+                      <w:szCs w:val="26"/>
+                    </w:rPr>
+                    <m:t>W</m:t>
+                  </m:r>
+                </m:e>
+                <m:sub>
+                  <m:r>
+                    <w:rPr>
+                      <w:rFonts w:ascii="Cambria Math" w:hAnsi="Cambria Math" w:cs="Noto Sans"/>
+                      <w:color w:val="000000" w:themeColor="text1"/>
+                      <w:sz w:val="26"/>
+                      <w:szCs w:val="26"/>
+                    </w:rPr>
+                    <m:t>j</m:t>
+                  </m:r>
+                </m:sub>
+              </m:sSub>
+              <m:ctrlPr>
+                <w:rPr>
+                  <w:rFonts w:ascii="Cambria Math" w:hAnsi="Cambria Math" w:cs="Noto Sans"/>
+                  <w:i/>
+                  <w:color w:val="000000" w:themeColor="text1"/>
+                  <w:sz w:val="26"/>
+                  <w:szCs w:val="26"/>
+                </w:rPr>
+              </m:ctrlPr>
+            </m:e>
+          </m:nary>
+          <m:r>
+            <w:rPr>
+              <w:rFonts w:ascii="Cambria Math" w:hAnsi="Cambria Math" w:cs="Noto Sans"/>
+              <w:color w:val="000000" w:themeColor="text1"/>
+              <w:sz w:val="26"/>
+              <w:szCs w:val="26"/>
+              <w:lang w:val="en-US"/>
+            </w:rPr>
+            <m:t>-</m:t>
+          </m:r>
+          <m:sSub>
+            <m:sSubPr>
+              <m:ctrlPr>
+                <w:rPr>
+                  <w:rFonts w:ascii="Cambria Math" w:hAnsi="Cambria Math" w:cs="Noto Sans"/>
+                  <w:i/>
+                  <w:color w:val="000000" w:themeColor="text1"/>
+                  <w:sz w:val="26"/>
+                  <w:szCs w:val="26"/>
+                </w:rPr>
+              </m:ctrlPr>
+            </m:sSubPr>
+            <m:e>
+              <m:r>
+                <w:rPr>
+                  <w:rFonts w:ascii="Cambria Math" w:hAnsi="Cambria Math" w:cs="Noto Sans"/>
+                  <w:color w:val="000000" w:themeColor="text1"/>
+                  <w:sz w:val="26"/>
+                  <w:szCs w:val="26"/>
+                </w:rPr>
+                <m:t>W</m:t>
+              </m:r>
+            </m:e>
+            <m:sub>
+              <m:r>
+                <w:rPr>
+                  <w:rFonts w:ascii="Cambria Math" w:hAnsi="Cambria Math" w:cs="Noto Sans"/>
+                  <w:color w:val="000000" w:themeColor="text1"/>
+                  <w:sz w:val="26"/>
+                  <w:szCs w:val="26"/>
+                </w:rPr>
+                <m:t>i</m:t>
+              </m:r>
+            </m:sub>
+          </m:sSub>
+          <m:r>
+            <m:rPr>
+              <m:lit/>
+            </m:rPr>
+            <w:rPr>
+              <w:rFonts w:ascii="Cambria Math" w:hAnsi="Cambria Math" w:cs="Noto Sans"/>
+              <w:color w:val="000000" w:themeColor="text1"/>
+              <w:sz w:val="26"/>
+              <w:szCs w:val="26"/>
+              <w:lang w:val="en-US"/>
+            </w:rPr>
+            <m:t>|</m:t>
+          </m:r>
+          <m:r>
+            <w:rPr>
+              <w:rFonts w:ascii="Cambria Math" w:hAnsi="Cambria Math" w:cs="Noto Sans"/>
+              <w:color w:val="000000" w:themeColor="text1"/>
+              <w:sz w:val="26"/>
+              <w:szCs w:val="26"/>
+              <w:lang w:val="en-US"/>
+            </w:rPr>
+            <m:t>|</m:t>
+          </m:r>
+        </m:oMath>
+      </m:oMathPara>
+    </w:p>
+    <w:p>
+      <w:pPr>
+        <w:pStyle w:val="p1"/>
+        <w:rPr>
+          <w:rFonts w:ascii="Noto Sans" w:hAnsi="Noto Sans" w:cs="Noto Sans"/>
           <w:b/>
           <w:bCs/>
           <w:color w:val="000000" w:themeColor="text1"/>
           <w:sz w:val="26"/>
           <w:szCs w:val="26"/>
+          <w:lang w:val="en-US"/>
         </w:rPr>
       </w:pPr>
     </w:p>
@@ -7154,7 +8131,627 @@
       <w:pPr>
         <w:pStyle w:val="p1"/>
         <w:rPr>
-          <w:rFonts w:ascii="Times New Roman" w:hAnsi="Times New Roman"/>
+          <w:rFonts w:ascii="Noto Sans" w:hAnsi="Noto Sans" w:cs="Noto Sans"/>
+          <w:color w:val="000000" w:themeColor="text1"/>
+          <w:sz w:val="26"/>
+          <w:szCs w:val="26"/>
+        </w:rPr>
+      </w:pPr>
+      <m:oMathPara>
+        <m:oMath>
+          <m:sSubSup>
+            <m:sSubSupPr>
+              <m:ctrlPr>
+                <w:rPr>
+                  <w:rFonts w:ascii="Cambria Math" w:hAnsi="Cambria Math" w:cs="Noto Sans"/>
+                  <w:i/>
+                  <w:color w:val="000000" w:themeColor="text1"/>
+                  <w:sz w:val="26"/>
+                  <w:szCs w:val="26"/>
+                  <w:lang w:val="en-US"/>
+                </w:rPr>
+              </m:ctrlPr>
+            </m:sSubSupPr>
+            <m:e>
+              <m:r>
+                <w:rPr>
+                  <w:rFonts w:ascii="Cambria Math" w:hAnsi="Cambria Math" w:cs="Noto Sans"/>
+                  <w:color w:val="000000" w:themeColor="text1"/>
+                  <w:sz w:val="26"/>
+                  <w:szCs w:val="26"/>
+                  <w:lang w:val="en-US"/>
+                </w:rPr>
+                <m:t>V</m:t>
+              </m:r>
+            </m:e>
+            <m:sub>
+              <m:r>
+                <m:rPr>
+                  <m:nor/>
+                </m:rPr>
+                <w:rPr>
+                  <w:rFonts w:ascii="Cambria Math" w:hAnsi="Cambria Math" w:cs="Noto Sans"/>
+                  <w:color w:val="000000" w:themeColor="text1"/>
+                  <w:sz w:val="26"/>
+                  <w:szCs w:val="26"/>
+                </w:rPr>
+                <m:t>local</m:t>
+              </m:r>
+            </m:sub>
+            <m:sup>
+              <m:r>
+                <m:rPr>
+                  <m:nor/>
+                </m:rPr>
+                <w:rPr>
+                  <w:rFonts w:ascii="Cambria Math" w:hAnsi="Cambria Math" w:cs="Noto Sans"/>
+                  <w:color w:val="000000" w:themeColor="text1"/>
+                  <w:sz w:val="26"/>
+                  <w:szCs w:val="26"/>
+                </w:rPr>
+                <m:t>quadratique</m:t>
+              </m:r>
+            </m:sup>
+          </m:sSubSup>
+          <m:r>
+            <w:rPr>
+              <w:rFonts w:ascii="Cambria Math" w:hAnsi="Cambria Math" w:cs="Noto Sans"/>
+              <w:color w:val="000000" w:themeColor="text1"/>
+              <w:sz w:val="26"/>
+              <w:szCs w:val="26"/>
+            </w:rPr>
+            <m:t>=</m:t>
+          </m:r>
+          <m:f>
+            <m:fPr>
+              <m:ctrlPr>
+                <w:rPr>
+                  <w:rFonts w:ascii="Cambria Math" w:hAnsi="Cambria Math" w:cs="Noto Sans"/>
+                  <w:color w:val="000000" w:themeColor="text1"/>
+                  <w:sz w:val="26"/>
+                  <w:szCs w:val="26"/>
+                  <w:lang w:val="en-US"/>
+                </w:rPr>
+              </m:ctrlPr>
+            </m:fPr>
+            <m:num>
+              <m:r>
+                <w:rPr>
+                  <w:rFonts w:ascii="Cambria Math" w:hAnsi="Cambria Math" w:cs="Noto Sans"/>
+                  <w:color w:val="000000" w:themeColor="text1"/>
+                  <w:sz w:val="26"/>
+                  <w:szCs w:val="26"/>
+                </w:rPr>
+                <m:t>1</m:t>
+              </m:r>
+              <m:ctrlPr>
+                <w:rPr>
+                  <w:rFonts w:ascii="Cambria Math" w:hAnsi="Cambria Math" w:cs="Noto Sans"/>
+                  <w:i/>
+                  <w:color w:val="000000" w:themeColor="text1"/>
+                  <w:sz w:val="26"/>
+                  <w:szCs w:val="26"/>
+                  <w:lang w:val="en-US"/>
+                </w:rPr>
+              </m:ctrlPr>
+            </m:num>
+            <m:den>
+              <m:d>
+                <m:dPr>
+                  <m:begChr m:val="|"/>
+                  <m:endChr m:val="|"/>
+                  <m:ctrlPr>
+                    <w:rPr>
+                      <w:rFonts w:ascii="Cambria Math" w:hAnsi="Cambria Math" w:cs="Noto Sans"/>
+                      <w:i/>
+                      <w:color w:val="000000" w:themeColor="text1"/>
+                      <w:sz w:val="26"/>
+                      <w:szCs w:val="26"/>
+                      <w:lang w:val="en-US"/>
+                    </w:rPr>
+                  </m:ctrlPr>
+                </m:dPr>
+                <m:e>
+                  <m:r>
+                    <m:rPr>
+                      <m:scr m:val="script"/>
+                    </m:rPr>
+                    <w:rPr>
+                      <w:rFonts w:ascii="Cambria Math" w:hAnsi="Cambria Math" w:cs="Noto Sans"/>
+                      <w:color w:val="000000" w:themeColor="text1"/>
+                      <w:sz w:val="26"/>
+                      <w:szCs w:val="26"/>
+                      <w:lang w:val="en-US"/>
+                    </w:rPr>
+                    <m:t>N</m:t>
+                  </m:r>
+                </m:e>
+              </m:d>
+              <m:ctrlPr>
+                <w:rPr>
+                  <w:rFonts w:ascii="Cambria Math" w:hAnsi="Cambria Math" w:cs="Noto Sans"/>
+                  <w:i/>
+                  <w:color w:val="000000" w:themeColor="text1"/>
+                  <w:sz w:val="26"/>
+                  <w:szCs w:val="26"/>
+                  <w:lang w:val="en-US"/>
+                </w:rPr>
+              </m:ctrlPr>
+            </m:den>
+          </m:f>
+          <m:nary>
+            <m:naryPr>
+              <m:chr m:val="∑"/>
+              <m:supHide m:val="1"/>
+              <m:ctrlPr>
+                <w:rPr>
+                  <w:rFonts w:ascii="Cambria Math" w:hAnsi="Cambria Math" w:cs="Noto Sans"/>
+                  <w:color w:val="000000" w:themeColor="text1"/>
+                  <w:sz w:val="26"/>
+                  <w:szCs w:val="26"/>
+                  <w:lang w:val="en-US"/>
+                </w:rPr>
+              </m:ctrlPr>
+            </m:naryPr>
+            <m:sub>
+              <m:r>
+                <w:rPr>
+                  <w:rFonts w:ascii="Cambria Math" w:hAnsi="Cambria Math" w:cs="Noto Sans"/>
+                  <w:color w:val="000000" w:themeColor="text1"/>
+                  <w:sz w:val="26"/>
+                  <w:szCs w:val="26"/>
+                  <w:lang w:val="en-US"/>
+                </w:rPr>
+                <m:t>j</m:t>
+              </m:r>
+              <m:r>
+                <m:rPr>
+                  <m:sty m:val="p"/>
+                </m:rPr>
+                <w:rPr>
+                  <w:rFonts w:ascii="Cambria Math" w:hAnsi="Cambria Math" w:cs="Noto Sans"/>
+                  <w:color w:val="000000" w:themeColor="text1"/>
+                  <w:sz w:val="26"/>
+                  <w:szCs w:val="26"/>
+                </w:rPr>
+                <m:t>∈</m:t>
+              </m:r>
+              <m:r>
+                <m:rPr>
+                  <m:scr m:val="script"/>
+                </m:rPr>
+                <w:rPr>
+                  <w:rFonts w:ascii="Cambria Math" w:hAnsi="Cambria Math" w:cs="Noto Sans"/>
+                  <w:color w:val="000000" w:themeColor="text1"/>
+                  <w:sz w:val="26"/>
+                  <w:szCs w:val="26"/>
+                  <w:lang w:val="en-US"/>
+                </w:rPr>
+                <m:t>N</m:t>
+              </m:r>
+              <m:ctrlPr>
+                <w:rPr>
+                  <w:rFonts w:ascii="Cambria Math" w:hAnsi="Cambria Math" w:cs="Noto Sans"/>
+                  <w:i/>
+                  <w:color w:val="000000" w:themeColor="text1"/>
+                  <w:sz w:val="26"/>
+                  <w:szCs w:val="26"/>
+                  <w:lang w:val="en-US"/>
+                </w:rPr>
+              </m:ctrlPr>
+            </m:sub>
+            <m:sup>
+              <m:ctrlPr>
+                <w:rPr>
+                  <w:rFonts w:ascii="Cambria Math" w:hAnsi="Cambria Math" w:cs="Noto Sans"/>
+                  <w:i/>
+                  <w:color w:val="000000" w:themeColor="text1"/>
+                  <w:sz w:val="26"/>
+                  <w:szCs w:val="26"/>
+                  <w:lang w:val="en-US"/>
+                </w:rPr>
+              </m:ctrlPr>
+            </m:sup>
+            <m:e>
+              <m:f>
+                <m:fPr>
+                  <m:ctrlPr>
+                    <w:rPr>
+                      <w:rFonts w:ascii="Cambria Math" w:hAnsi="Cambria Math" w:cs="Noto Sans"/>
+                      <w:color w:val="000000" w:themeColor="text1"/>
+                      <w:sz w:val="26"/>
+                      <w:szCs w:val="26"/>
+                      <w:lang w:val="en-US"/>
+                    </w:rPr>
+                  </m:ctrlPr>
+                </m:fPr>
+                <m:num>
+                  <m:r>
+                    <w:rPr>
+                      <w:rFonts w:ascii="Cambria Math" w:hAnsi="Cambria Math" w:cs="Noto Sans"/>
+                      <w:color w:val="000000" w:themeColor="text1"/>
+                      <w:sz w:val="26"/>
+                      <w:szCs w:val="26"/>
+                    </w:rPr>
+                    <m:t>1</m:t>
+                  </m:r>
+                  <m:ctrlPr>
+                    <w:rPr>
+                      <w:rFonts w:ascii="Cambria Math" w:hAnsi="Cambria Math" w:cs="Noto Sans"/>
+                      <w:i/>
+                      <w:color w:val="000000" w:themeColor="text1"/>
+                      <w:sz w:val="26"/>
+                      <w:szCs w:val="26"/>
+                      <w:lang w:val="en-US"/>
+                    </w:rPr>
+                  </m:ctrlPr>
+                </m:num>
+                <m:den>
+                  <m:d>
+                    <m:dPr>
+                      <m:begChr m:val="|"/>
+                      <m:endChr m:val="|"/>
+                      <m:ctrlPr>
+                        <w:rPr>
+                          <w:rFonts w:ascii="Cambria Math" w:hAnsi="Cambria Math" w:cs="Noto Sans"/>
+                          <w:i/>
+                          <w:color w:val="000000" w:themeColor="text1"/>
+                          <w:sz w:val="26"/>
+                          <w:szCs w:val="26"/>
+                          <w:lang w:val="en-US"/>
+                        </w:rPr>
+                      </m:ctrlPr>
+                    </m:dPr>
+                    <m:e>
+                      <m:sSub>
+                        <m:sSubPr>
+                          <m:ctrlPr>
+                            <w:rPr>
+                              <w:rFonts w:ascii="Cambria Math" w:hAnsi="Cambria Math" w:cs="Noto Sans"/>
+                              <w:i/>
+                              <w:color w:val="000000" w:themeColor="text1"/>
+                              <w:sz w:val="26"/>
+                              <w:szCs w:val="26"/>
+                              <w:lang w:val="en-US"/>
+                            </w:rPr>
+                          </m:ctrlPr>
+                        </m:sSubPr>
+                        <m:e>
+                          <m:r>
+                            <m:rPr>
+                              <m:scr m:val="script"/>
+                            </m:rPr>
+                            <w:rPr>
+                              <w:rFonts w:ascii="Cambria Math" w:hAnsi="Cambria Math" w:cs="Noto Sans"/>
+                              <w:color w:val="000000" w:themeColor="text1"/>
+                              <w:sz w:val="26"/>
+                              <w:szCs w:val="26"/>
+                              <w:lang w:val="en-US"/>
+                            </w:rPr>
+                            <m:t>V</m:t>
+                          </m:r>
+                        </m:e>
+                        <m:sub>
+                          <m:r>
+                            <m:rPr>
+                              <m:scr m:val="script"/>
+                            </m:rPr>
+                            <w:rPr>
+                              <w:rFonts w:ascii="Cambria Math" w:hAnsi="Cambria Math" w:cs="Noto Sans"/>
+                              <w:color w:val="000000" w:themeColor="text1"/>
+                              <w:sz w:val="26"/>
+                              <w:szCs w:val="26"/>
+                              <w:lang w:val="en-US"/>
+                            </w:rPr>
+                            <m:t>j</m:t>
+                          </m:r>
+                        </m:sub>
+                      </m:sSub>
+                    </m:e>
+                  </m:d>
+                  <m:ctrlPr>
+                    <w:rPr>
+                      <w:rFonts w:ascii="Cambria Math" w:hAnsi="Cambria Math" w:cs="Noto Sans"/>
+                      <w:i/>
+                      <w:color w:val="000000" w:themeColor="text1"/>
+                      <w:sz w:val="26"/>
+                      <w:szCs w:val="26"/>
+                      <w:lang w:val="en-US"/>
+                    </w:rPr>
+                  </m:ctrlPr>
+                </m:den>
+              </m:f>
+              <m:ctrlPr>
+                <w:rPr>
+                  <w:rFonts w:ascii="Cambria Math" w:hAnsi="Cambria Math" w:cs="Noto Sans"/>
+                  <w:i/>
+                  <w:color w:val="000000" w:themeColor="text1"/>
+                  <w:sz w:val="26"/>
+                  <w:szCs w:val="26"/>
+                  <w:lang w:val="en-US"/>
+                </w:rPr>
+              </m:ctrlPr>
+            </m:e>
+          </m:nary>
+          <m:nary>
+            <m:naryPr>
+              <m:chr m:val="∑"/>
+              <m:supHide m:val="1"/>
+              <m:ctrlPr>
+                <w:rPr>
+                  <w:rFonts w:ascii="Cambria Math" w:hAnsi="Cambria Math" w:cs="Noto Sans"/>
+                  <w:color w:val="000000" w:themeColor="text1"/>
+                  <w:sz w:val="26"/>
+                  <w:szCs w:val="26"/>
+                  <w:lang w:val="en-US"/>
+                </w:rPr>
+              </m:ctrlPr>
+            </m:naryPr>
+            <m:sub>
+              <m:r>
+                <w:rPr>
+                  <w:rFonts w:ascii="Cambria Math" w:hAnsi="Cambria Math" w:cs="Noto Sans"/>
+                  <w:color w:val="000000" w:themeColor="text1"/>
+                  <w:sz w:val="26"/>
+                  <w:szCs w:val="26"/>
+                  <w:lang w:val="en-US"/>
+                </w:rPr>
+                <m:t>i</m:t>
+              </m:r>
+              <m:r>
+                <m:rPr>
+                  <m:sty m:val="p"/>
+                </m:rPr>
+                <w:rPr>
+                  <w:rFonts w:ascii="Cambria Math" w:hAnsi="Cambria Math" w:cs="Noto Sans"/>
+                  <w:color w:val="000000" w:themeColor="text1"/>
+                  <w:sz w:val="26"/>
+                  <w:szCs w:val="26"/>
+                </w:rPr>
+                <m:t>∈</m:t>
+              </m:r>
+              <m:sSub>
+                <m:sSubPr>
+                  <m:ctrlPr>
+                    <w:rPr>
+                      <w:rFonts w:ascii="Cambria Math" w:hAnsi="Cambria Math" w:cs="Noto Sans"/>
+                      <w:i/>
+                      <w:color w:val="000000" w:themeColor="text1"/>
+                      <w:sz w:val="26"/>
+                      <w:szCs w:val="26"/>
+                      <w:lang w:val="en-US"/>
+                    </w:rPr>
+                  </m:ctrlPr>
+                </m:sSubPr>
+                <m:e>
+                  <m:r>
+                    <m:rPr>
+                      <m:scr m:val="script"/>
+                    </m:rPr>
+                    <w:rPr>
+                      <w:rFonts w:ascii="Cambria Math" w:hAnsi="Cambria Math" w:cs="Noto Sans"/>
+                      <w:color w:val="000000" w:themeColor="text1"/>
+                      <w:sz w:val="26"/>
+                      <w:szCs w:val="26"/>
+                      <w:lang w:val="en-US"/>
+                    </w:rPr>
+                    <m:t>V</m:t>
+                  </m:r>
+                </m:e>
+                <m:sub>
+                  <m:r>
+                    <m:rPr>
+                      <m:scr m:val="script"/>
+                    </m:rPr>
+                    <w:rPr>
+                      <w:rFonts w:ascii="Cambria Math" w:hAnsi="Cambria Math" w:cs="Noto Sans"/>
+                      <w:color w:val="000000" w:themeColor="text1"/>
+                      <w:sz w:val="26"/>
+                      <w:szCs w:val="26"/>
+                      <w:lang w:val="en-US"/>
+                    </w:rPr>
+                    <m:t>j</m:t>
+                  </m:r>
+                </m:sub>
+              </m:sSub>
+              <m:ctrlPr>
+                <w:rPr>
+                  <w:rFonts w:ascii="Cambria Math" w:hAnsi="Cambria Math" w:cs="Noto Sans"/>
+                  <w:i/>
+                  <w:color w:val="000000" w:themeColor="text1"/>
+                  <w:sz w:val="26"/>
+                  <w:szCs w:val="26"/>
+                  <w:lang w:val="en-US"/>
+                </w:rPr>
+              </m:ctrlPr>
+            </m:sub>
+            <m:sup>
+              <m:ctrlPr>
+                <w:rPr>
+                  <w:rFonts w:ascii="Cambria Math" w:hAnsi="Cambria Math" w:cs="Noto Sans"/>
+                  <w:i/>
+                  <w:color w:val="000000" w:themeColor="text1"/>
+                  <w:sz w:val="26"/>
+                  <w:szCs w:val="26"/>
+                  <w:lang w:val="en-US"/>
+                </w:rPr>
+              </m:ctrlPr>
+            </m:sup>
+            <m:e>
+              <m:r>
+                <m:rPr>
+                  <m:lit/>
+                </m:rPr>
+                <w:rPr>
+                  <w:rFonts w:ascii="Cambria Math" w:hAnsi="Cambria Math" w:cs="Noto Sans"/>
+                  <w:color w:val="000000" w:themeColor="text1"/>
+                  <w:sz w:val="26"/>
+                  <w:szCs w:val="26"/>
+                </w:rPr>
+                <m:t>|</m:t>
+              </m:r>
+              <m:sSub>
+                <m:sSubPr>
+                  <m:ctrlPr>
+                    <w:rPr>
+                      <w:rFonts w:ascii="Cambria Math" w:hAnsi="Cambria Math" w:cs="Noto Sans"/>
+                      <w:i/>
+                      <w:color w:val="000000" w:themeColor="text1"/>
+                      <w:sz w:val="26"/>
+                      <w:szCs w:val="26"/>
+                      <w:lang w:val="en-US"/>
+                    </w:rPr>
+                  </m:ctrlPr>
+                </m:sSubPr>
+                <m:e>
+                  <m:r>
+                    <w:rPr>
+                      <w:rFonts w:ascii="Cambria Math" w:hAnsi="Cambria Math" w:cs="Noto Sans"/>
+                      <w:color w:val="000000" w:themeColor="text1"/>
+                      <w:sz w:val="26"/>
+                      <w:szCs w:val="26"/>
+                    </w:rPr>
+                    <m:t>|</m:t>
+                  </m:r>
+                  <m:r>
+                    <w:rPr>
+                      <w:rFonts w:ascii="Cambria Math" w:hAnsi="Cambria Math" w:cs="Noto Sans"/>
+                      <w:color w:val="000000" w:themeColor="text1"/>
+                      <w:sz w:val="26"/>
+                      <w:szCs w:val="26"/>
+                      <w:lang w:val="en-US"/>
+                    </w:rPr>
+                    <m:t>W</m:t>
+                  </m:r>
+                </m:e>
+                <m:sub>
+                  <m:r>
+                    <w:rPr>
+                      <w:rFonts w:ascii="Cambria Math" w:hAnsi="Cambria Math" w:cs="Noto Sans"/>
+                      <w:color w:val="000000" w:themeColor="text1"/>
+                      <w:sz w:val="26"/>
+                      <w:szCs w:val="26"/>
+                      <w:lang w:val="en-US"/>
+                    </w:rPr>
+                    <m:t>j</m:t>
+                  </m:r>
+                </m:sub>
+              </m:sSub>
+              <m:ctrlPr>
+                <w:rPr>
+                  <w:rFonts w:ascii="Cambria Math" w:hAnsi="Cambria Math" w:cs="Noto Sans"/>
+                  <w:i/>
+                  <w:color w:val="000000" w:themeColor="text1"/>
+                  <w:sz w:val="26"/>
+                  <w:szCs w:val="26"/>
+                  <w:lang w:val="en-US"/>
+                </w:rPr>
+              </m:ctrlPr>
+            </m:e>
+          </m:nary>
+          <m:r>
+            <w:rPr>
+              <w:rFonts w:ascii="Cambria Math" w:hAnsi="Cambria Math" w:cs="Noto Sans"/>
+              <w:color w:val="000000" w:themeColor="text1"/>
+              <w:sz w:val="26"/>
+              <w:szCs w:val="26"/>
+            </w:rPr>
+            <m:t>-</m:t>
+          </m:r>
+          <m:sSub>
+            <m:sSubPr>
+              <m:ctrlPr>
+                <w:rPr>
+                  <w:rFonts w:ascii="Cambria Math" w:hAnsi="Cambria Math" w:cs="Noto Sans"/>
+                  <w:i/>
+                  <w:color w:val="000000" w:themeColor="text1"/>
+                  <w:sz w:val="26"/>
+                  <w:szCs w:val="26"/>
+                  <w:lang w:val="en-US"/>
+                </w:rPr>
+              </m:ctrlPr>
+            </m:sSubPr>
+            <m:e>
+              <m:r>
+                <w:rPr>
+                  <w:rFonts w:ascii="Cambria Math" w:hAnsi="Cambria Math" w:cs="Noto Sans"/>
+                  <w:color w:val="000000" w:themeColor="text1"/>
+                  <w:sz w:val="26"/>
+                  <w:szCs w:val="26"/>
+                  <w:lang w:val="en-US"/>
+                </w:rPr>
+                <m:t>W</m:t>
+              </m:r>
+            </m:e>
+            <m:sub>
+              <m:r>
+                <w:rPr>
+                  <w:rFonts w:ascii="Cambria Math" w:hAnsi="Cambria Math" w:cs="Noto Sans"/>
+                  <w:color w:val="000000" w:themeColor="text1"/>
+                  <w:sz w:val="26"/>
+                  <w:szCs w:val="26"/>
+                  <w:lang w:val="en-US"/>
+                </w:rPr>
+                <m:t>i</m:t>
+              </m:r>
+            </m:sub>
+          </m:sSub>
+          <m:sSup>
+            <m:sSupPr>
+              <m:ctrlPr>
+                <w:rPr>
+                  <w:rFonts w:ascii="Cambria Math" w:hAnsi="Cambria Math" w:cs="Noto Sans"/>
+                  <w:i/>
+                  <w:color w:val="000000" w:themeColor="text1"/>
+                  <w:sz w:val="26"/>
+                  <w:szCs w:val="26"/>
+                  <w:lang w:val="en-US"/>
+                </w:rPr>
+              </m:ctrlPr>
+            </m:sSupPr>
+            <m:e>
+              <m:r>
+                <m:rPr>
+                  <m:lit/>
+                </m:rPr>
+                <w:rPr>
+                  <w:rFonts w:ascii="Cambria Math" w:hAnsi="Cambria Math" w:cs="Noto Sans"/>
+                  <w:color w:val="000000" w:themeColor="text1"/>
+                  <w:sz w:val="26"/>
+                  <w:szCs w:val="26"/>
+                </w:rPr>
+                <m:t>|</m:t>
+              </m:r>
+              <m:r>
+                <w:rPr>
+                  <w:rFonts w:ascii="Cambria Math" w:hAnsi="Cambria Math" w:cs="Noto Sans"/>
+                  <w:color w:val="000000" w:themeColor="text1"/>
+                  <w:sz w:val="26"/>
+                  <w:szCs w:val="26"/>
+                </w:rPr>
+                <m:t>|</m:t>
+              </m:r>
+            </m:e>
+            <m:sup>
+              <m:r>
+                <w:rPr>
+                  <w:rFonts w:ascii="Cambria Math" w:hAnsi="Cambria Math" w:cs="Noto Sans"/>
+                  <w:color w:val="000000" w:themeColor="text1"/>
+                  <w:sz w:val="26"/>
+                  <w:szCs w:val="26"/>
+                </w:rPr>
+                <m:t>2</m:t>
+              </m:r>
+            </m:sup>
+          </m:sSup>
+        </m:oMath>
+      </m:oMathPara>
+    </w:p>
+    <w:p>
+      <w:pPr>
+        <w:pStyle w:val="p1"/>
+        <w:rPr>
+          <w:rFonts w:ascii="Noto Sans" w:hAnsi="Noto Sans" w:cs="Noto Sans"/>
           <w:b/>
           <w:bCs/>
           <w:color w:val="000000" w:themeColor="text1"/>
@@ -7167,7 +8764,7 @@
       <w:pPr>
         <w:pStyle w:val="p1"/>
         <w:rPr>
-          <w:rFonts w:ascii="Times New Roman" w:hAnsi="Times New Roman"/>
+          <w:rFonts w:ascii="Noto Sans" w:hAnsi="Noto Sans" w:cs="Noto Sans"/>
           <w:b/>
           <w:bCs/>
           <w:color w:val="000000" w:themeColor="text1"/>
@@ -7180,7 +8777,7 @@
       <w:pPr>
         <w:pStyle w:val="p1"/>
         <w:rPr>
-          <w:rFonts w:ascii="Times New Roman" w:hAnsi="Times New Roman"/>
+          <w:rFonts w:ascii="Noto Sans" w:hAnsi="Noto Sans" w:cs="Noto Sans"/>
           <w:b/>
           <w:bCs/>
           <w:color w:val="000000" w:themeColor="text1"/>
@@ -7388,14 +8985,7 @@
       <w:pPr>
         <w:pStyle w:val="p1"/>
         <w:rPr>
-          <w:sz w:val="18"/>
-          <w:szCs w:val="18"/>
-        </w:rPr>
-      </w:pPr>
-    </w:p>
-    <w:p>
-      <w:pPr>
-        <w:rPr>
+          <w:rFonts w:ascii="Times New Roman" w:hAnsi="Times New Roman"/>
           <w:b/>
           <w:bCs/>
           <w:color w:val="000000" w:themeColor="text1"/>
@@ -7406,6 +8996,182 @@
     </w:p>
     <w:p>
       <w:pPr>
+        <w:pStyle w:val="p1"/>
+        <w:rPr>
+          <w:rFonts w:ascii="Times New Roman" w:hAnsi="Times New Roman"/>
+          <w:b/>
+          <w:bCs/>
+          <w:color w:val="000000" w:themeColor="text1"/>
+          <w:sz w:val="26"/>
+          <w:szCs w:val="26"/>
+        </w:rPr>
+      </w:pPr>
+    </w:p>
+    <w:p>
+      <w:pPr>
+        <w:pStyle w:val="p1"/>
+        <w:rPr>
+          <w:rFonts w:ascii="Times New Roman" w:hAnsi="Times New Roman"/>
+          <w:b/>
+          <w:bCs/>
+          <w:color w:val="000000" w:themeColor="text1"/>
+          <w:sz w:val="26"/>
+          <w:szCs w:val="26"/>
+        </w:rPr>
+      </w:pPr>
+    </w:p>
+    <w:p>
+      <w:pPr>
+        <w:pStyle w:val="p1"/>
+        <w:rPr>
+          <w:rFonts w:ascii="Times New Roman" w:hAnsi="Times New Roman"/>
+          <w:b/>
+          <w:bCs/>
+          <w:color w:val="000000" w:themeColor="text1"/>
+          <w:sz w:val="26"/>
+          <w:szCs w:val="26"/>
+        </w:rPr>
+      </w:pPr>
+    </w:p>
+    <w:p>
+      <w:pPr>
+        <w:pStyle w:val="p1"/>
+        <w:rPr>
+          <w:rFonts w:ascii="Times New Roman" w:hAnsi="Times New Roman"/>
+          <w:b/>
+          <w:bCs/>
+          <w:color w:val="000000" w:themeColor="text1"/>
+          <w:sz w:val="26"/>
+          <w:szCs w:val="26"/>
+        </w:rPr>
+      </w:pPr>
+    </w:p>
+    <w:p>
+      <w:pPr>
+        <w:pStyle w:val="p1"/>
+        <w:rPr>
+          <w:rFonts w:ascii="Times New Roman" w:hAnsi="Times New Roman"/>
+          <w:b/>
+          <w:bCs/>
+          <w:color w:val="000000" w:themeColor="text1"/>
+          <w:sz w:val="26"/>
+          <w:szCs w:val="26"/>
+        </w:rPr>
+      </w:pPr>
+    </w:p>
+    <w:p>
+      <w:pPr>
+        <w:pStyle w:val="p1"/>
+        <w:rPr>
+          <w:rFonts w:ascii="Times New Roman" w:hAnsi="Times New Roman"/>
+          <w:b/>
+          <w:bCs/>
+          <w:color w:val="000000" w:themeColor="text1"/>
+          <w:sz w:val="26"/>
+          <w:szCs w:val="26"/>
+        </w:rPr>
+      </w:pPr>
+    </w:p>
+    <w:p>
+      <w:pPr>
+        <w:pStyle w:val="p1"/>
+        <w:rPr>
+          <w:rFonts w:ascii="Times New Roman" w:hAnsi="Times New Roman"/>
+          <w:b/>
+          <w:bCs/>
+          <w:color w:val="000000" w:themeColor="text1"/>
+          <w:sz w:val="26"/>
+          <w:szCs w:val="26"/>
+        </w:rPr>
+      </w:pPr>
+    </w:p>
+    <w:p>
+      <w:pPr>
+        <w:pStyle w:val="p1"/>
+        <w:rPr>
+          <w:rFonts w:ascii="Times New Roman" w:hAnsi="Times New Roman"/>
+          <w:b/>
+          <w:bCs/>
+          <w:color w:val="000000" w:themeColor="text1"/>
+          <w:sz w:val="26"/>
+          <w:szCs w:val="26"/>
+        </w:rPr>
+      </w:pPr>
+    </w:p>
+    <w:p>
+      <w:pPr>
+        <w:pStyle w:val="p1"/>
+        <w:rPr>
+          <w:rFonts w:ascii="Times New Roman" w:hAnsi="Times New Roman"/>
+          <w:b/>
+          <w:bCs/>
+          <w:color w:val="000000" w:themeColor="text1"/>
+          <w:sz w:val="26"/>
+          <w:szCs w:val="26"/>
+        </w:rPr>
+      </w:pPr>
+    </w:p>
+    <w:p>
+      <w:pPr>
+        <w:pStyle w:val="p1"/>
+        <w:rPr>
+          <w:rFonts w:ascii="Times New Roman" w:hAnsi="Times New Roman"/>
+          <w:b/>
+          <w:bCs/>
+          <w:color w:val="000000" w:themeColor="text1"/>
+          <w:sz w:val="26"/>
+          <w:szCs w:val="26"/>
+        </w:rPr>
+      </w:pPr>
+    </w:p>
+    <w:p>
+      <w:pPr>
+        <w:pStyle w:val="p1"/>
+        <w:rPr>
+          <w:rFonts w:ascii="Times New Roman" w:hAnsi="Times New Roman"/>
+          <w:b/>
+          <w:bCs/>
+          <w:color w:val="000000" w:themeColor="text1"/>
+          <w:sz w:val="26"/>
+          <w:szCs w:val="26"/>
+        </w:rPr>
+      </w:pPr>
+    </w:p>
+    <w:p>
+      <w:pPr>
+        <w:pStyle w:val="p1"/>
+        <w:rPr>
+          <w:rFonts w:ascii="Times New Roman" w:hAnsi="Times New Roman"/>
+          <w:b/>
+          <w:bCs/>
+          <w:color w:val="000000" w:themeColor="text1"/>
+          <w:sz w:val="26"/>
+          <w:szCs w:val="26"/>
+        </w:rPr>
+      </w:pPr>
+    </w:p>
+    <w:p>
+      <w:pPr>
+        <w:pStyle w:val="p1"/>
+        <w:rPr>
+          <w:sz w:val="18"/>
+          <w:szCs w:val="18"/>
+        </w:rPr>
+      </w:pPr>
+    </w:p>
+    <w:p>
+      <w:pPr>
+        <w:rPr>
+          <w:b/>
+          <w:bCs/>
+          <w:color w:val="000000" w:themeColor="text1"/>
+          <w:sz w:val="26"/>
+          <w:szCs w:val="26"/>
+        </w:rPr>
+      </w:pPr>
+    </w:p>
+    <w:p>
+      <w:pPr>
         <w:pStyle w:val="Titre2"/>
         <w:rPr>
           <w:rFonts w:ascii="Times New Roman" w:hAnsi="Times New Roman" w:cs="Times New Roman"/>
@@ -7414,7 +9180,7 @@
           <w:color w:val="000000" w:themeColor="text1"/>
         </w:rPr>
       </w:pPr>
-      <w:bookmarkStart w:id="3" w:name="_Toc196318707"/>
+      <w:bookmarkStart w:id="3" w:name="_Toc196320024"/>
       <w:r>
         <w:rPr>
           <w:rFonts w:ascii="Times New Roman" w:hAnsi="Times New Roman" w:cs="Times New Roman"/>
@@ -9334,6 +11100,504 @@
     <w:p/>
     <w:p/>
     <w:p/>
+    <w:p/>
+    <w:p/>
+    <w:p/>
+    <w:p/>
+    <w:p/>
+    <w:p/>
+    <w:p/>
+    <w:p/>
+    <w:p/>
+    <w:p/>
+    <w:p/>
+    <w:p/>
+    <w:p>
+      <w:pPr>
+        <w:pStyle w:val="Titre1"/>
+        <w:rPr>
+          <w:rFonts w:ascii="Times New Roman" w:hAnsi="Times New Roman" w:cs="Times New Roman"/>
+          <w:b/>
+          <w:bCs/>
+          <w:color w:val="000000" w:themeColor="text1"/>
+          <w:sz w:val="44"/>
+          <w:szCs w:val="44"/>
+          <w:lang w:eastAsia="en-US"/>
+        </w:rPr>
+      </w:pPr>
+      <w:bookmarkStart w:id="4" w:name="_Toc196320025"/>
+      <w:r>
+        <w:rPr>
+          <w:rFonts w:ascii="Times New Roman" w:hAnsi="Times New Roman" w:cs="Times New Roman"/>
+          <w:b/>
+          <w:bCs/>
+          <w:color w:val="000000" w:themeColor="text1"/>
+          <w:sz w:val="44"/>
+          <w:szCs w:val="44"/>
+          <w:lang w:eastAsia="en-US"/>
+        </w:rPr>
+        <w:t>Impl</w:t>
+      </w:r>
+      <w:r>
+        <w:rPr>
+          <w:rFonts w:ascii="Times New Roman" w:hAnsi="Times New Roman" w:cs="Times New Roman"/>
+          <w:b/>
+          <w:bCs/>
+          <w:color w:val="000000" w:themeColor="text1"/>
+          <w:sz w:val="44"/>
+          <w:szCs w:val="44"/>
+          <w:lang w:eastAsia="en-US"/>
+        </w:rPr>
+        <w:t>é</w:t>
+      </w:r>
+      <w:r>
+        <w:rPr>
+          <w:rFonts w:ascii="Times New Roman" w:hAnsi="Times New Roman" w:cs="Times New Roman"/>
+          <w:b/>
+          <w:bCs/>
+          <w:color w:val="000000" w:themeColor="text1"/>
+          <w:sz w:val="44"/>
+          <w:szCs w:val="44"/>
+          <w:lang w:eastAsia="en-US"/>
+        </w:rPr>
+        <w:t>mentation</w:t>
+      </w:r>
+      <w:bookmarkEnd w:id="4"/>
+    </w:p>
+    <w:p>
+      <w:pPr>
+        <w:rPr>
+          <w:rFonts w:eastAsiaTheme="majorEastAsia"/>
+          <w:lang w:eastAsia="en-US"/>
+        </w:rPr>
+      </w:pPr>
+    </w:p>
+    <w:p>
+      <w:pPr>
+        <w:rPr>
+          <w:rFonts w:eastAsiaTheme="majorEastAsia"/>
+          <w:lang w:eastAsia="en-US"/>
+        </w:rPr>
+      </w:pPr>
+    </w:p>
+    <w:p>
+      <w:pPr>
+        <w:pStyle w:val="p1"/>
+        <w:jc w:val="both"/>
+        <w:rPr>
+          <w:rFonts w:ascii="Times New Roman" w:hAnsi="Times New Roman"/>
+          <w:color w:val="auto"/>
+          <w:sz w:val="24"/>
+          <w:szCs w:val="24"/>
+        </w:rPr>
+      </w:pPr>
+      <w:r>
+        <w:rPr>
+          <w:rFonts w:ascii="Times New Roman" w:hAnsi="Times New Roman"/>
+          <w:color w:val="auto"/>
+          <w:sz w:val="24"/>
+          <w:szCs w:val="24"/>
+        </w:rPr>
+        <w:t xml:space="preserve">Voici ce qui a été modifié dans le code du fichier </w:t>
+      </w:r>
+      <w:r>
+        <w:rPr>
+          <w:rFonts w:ascii="Times New Roman" w:hAnsi="Times New Roman"/>
+          <w:i/>
+          <w:iCs/>
+          <w:color w:val="auto"/>
+          <w:sz w:val="24"/>
+          <w:szCs w:val="24"/>
+        </w:rPr>
+        <w:t>kohonen.py</w:t>
+      </w:r>
+      <w:r>
+        <w:rPr>
+          <w:rFonts w:ascii="Times New Roman" w:hAnsi="Times New Roman"/>
+          <w:color w:val="auto"/>
+          <w:sz w:val="24"/>
+          <w:szCs w:val="24"/>
+        </w:rPr>
+        <w:t>.</w:t>
+      </w:r>
+    </w:p>
+    <w:p>
+      <w:pPr>
+        <w:rPr>
+          <w:rFonts w:eastAsiaTheme="majorEastAsia"/>
+          <w:lang w:eastAsia="en-US"/>
+        </w:rPr>
+      </w:pPr>
+    </w:p>
+    <w:p>
+      <w:pPr>
+        <w:rPr>
+          <w:rFonts w:eastAsiaTheme="majorEastAsia"/>
+          <w:lang w:eastAsia="en-US"/>
+        </w:rPr>
+      </w:pPr>
+      <w:r>
+        <w:rPr>
+          <w:rFonts w:eastAsiaTheme="majorEastAsia"/>
+          <w:lang w:eastAsia="en-US"/>
+        </w:rPr>
+        <w:drawing>
+          <wp:inline distT="0" distB="0" distL="0" distR="0" wp14:anchorId="151D89C5" wp14:editId="653FB659">
+            <wp:extent cx="5760720" cy="363855"/>
+            <wp:effectExtent l="0" t="0" r="5080" b="4445"/>
+            <wp:docPr id="3" name="Image 3"/>
+            <wp:cNvGraphicFramePr>
+              <a:graphicFrameLocks xmlns:a="http://schemas.openxmlformats.org/drawingml/2006/main" noChangeAspect="1"/>
+            </wp:cNvGraphicFramePr>
+            <a:graphic xmlns:a="http://schemas.openxmlformats.org/drawingml/2006/main">
+              <a:graphicData uri="http://schemas.openxmlformats.org/drawingml/2006/picture">
+                <pic:pic xmlns:pic="http://schemas.openxmlformats.org/drawingml/2006/picture">
+                  <pic:nvPicPr>
+                    <pic:cNvPr id="1" name=""/>
+                    <pic:cNvPicPr/>
+                  </pic:nvPicPr>
+                  <pic:blipFill>
+                    <a:blip r:embed="rId8"/>
+                    <a:stretch>
+                      <a:fillRect/>
+                    </a:stretch>
+                  </pic:blipFill>
+                  <pic:spPr>
+                    <a:xfrm>
+                      <a:off x="0" y="0"/>
+                      <a:ext cx="5760720" cy="363855"/>
+                    </a:xfrm>
+                    <a:prstGeom prst="rect">
+                      <a:avLst/>
+                    </a:prstGeom>
+                  </pic:spPr>
+                </pic:pic>
+              </a:graphicData>
+            </a:graphic>
+          </wp:inline>
+        </w:drawing>
+      </w:r>
+    </w:p>
+    <w:p>
+      <w:pPr>
+        <w:rPr>
+          <w:rFonts w:eastAsiaTheme="majorEastAsia"/>
+          <w:lang w:eastAsia="en-US"/>
+        </w:rPr>
+      </w:pPr>
+    </w:p>
+    <w:p>
+      <w:pPr>
+        <w:rPr>
+          <w:rFonts w:eastAsiaTheme="majorEastAsia"/>
+          <w:lang w:eastAsia="en-US"/>
+        </w:rPr>
+      </w:pPr>
+      <w:r>
+        <w:rPr>
+          <w:rFonts w:eastAsiaTheme="majorEastAsia"/>
+          <w:lang w:eastAsia="en-US"/>
+        </w:rPr>
+        <w:drawing>
+          <wp:inline distT="0" distB="0" distL="0" distR="0" wp14:anchorId="760BBC8D" wp14:editId="2B85584A">
+            <wp:extent cx="5760720" cy="1160780"/>
+            <wp:effectExtent l="0" t="0" r="5080" b="0"/>
+            <wp:docPr id="4" name="Image 4" descr="Une image contenant texte, capture d’écran, Police&#10;&#10;Description générée automatiquement"/>
+            <wp:cNvGraphicFramePr>
+              <a:graphicFrameLocks xmlns:a="http://schemas.openxmlformats.org/drawingml/2006/main" noChangeAspect="1"/>
+            </wp:cNvGraphicFramePr>
+            <a:graphic xmlns:a="http://schemas.openxmlformats.org/drawingml/2006/main">
+              <a:graphicData uri="http://schemas.openxmlformats.org/drawingml/2006/picture">
+                <pic:pic xmlns:pic="http://schemas.openxmlformats.org/drawingml/2006/picture">
+                  <pic:nvPicPr>
+                    <pic:cNvPr id="4" name="Image 4" descr="Une image contenant texte, capture d’écran, Police&#10;&#10;Description générée automatiquement"/>
+                    <pic:cNvPicPr/>
+                  </pic:nvPicPr>
+                  <pic:blipFill>
+                    <a:blip r:embed="rId9"/>
+                    <a:stretch>
+                      <a:fillRect/>
+                    </a:stretch>
+                  </pic:blipFill>
+                  <pic:spPr>
+                    <a:xfrm>
+                      <a:off x="0" y="0"/>
+                      <a:ext cx="5760720" cy="1160780"/>
+                    </a:xfrm>
+                    <a:prstGeom prst="rect">
+                      <a:avLst/>
+                    </a:prstGeom>
+                  </pic:spPr>
+                </pic:pic>
+              </a:graphicData>
+            </a:graphic>
+          </wp:inline>
+        </w:drawing>
+      </w:r>
+    </w:p>
+    <w:p>
+      <w:pPr>
+        <w:rPr>
+          <w:rFonts w:eastAsiaTheme="majorEastAsia"/>
+          <w:lang w:eastAsia="en-US"/>
+        </w:rPr>
+      </w:pPr>
+    </w:p>
+    <w:p>
+      <w:pPr>
+        <w:rPr>
+          <w:rFonts w:eastAsiaTheme="majorEastAsia"/>
+          <w:lang w:eastAsia="en-US"/>
+        </w:rPr>
+      </w:pPr>
+    </w:p>
+    <w:p>
+      <w:pPr>
+        <w:rPr>
+          <w:rFonts w:eastAsiaTheme="majorEastAsia"/>
+          <w:lang w:eastAsia="en-US"/>
+        </w:rPr>
+      </w:pPr>
+    </w:p>
+    <w:p>
+      <w:pPr>
+        <w:rPr>
+          <w:rFonts w:eastAsiaTheme="majorEastAsia"/>
+          <w:lang w:eastAsia="en-US"/>
+        </w:rPr>
+      </w:pPr>
+    </w:p>
+    <w:p>
+      <w:pPr>
+        <w:rPr>
+          <w:rFonts w:eastAsiaTheme="majorEastAsia"/>
+          <w:lang w:eastAsia="en-US"/>
+        </w:rPr>
+      </w:pPr>
+    </w:p>
+    <w:p>
+      <w:pPr>
+        <w:rPr>
+          <w:rFonts w:eastAsiaTheme="majorEastAsia"/>
+          <w:lang w:eastAsia="en-US"/>
+        </w:rPr>
+      </w:pPr>
+    </w:p>
+    <w:p>
+      <w:pPr>
+        <w:rPr>
+          <w:rFonts w:eastAsiaTheme="majorEastAsia"/>
+          <w:lang w:eastAsia="en-US"/>
+        </w:rPr>
+      </w:pPr>
+    </w:p>
+    <w:p>
+      <w:pPr>
+        <w:rPr>
+          <w:rFonts w:eastAsiaTheme="majorEastAsia"/>
+          <w:lang w:eastAsia="en-US"/>
+        </w:rPr>
+      </w:pPr>
+    </w:p>
+    <w:p>
+      <w:pPr>
+        <w:rPr>
+          <w:rFonts w:eastAsiaTheme="majorEastAsia"/>
+          <w:lang w:eastAsia="en-US"/>
+        </w:rPr>
+      </w:pPr>
+    </w:p>
+    <w:p>
+      <w:pPr>
+        <w:rPr>
+          <w:rFonts w:eastAsiaTheme="majorEastAsia"/>
+          <w:lang w:eastAsia="en-US"/>
+        </w:rPr>
+      </w:pPr>
+    </w:p>
+    <w:p>
+      <w:pPr>
+        <w:rPr>
+          <w:rFonts w:eastAsiaTheme="majorEastAsia"/>
+          <w:lang w:eastAsia="en-US"/>
+        </w:rPr>
+      </w:pPr>
+    </w:p>
+    <w:p>
+      <w:pPr>
+        <w:rPr>
+          <w:rFonts w:eastAsiaTheme="majorEastAsia"/>
+          <w:lang w:eastAsia="en-US"/>
+        </w:rPr>
+      </w:pPr>
+    </w:p>
+    <w:p>
+      <w:pPr>
+        <w:rPr>
+          <w:rFonts w:eastAsiaTheme="majorEastAsia"/>
+          <w:lang w:eastAsia="en-US"/>
+        </w:rPr>
+      </w:pPr>
+    </w:p>
+    <w:p>
+      <w:pPr>
+        <w:rPr>
+          <w:rFonts w:eastAsiaTheme="majorEastAsia"/>
+          <w:lang w:eastAsia="en-US"/>
+        </w:rPr>
+      </w:pPr>
+    </w:p>
+    <w:p>
+      <w:pPr>
+        <w:rPr>
+          <w:rFonts w:eastAsiaTheme="majorEastAsia"/>
+          <w:lang w:eastAsia="en-US"/>
+        </w:rPr>
+      </w:pPr>
+    </w:p>
+    <w:p>
+      <w:pPr>
+        <w:rPr>
+          <w:rFonts w:eastAsiaTheme="majorEastAsia"/>
+          <w:lang w:eastAsia="en-US"/>
+        </w:rPr>
+      </w:pPr>
+    </w:p>
+    <w:p>
+      <w:pPr>
+        <w:rPr>
+          <w:rFonts w:eastAsiaTheme="majorEastAsia"/>
+          <w:lang w:eastAsia="en-US"/>
+        </w:rPr>
+      </w:pPr>
+    </w:p>
+    <w:p>
+      <w:pPr>
+        <w:rPr>
+          <w:rFonts w:eastAsiaTheme="majorEastAsia"/>
+          <w:lang w:eastAsia="en-US"/>
+        </w:rPr>
+      </w:pPr>
+    </w:p>
+    <w:p>
+      <w:pPr>
+        <w:rPr>
+          <w:rFonts w:eastAsiaTheme="majorEastAsia"/>
+          <w:lang w:eastAsia="en-US"/>
+        </w:rPr>
+      </w:pPr>
+    </w:p>
+    <w:p>
+      <w:pPr>
+        <w:rPr>
+          <w:rFonts w:eastAsiaTheme="majorEastAsia"/>
+          <w:lang w:eastAsia="en-US"/>
+        </w:rPr>
+      </w:pPr>
+    </w:p>
+    <w:p>
+      <w:pPr>
+        <w:rPr>
+          <w:rFonts w:eastAsiaTheme="majorEastAsia"/>
+          <w:lang w:eastAsia="en-US"/>
+        </w:rPr>
+      </w:pPr>
+    </w:p>
+    <w:p>
+      <w:pPr>
+        <w:rPr>
+          <w:rFonts w:eastAsiaTheme="majorEastAsia"/>
+          <w:lang w:eastAsia="en-US"/>
+        </w:rPr>
+      </w:pPr>
+    </w:p>
+    <w:p>
+      <w:pPr>
+        <w:rPr>
+          <w:rFonts w:eastAsiaTheme="majorEastAsia"/>
+          <w:lang w:eastAsia="en-US"/>
+        </w:rPr>
+      </w:pPr>
+    </w:p>
+    <w:p>
+      <w:pPr>
+        <w:rPr>
+          <w:rFonts w:eastAsiaTheme="majorEastAsia"/>
+          <w:lang w:eastAsia="en-US"/>
+        </w:rPr>
+      </w:pPr>
+    </w:p>
+    <w:p>
+      <w:pPr>
+        <w:rPr>
+          <w:rFonts w:eastAsiaTheme="majorEastAsia"/>
+          <w:lang w:eastAsia="en-US"/>
+        </w:rPr>
+      </w:pPr>
+    </w:p>
+    <w:p>
+      <w:pPr>
+        <w:rPr>
+          <w:rFonts w:eastAsiaTheme="majorEastAsia"/>
+          <w:lang w:eastAsia="en-US"/>
+        </w:rPr>
+      </w:pPr>
+    </w:p>
+    <w:p>
+      <w:pPr>
+        <w:rPr>
+          <w:rFonts w:eastAsiaTheme="majorEastAsia"/>
+          <w:lang w:eastAsia="en-US"/>
+        </w:rPr>
+      </w:pPr>
+    </w:p>
+    <w:p>
+      <w:pPr>
+        <w:rPr>
+          <w:rFonts w:eastAsiaTheme="majorEastAsia"/>
+          <w:lang w:eastAsia="en-US"/>
+        </w:rPr>
+      </w:pPr>
+    </w:p>
+    <w:p>
+      <w:pPr>
+        <w:rPr>
+          <w:rFonts w:eastAsiaTheme="majorEastAsia"/>
+          <w:lang w:eastAsia="en-US"/>
+        </w:rPr>
+      </w:pPr>
+    </w:p>
+    <w:p/>
+    <w:p>
+      <w:pPr>
+        <w:pStyle w:val="Titre1"/>
+        <w:rPr>
+          <w:rFonts w:ascii="Times New Roman" w:hAnsi="Times New Roman" w:cs="Times New Roman"/>
+          <w:b/>
+          <w:bCs/>
+          <w:color w:val="000000" w:themeColor="text1"/>
+          <w:sz w:val="44"/>
+          <w:szCs w:val="44"/>
+          <w:lang w:eastAsia="en-US"/>
+        </w:rPr>
+      </w:pPr>
+      <w:bookmarkStart w:id="5" w:name="_Toc196320026"/>
+      <w:r>
+        <w:rPr>
+          <w:rFonts w:ascii="Times New Roman" w:hAnsi="Times New Roman" w:cs="Times New Roman"/>
+          <w:b/>
+          <w:bCs/>
+          <w:color w:val="000000" w:themeColor="text1"/>
+          <w:sz w:val="44"/>
+          <w:szCs w:val="44"/>
+          <w:lang w:eastAsia="en-US"/>
+        </w:rPr>
+        <w:lastRenderedPageBreak/>
+        <w:t>Analyse de l’algorithme</w:t>
+      </w:r>
+      <w:bookmarkEnd w:id="5"/>
+    </w:p>
+    <w:p/>
     <w:sectPr>
       <w:pgSz w:w="11906" w:h="16838"/>
       <w:pgMar w:top="1417" w:right="1417" w:bottom="1417" w:left="1417" w:header="708" w:footer="708" w:gutter="0"/>
@@ -9459,8 +11723,123 @@
       </w:rPr>
     </w:lvl>
   </w:abstractNum>
+  <w:abstractNum w:abstractNumId="1" w15:restartNumberingAfterBreak="0">
+    <w:nsid w:val="42B96418"/>
+    <w:multiLevelType w:val="hybridMultilevel"/>
+    <w:tmpl w:val="070CBA8E"/>
+    <w:lvl w:ilvl="0" w:tplc="4C023FD4">
+      <w:numFmt w:val="bullet"/>
+      <w:lvlText w:val="-"/>
+      <w:lvlJc w:val="left"/>
+      <w:pPr>
+        <w:ind w:left="720" w:hanging="360"/>
+      </w:pPr>
+      <w:rPr>
+        <w:rFonts w:ascii="Times New Roman" w:eastAsia="Times New Roman" w:hAnsi="Times New Roman" w:cs="Times New Roman" w:hint="default"/>
+      </w:rPr>
+    </w:lvl>
+    <w:lvl w:ilvl="1" w:tplc="040C0003" w:tentative="1">
+      <w:start w:val="1"/>
+      <w:numFmt w:val="bullet"/>
+      <w:lvlText w:val="o"/>
+      <w:lvlJc w:val="left"/>
+      <w:pPr>
+        <w:ind w:left="1440" w:hanging="360"/>
+      </w:pPr>
+      <w:rPr>
+        <w:rFonts w:ascii="Courier New" w:hAnsi="Courier New" w:cs="Courier New" w:hint="default"/>
+      </w:rPr>
+    </w:lvl>
+    <w:lvl w:ilvl="2" w:tplc="040C0005" w:tentative="1">
+      <w:start w:val="1"/>
+      <w:numFmt w:val="bullet"/>
+      <w:lvlText w:val=""/>
+      <w:lvlJc w:val="left"/>
+      <w:pPr>
+        <w:ind w:left="2160" w:hanging="360"/>
+      </w:pPr>
+      <w:rPr>
+        <w:rFonts w:ascii="Wingdings" w:hAnsi="Wingdings" w:hint="default"/>
+      </w:rPr>
+    </w:lvl>
+    <w:lvl w:ilvl="3" w:tplc="040C0001" w:tentative="1">
+      <w:start w:val="1"/>
+      <w:numFmt w:val="bullet"/>
+      <w:lvlText w:val=""/>
+      <w:lvlJc w:val="left"/>
+      <w:pPr>
+        <w:ind w:left="2880" w:hanging="360"/>
+      </w:pPr>
+      <w:rPr>
+        <w:rFonts w:ascii="Symbol" w:hAnsi="Symbol" w:hint="default"/>
+      </w:rPr>
+    </w:lvl>
+    <w:lvl w:ilvl="4" w:tplc="040C0003" w:tentative="1">
+      <w:start w:val="1"/>
+      <w:numFmt w:val="bullet"/>
+      <w:lvlText w:val="o"/>
+      <w:lvlJc w:val="left"/>
+      <w:pPr>
+        <w:ind w:left="3600" w:hanging="360"/>
+      </w:pPr>
+      <w:rPr>
+        <w:rFonts w:ascii="Courier New" w:hAnsi="Courier New" w:cs="Courier New" w:hint="default"/>
+      </w:rPr>
+    </w:lvl>
+    <w:lvl w:ilvl="5" w:tplc="040C0005" w:tentative="1">
+      <w:start w:val="1"/>
+      <w:numFmt w:val="bullet"/>
+      <w:lvlText w:val=""/>
+      <w:lvlJc w:val="left"/>
+      <w:pPr>
+        <w:ind w:left="4320" w:hanging="360"/>
+      </w:pPr>
+      <w:rPr>
+        <w:rFonts w:ascii="Wingdings" w:hAnsi="Wingdings" w:hint="default"/>
+      </w:rPr>
+    </w:lvl>
+    <w:lvl w:ilvl="6" w:tplc="040C0001" w:tentative="1">
+      <w:start w:val="1"/>
+      <w:numFmt w:val="bullet"/>
+      <w:lvlText w:val=""/>
+      <w:lvlJc w:val="left"/>
+      <w:pPr>
+        <w:ind w:left="5040" w:hanging="360"/>
+      </w:pPr>
+      <w:rPr>
+        <w:rFonts w:ascii="Symbol" w:hAnsi="Symbol" w:hint="default"/>
+      </w:rPr>
+    </w:lvl>
+    <w:lvl w:ilvl="7" w:tplc="040C0003" w:tentative="1">
+      <w:start w:val="1"/>
+      <w:numFmt w:val="bullet"/>
+      <w:lvlText w:val="o"/>
+      <w:lvlJc w:val="left"/>
+      <w:pPr>
+        <w:ind w:left="5760" w:hanging="360"/>
+      </w:pPr>
+      <w:rPr>
+        <w:rFonts w:ascii="Courier New" w:hAnsi="Courier New" w:cs="Courier New" w:hint="default"/>
+      </w:rPr>
+    </w:lvl>
+    <w:lvl w:ilvl="8" w:tplc="040C0005" w:tentative="1">
+      <w:start w:val="1"/>
+      <w:numFmt w:val="bullet"/>
+      <w:lvlText w:val=""/>
+      <w:lvlJc w:val="left"/>
+      <w:pPr>
+        <w:ind w:left="6480" w:hanging="360"/>
+      </w:pPr>
+      <w:rPr>
+        <w:rFonts w:ascii="Wingdings" w:hAnsi="Wingdings" w:hint="default"/>
+      </w:rPr>
+    </w:lvl>
+  </w:abstractNum>
   <w:num w:numId="1">
     <w:abstractNumId w:val="0"/>
+  </w:num>
+  <w:num w:numId="2">
+    <w:abstractNumId w:val="1"/>
   </w:num>
 </w:numbering>
 </file>
@@ -10257,6 +12636,22 @@
       <w:szCs w:val="18"/>
     </w:rPr>
   </w:style>
+  <w:style w:type="character" w:styleId="Accentuation">
+    <w:name w:val="Emphasis"/>
+    <w:basedOn w:val="Policepardfaut"/>
+    <w:uiPriority w:val="20"/>
+    <w:qFormat/>
+    <w:rsid w:val="0036097E"/>
+    <w:rPr>
+      <w:i/>
+      <w:iCs/>
+    </w:rPr>
+  </w:style>
+  <w:style w:type="character" w:customStyle="1" w:styleId="obscuredtextcontentinner54ab5">
+    <w:name w:val="obscuredtextcontentinner__54ab5"/>
+    <w:basedOn w:val="Policepardfaut"/>
+    <w:rsid w:val="0036097E"/>
+  </w:style>
 </w:styles>
 </file>
 
@@ -10560,7 +12955,7 @@
 </file>
 
 <file path=customXml/itemProps1.xml><?xml version="1.0" encoding="utf-8"?>
-<ds:datastoreItem xmlns:ds="http://schemas.openxmlformats.org/officeDocument/2006/customXml" ds:itemID="{6F807362-87D6-E34A-A921-233C34AD0FF0}">
+<ds:datastoreItem xmlns:ds="http://schemas.openxmlformats.org/officeDocument/2006/customXml" ds:itemID="{2F05BDF3-496A-FA45-B73D-77571A842B97}">
   <ds:schemaRefs>
     <ds:schemaRef ds:uri="http://schemas.openxmlformats.org/officeDocument/2006/bibliography"/>
   </ds:schemaRefs>

</xml_diff>